<commit_message>
feat(brand): QR business card, trial attorney wording, Instagram launch set
Business card gets a QR code to midtennlegal.com and a print-shop version
with 1/8 in bleed. The site says "trial attorney" instead of "litigator".
Instagram kit uses the new practice names, the stablecoin post moves to deep
blue, and a six-slide launch carousel (with Meet Madison and a QR closing
slide) is added, with captions and the Word doc rebuilt.

Co-Authored-By: Claude Opus 5.5 <noreply@anthropic.com>
</commit_message>
<xml_diff>
--- a/brand/instagram/MT-Legal-Instagram-Kit.docx
+++ b/brand/instagram/MT-Legal-Instagram-Kit.docx
@@ -15,7 +15,7 @@
         <w:spacing w:after="120"/>
       </w:pPr>
       <w:r>
-        <w:t xml:space="preserve">Nine posts (one is a three-slide carousel), all 1080 x 1350 so they fill the feed. Post them in number order, 01 first; Instagram shows the newest at the top left, so the grid ends up looking like </w:t>
+        <w:t xml:space="preserve">Ten posts, all 1080 x 1350 so they fill the feed: a six-slide launch carousel (00), then nine regular posts (03 is a three-slide carousel). Post the launch carousel first, then 01 through 09 in order; Instagram shows the newest at the top left, so the grid ends up looking like </w:t>
       </w:r>
       <w:r>
         <w:rPr>
@@ -32,6 +32,7 @@
     <w:p>
       <w:pPr>
         <w:pStyle w:val="Heading1"/>
+        <w:keepNext/>
       </w:pPr>
       <w:r>
         <w:t xml:space="preserve">Profile</w:t>
@@ -109,7 +110,7 @@
                 <w:sz w:val="20"/>
                 <w:szCs w:val="20"/>
               </w:rPr>
-              <w:t xml:space="preserve">Client-centered counsel for DeFi, digital assets &amp; litigation.</w:t>
+              <w:t xml:space="preserve">Client-centered counsel for DeFi, digital assets &amp; trial work.</w:t>
             </w:r>
           </w:p>
           <w:p>
@@ -240,7 +241,7 @@
         <w:keepNext/>
       </w:pPr>
       <w:r>
-        <w:t xml:space="preserve">01 · Counsel for what comes next</w:t>
+        <w:t xml:space="preserve">00 · Launch carousel: Introducing MT Legal</w:t>
       </w:r>
     </w:p>
     <w:tbl>
@@ -278,9 +279,9 @@
             <w:r>
               <w:drawing>
                 <wp:inline distT="0" distB="0" distL="0" distR="0">
-                  <wp:extent cx="1428750" cy="1790700"/>
+                  <wp:extent cx="685800" cy="857250"/>
                   <wp:effectExtent t="0" r="0" b="0" l="0"/>
-                  <wp:docPr id="1" name="01-counsel-for-what-comes-next.png" descr="Alt text: Nashville skyline in black and white with the words &quot;Counsel for what comes next.&quot;" title="01-counsel-for-what-comes-next.png"/>
+                  <wp:docPr id="1" name="00a-launch-cover.png" descr="Alt text (cover): Nashville skyline in black and white with the words &quot;Introducing MT Legal.&quot;" title="00a-launch-cover.png"/>
                   <wp:cNvGraphicFramePr>
                     <a:graphicFrameLocks xmlns:a="http://schemas.openxmlformats.org/drawingml/2006/main" noChangeAspect="1"/>
                   </wp:cNvGraphicFramePr>
@@ -303,7 +304,7 @@
                         <pic:spPr bwMode="auto">
                           <a:xfrm>
                             <a:off x="0" y="0"/>
-                            <a:ext cx="1428750" cy="1790700"/>
+                            <a:ext cx="685800" cy="857250"/>
                           </a:xfrm>
                           <a:prstGeom prst="rect">
                             <a:avLst/>
@@ -316,6 +317,231 @@
               </w:drawing>
             </w:r>
           </w:p>
+          <w:p>
+            <w:pPr>
+              <w:spacing w:after="100"/>
+            </w:pPr>
+            <w:r>
+              <w:drawing>
+                <wp:inline distT="0" distB="0" distL="0" distR="0">
+                  <wp:extent cx="685800" cy="857250"/>
+                  <wp:effectExtent t="0" r="0" b="0" l="0"/>
+                  <wp:docPr id="1" name="00b-launch-who-we-are.png" descr="Alt text (slide 2): &quot;Every case begins the same way. One person, one matter, and a bigger power on the other side.&quot;" title="00b-launch-who-we-are.png"/>
+                  <wp:cNvGraphicFramePr>
+                    <a:graphicFrameLocks xmlns:a="http://schemas.openxmlformats.org/drawingml/2006/main" noChangeAspect="1"/>
+                  </wp:cNvGraphicFramePr>
+                  <a:graphic xmlns:a="http://schemas.openxmlformats.org/drawingml/2006/main">
+                    <a:graphicData uri="http://schemas.openxmlformats.org/drawingml/2006/picture">
+                      <pic:pic xmlns:pic="http://schemas.openxmlformats.org/drawingml/2006/picture">
+                        <pic:nvPicPr>
+                          <pic:cNvPr id="0" name="" descr=""/>
+                          <pic:cNvPicPr>
+                            <a:picLocks noChangeAspect="1" noChangeArrowheads="1"/>
+                          </pic:cNvPicPr>
+                        </pic:nvPicPr>
+                        <pic:blipFill>
+                          <a:blip r:embed="rId9" cstate="none"/>
+                          <a:srcRect/>
+                          <a:stretch>
+                            <a:fillRect/>
+                          </a:stretch>
+                        </pic:blipFill>
+                        <pic:spPr bwMode="auto">
+                          <a:xfrm>
+                            <a:off x="0" y="0"/>
+                            <a:ext cx="685800" cy="857250"/>
+                          </a:xfrm>
+                          <a:prstGeom prst="rect">
+                            <a:avLst/>
+                          </a:prstGeom>
+                        </pic:spPr>
+                      </pic:pic>
+                    </a:graphicData>
+                  </a:graphic>
+                </wp:inline>
+              </w:drawing>
+            </w:r>
+          </w:p>
+          <w:p>
+            <w:pPr>
+              <w:spacing w:after="100"/>
+            </w:pPr>
+            <w:r>
+              <w:drawing>
+                <wp:inline distT="0" distB="0" distL="0" distR="0">
+                  <wp:extent cx="685800" cy="857250"/>
+                  <wp:effectExtent t="0" r="0" b="0" l="0"/>
+                  <wp:docPr id="1" name="00c-launch-approach.png" descr="Alt text (slide 3): &quot;Client-centered, start to finish.&quot;" title="00c-launch-approach.png"/>
+                  <wp:cNvGraphicFramePr>
+                    <a:graphicFrameLocks xmlns:a="http://schemas.openxmlformats.org/drawingml/2006/main" noChangeAspect="1"/>
+                  </wp:cNvGraphicFramePr>
+                  <a:graphic xmlns:a="http://schemas.openxmlformats.org/drawingml/2006/main">
+                    <a:graphicData uri="http://schemas.openxmlformats.org/drawingml/2006/picture">
+                      <pic:pic xmlns:pic="http://schemas.openxmlformats.org/drawingml/2006/picture">
+                        <pic:nvPicPr>
+                          <pic:cNvPr id="0" name="" descr=""/>
+                          <pic:cNvPicPr>
+                            <a:picLocks noChangeAspect="1" noChangeArrowheads="1"/>
+                          </pic:cNvPicPr>
+                        </pic:nvPicPr>
+                        <pic:blipFill>
+                          <a:blip r:embed="rId10" cstate="none"/>
+                          <a:srcRect/>
+                          <a:stretch>
+                            <a:fillRect/>
+                          </a:stretch>
+                        </pic:blipFill>
+                        <pic:spPr bwMode="auto">
+                          <a:xfrm>
+                            <a:off x="0" y="0"/>
+                            <a:ext cx="685800" cy="857250"/>
+                          </a:xfrm>
+                          <a:prstGeom prst="rect">
+                            <a:avLst/>
+                          </a:prstGeom>
+                        </pic:spPr>
+                      </pic:pic>
+                    </a:graphicData>
+                  </a:graphic>
+                </wp:inline>
+              </w:drawing>
+            </w:r>
+          </w:p>
+          <w:p>
+            <w:pPr>
+              <w:spacing w:after="100"/>
+            </w:pPr>
+            <w:r>
+              <w:drawing>
+                <wp:inline distT="0" distB="0" distL="0" distR="0">
+                  <wp:extent cx="685800" cy="857250"/>
+                  <wp:effectExtent t="0" r="0" b="0" l="0"/>
+                  <wp:docPr id="1" name="00d-launch-practice-areas.png" descr="Alt text (slide 4): List of practice areas, from Digital Asset Structuring to Personal Injury &amp; Liabilities." title="00d-launch-practice-areas.png"/>
+                  <wp:cNvGraphicFramePr>
+                    <a:graphicFrameLocks xmlns:a="http://schemas.openxmlformats.org/drawingml/2006/main" noChangeAspect="1"/>
+                  </wp:cNvGraphicFramePr>
+                  <a:graphic xmlns:a="http://schemas.openxmlformats.org/drawingml/2006/main">
+                    <a:graphicData uri="http://schemas.openxmlformats.org/drawingml/2006/picture">
+                      <pic:pic xmlns:pic="http://schemas.openxmlformats.org/drawingml/2006/picture">
+                        <pic:nvPicPr>
+                          <pic:cNvPr id="0" name="" descr=""/>
+                          <pic:cNvPicPr>
+                            <a:picLocks noChangeAspect="1" noChangeArrowheads="1"/>
+                          </pic:cNvPicPr>
+                        </pic:nvPicPr>
+                        <pic:blipFill>
+                          <a:blip r:embed="rId11" cstate="none"/>
+                          <a:srcRect/>
+                          <a:stretch>
+                            <a:fillRect/>
+                          </a:stretch>
+                        </pic:blipFill>
+                        <pic:spPr bwMode="auto">
+                          <a:xfrm>
+                            <a:off x="0" y="0"/>
+                            <a:ext cx="685800" cy="857250"/>
+                          </a:xfrm>
+                          <a:prstGeom prst="rect">
+                            <a:avLst/>
+                          </a:prstGeom>
+                        </pic:spPr>
+                      </pic:pic>
+                    </a:graphicData>
+                  </a:graphic>
+                </wp:inline>
+              </w:drawing>
+            </w:r>
+          </w:p>
+          <w:p>
+            <w:pPr>
+              <w:spacing w:after="100"/>
+            </w:pPr>
+            <w:r>
+              <w:drawing>
+                <wp:inline distT="0" distB="0" distL="0" distR="0">
+                  <wp:extent cx="685800" cy="857250"/>
+                  <wp:effectExtent t="0" r="0" b="0" l="0"/>
+                  <wp:docPr id="1" name="00e-launch-meet-madison.png" descr="Alt text (slide 5): Portrait of Madison T. Biggs, Esq., trial attorney, with the words &quot;The lawyer you meet is the lawyer on your case.&quot;" title="00e-launch-meet-madison.png"/>
+                  <wp:cNvGraphicFramePr>
+                    <a:graphicFrameLocks xmlns:a="http://schemas.openxmlformats.org/drawingml/2006/main" noChangeAspect="1"/>
+                  </wp:cNvGraphicFramePr>
+                  <a:graphic xmlns:a="http://schemas.openxmlformats.org/drawingml/2006/main">
+                    <a:graphicData uri="http://schemas.openxmlformats.org/drawingml/2006/picture">
+                      <pic:pic xmlns:pic="http://schemas.openxmlformats.org/drawingml/2006/picture">
+                        <pic:nvPicPr>
+                          <pic:cNvPr id="0" name="" descr=""/>
+                          <pic:cNvPicPr>
+                            <a:picLocks noChangeAspect="1" noChangeArrowheads="1"/>
+                          </pic:cNvPicPr>
+                        </pic:nvPicPr>
+                        <pic:blipFill>
+                          <a:blip r:embed="rId12" cstate="none"/>
+                          <a:srcRect/>
+                          <a:stretch>
+                            <a:fillRect/>
+                          </a:stretch>
+                        </pic:blipFill>
+                        <pic:spPr bwMode="auto">
+                          <a:xfrm>
+                            <a:off x="0" y="0"/>
+                            <a:ext cx="685800" cy="857250"/>
+                          </a:xfrm>
+                          <a:prstGeom prst="rect">
+                            <a:avLst/>
+                          </a:prstGeom>
+                        </pic:spPr>
+                      </pic:pic>
+                    </a:graphicData>
+                  </a:graphic>
+                </wp:inline>
+              </w:drawing>
+            </w:r>
+          </w:p>
+          <w:p>
+            <w:pPr>
+              <w:spacing w:after="100"/>
+            </w:pPr>
+            <w:r>
+              <w:drawing>
+                <wp:inline distT="0" distB="0" distL="0" distR="0">
+                  <wp:extent cx="685800" cy="857250"/>
+                  <wp:effectExtent t="0" r="0" b="0" l="0"/>
+                  <wp:docPr id="1" name="00f-launch-get-started.png" descr="Alt text (slide 6): &quot;Start with a brief call, at no cost,&quot; with the website, phone number, and a QR code." title="00f-launch-get-started.png"/>
+                  <wp:cNvGraphicFramePr>
+                    <a:graphicFrameLocks xmlns:a="http://schemas.openxmlformats.org/drawingml/2006/main" noChangeAspect="1"/>
+                  </wp:cNvGraphicFramePr>
+                  <a:graphic xmlns:a="http://schemas.openxmlformats.org/drawingml/2006/main">
+                    <a:graphicData uri="http://schemas.openxmlformats.org/drawingml/2006/picture">
+                      <pic:pic xmlns:pic="http://schemas.openxmlformats.org/drawingml/2006/picture">
+                        <pic:nvPicPr>
+                          <pic:cNvPr id="0" name="" descr=""/>
+                          <pic:cNvPicPr>
+                            <a:picLocks noChangeAspect="1" noChangeArrowheads="1"/>
+                          </pic:cNvPicPr>
+                        </pic:nvPicPr>
+                        <pic:blipFill>
+                          <a:blip r:embed="rId13" cstate="none"/>
+                          <a:srcRect/>
+                          <a:stretch>
+                            <a:fillRect/>
+                          </a:stretch>
+                        </pic:blipFill>
+                        <pic:spPr bwMode="auto">
+                          <a:xfrm>
+                            <a:off x="0" y="0"/>
+                            <a:ext cx="685800" cy="857250"/>
+                          </a:xfrm>
+                          <a:prstGeom prst="rect">
+                            <a:avLst/>
+                          </a:prstGeom>
+                        </pic:spPr>
+                      </pic:pic>
+                    </a:graphicData>
+                  </a:graphic>
+                </wp:inline>
+              </w:drawing>
+            </w:r>
+          </w:p>
         </w:tc>
         <w:tc>
           <w:tcPr>
@@ -344,7 +570,7 @@
                 <w:sz w:val="17"/>
                 <w:szCs w:val="17"/>
               </w:rPr>
-              <w:t xml:space="preserve">01-counsel-for-what-comes-next.png</w:t>
+              <w:t xml:space="preserve">00a-launch-cover.png, 00b-launch-who-we-are.png, 00c-launch-approach.png, 00d-launch-practice-areas.png, 00e-launch-meet-madison.png, 00f-launch-get-started.png</w:t>
             </w:r>
           </w:p>
           <w:p>
@@ -368,34 +594,50 @@
               <w:spacing w:after="120"/>
             </w:pPr>
             <w:r>
-              <w:t xml:space="preserve">Every matter we take starts the same way: one person on one side, and a far bigger power on the other.</w:t>
-            </w:r>
-          </w:p>
-          <w:p>
-            <w:pPr>
-              <w:spacing w:after="120"/>
-            </w:pPr>
-            <w:r>
-              <w:t xml:space="preserve">MT Legal is a client-centered Nashville firm with dedicated support for DeFi and digital assets, plus traditional practice from criminal defense to estate planning. Whether you face the state in court or the banks, exchanges, and gatekeepers that control money and property, you work directly with your attorney.</w:t>
-            </w:r>
-          </w:p>
-          <w:p>
-            <w:pPr>
-              <w:spacing w:after="120"/>
-            </w:pPr>
-            <w:r>
-              <w:t xml:space="preserve">Start with a brief call at no cost. Link in bio.</w:t>
-            </w:r>
-          </w:p>
-          <w:p>
-            <w:pPr>
-              <w:spacing w:after="120"/>
-            </w:pPr>
-            <w:r>
-              <w:rPr>
-                <w:color w:val="7D6E4C"/>
-              </w:rPr>
-              <w:t xml:space="preserve">#NashvilleLawyer #MiddleTennessee #DeFi #DigitalAssets #NashvilleTN</w:t>
+              <w:t xml:space="preserve">MT Legal is open in Nashville.</w:t>
+            </w:r>
+          </w:p>
+          <w:p>
+            <w:pPr>
+              <w:spacing w:after="120"/>
+            </w:pPr>
+            <w:r>
+              <w:t xml:space="preserve">Every case begins the same way: one person, one matter, and a bigger power on the other side. How it ends depends on who stands beside you. I built this firm to be that person: someone who listens first, speaks plainly, and stays with you from the first call to the final appearance.</w:t>
+            </w:r>
+          </w:p>
+          <w:p>
+            <w:pPr>
+              <w:spacing w:after="120"/>
+            </w:pPr>
+            <w:r>
+              <w:t xml:space="preserve">Dedicated support for DeFi and digital assets, alongside criminal defense, civil rights, estate and family planning, and personal injury. Swipe to see how we can help, then start with a brief call at no cost.</w:t>
+            </w:r>
+          </w:p>
+          <w:p>
+            <w:pPr>
+              <w:spacing w:after="120"/>
+            </w:pPr>
+            <w:r>
+              <w:t xml:space="preserve">Link in bio, or scan the code on the last slide.</w:t>
+            </w:r>
+          </w:p>
+          <w:p>
+            <w:pPr>
+              <w:spacing w:after="120"/>
+            </w:pPr>
+            <w:r>
+              <w:rPr>
+                <w:color w:val="7D6E4C"/>
+              </w:rPr>
+              <w:t xml:space="preserve">#NashvilleLawyer #MTLegal #MiddleTennessee #DeFi #DigitalAssets #CriminalDefense</w:t>
+            </w:r>
+          </w:p>
+          <w:p>
+            <w:pPr>
+              <w:spacing w:after="120"/>
+            </w:pPr>
+            <w:r>
+              <w:t xml:space="preserve">Attorney advertising.</w:t>
             </w:r>
           </w:p>
           <w:p>
@@ -424,7 +666,72 @@
                 <w:sz w:val="19"/>
                 <w:szCs w:val="19"/>
               </w:rPr>
-              <w:t xml:space="preserve">Nashville skyline in black and white with the words "Counsel for what comes next."</w:t>
+              <w:t xml:space="preserve">Cover: Nashville skyline in black and white with the words "Introducing MT Legal."</w:t>
+            </w:r>
+          </w:p>
+          <w:p>
+            <w:pPr>
+              <w:spacing w:after="60"/>
+            </w:pPr>
+            <w:r>
+              <w:rPr>
+                <w:color w:val="5A606A"/>
+                <w:sz w:val="19"/>
+                <w:szCs w:val="19"/>
+              </w:rPr>
+              <w:t xml:space="preserve">Slide 2: "Every case begins the same way. One person, one matter, and a bigger power on the other side."</w:t>
+            </w:r>
+          </w:p>
+          <w:p>
+            <w:pPr>
+              <w:spacing w:after="60"/>
+            </w:pPr>
+            <w:r>
+              <w:rPr>
+                <w:color w:val="5A606A"/>
+                <w:sz w:val="19"/>
+                <w:szCs w:val="19"/>
+              </w:rPr>
+              <w:t xml:space="preserve">Slide 3: "Client-centered, start to finish."</w:t>
+            </w:r>
+          </w:p>
+          <w:p>
+            <w:pPr>
+              <w:spacing w:after="60"/>
+            </w:pPr>
+            <w:r>
+              <w:rPr>
+                <w:color w:val="5A606A"/>
+                <w:sz w:val="19"/>
+                <w:szCs w:val="19"/>
+              </w:rPr>
+              <w:t xml:space="preserve">Slide 4: List of practice areas, from Digital Asset Structuring to Personal Injury &amp; Liabilities.</w:t>
+            </w:r>
+          </w:p>
+          <w:p>
+            <w:pPr>
+              <w:spacing w:after="60"/>
+            </w:pPr>
+            <w:r>
+              <w:rPr>
+                <w:color w:val="5A606A"/>
+                <w:sz w:val="19"/>
+                <w:szCs w:val="19"/>
+              </w:rPr>
+              <w:t xml:space="preserve">Slide 5: Portrait of Madison T. Biggs, Esq., trial attorney, with the words "The lawyer you meet is the lawyer on your case."</w:t>
+            </w:r>
+          </w:p>
+          <w:p>
+            <w:pPr>
+              <w:spacing w:after="60"/>
+            </w:pPr>
+            <w:r>
+              <w:rPr>
+                <w:color w:val="5A606A"/>
+                <w:sz w:val="19"/>
+                <w:szCs w:val="19"/>
+              </w:rPr>
+              <w:t xml:space="preserve">Slide 6: "Start with a brief call, at no cost," with the website, phone number, and a QR code.</w:t>
             </w:r>
           </w:p>
         </w:tc>
@@ -444,7 +751,7 @@
         <w:keepNext/>
       </w:pPr>
       <w:r>
-        <w:t xml:space="preserve">02 · Our principle</w:t>
+        <w:t xml:space="preserve">01 · Counsel for what comes next</w:t>
       </w:r>
     </w:p>
     <w:tbl>
@@ -484,753 +791,7 @@
                 <wp:inline distT="0" distB="0" distL="0" distR="0">
                   <wp:extent cx="1428750" cy="1790700"/>
                   <wp:effectExtent t="0" r="0" b="0" l="0"/>
-                  <wp:docPr id="1" name="02-worth-quote.png" descr="Alt text: Quote reading &quot;A person's worth cannot be measured by their wealth, and neither should the quality of their counsel,&quot; attributed to Madison T. Biggs, Esq." title="02-worth-quote.png"/>
-                  <wp:cNvGraphicFramePr>
-                    <a:graphicFrameLocks xmlns:a="http://schemas.openxmlformats.org/drawingml/2006/main" noChangeAspect="1"/>
-                  </wp:cNvGraphicFramePr>
-                  <a:graphic xmlns:a="http://schemas.openxmlformats.org/drawingml/2006/main">
-                    <a:graphicData uri="http://schemas.openxmlformats.org/drawingml/2006/picture">
-                      <pic:pic xmlns:pic="http://schemas.openxmlformats.org/drawingml/2006/picture">
-                        <pic:nvPicPr>
-                          <pic:cNvPr id="0" name="" descr=""/>
-                          <pic:cNvPicPr>
-                            <a:picLocks noChangeAspect="1" noChangeArrowheads="1"/>
-                          </pic:cNvPicPr>
-                        </pic:nvPicPr>
-                        <pic:blipFill>
-                          <a:blip r:embed="rId9" cstate="none"/>
-                          <a:srcRect/>
-                          <a:stretch>
-                            <a:fillRect/>
-                          </a:stretch>
-                        </pic:blipFill>
-                        <pic:spPr bwMode="auto">
-                          <a:xfrm>
-                            <a:off x="0" y="0"/>
-                            <a:ext cx="1428750" cy="1790700"/>
-                          </a:xfrm>
-                          <a:prstGeom prst="rect">
-                            <a:avLst/>
-                          </a:prstGeom>
-                        </pic:spPr>
-                      </pic:pic>
-                    </a:graphicData>
-                  </a:graphic>
-                </wp:inline>
-              </w:drawing>
-            </w:r>
-          </w:p>
-        </w:tc>
-        <w:tc>
-          <w:tcPr>
-            <w:tcW w:type="dxa" w:w="6720"/>
-            <w:vAlign w:val="top"/>
-          </w:tcPr>
-          <w:p>
-            <w:pPr>
-              <w:spacing w:after="100"/>
-            </w:pPr>
-            <w:r>
-              <w:rPr>
-                <w:b/>
-                <w:bCs/>
-                <w:color w:val="7D6E4C"/>
-                <w:spacing w:val="30"/>
-                <w:sz w:val="16"/>
-                <w:szCs w:val="16"/>
-              </w:rPr>
-              <w:t xml:space="preserve">FILE  </w:t>
-            </w:r>
-            <w:r>
-              <w:rPr>
-                <w:rFonts w:ascii="Consolas" w:cs="Consolas" w:eastAsia="Consolas" w:hAnsi="Consolas"/>
-                <w:color w:val="5A606A"/>
-                <w:sz w:val="17"/>
-                <w:szCs w:val="17"/>
-              </w:rPr>
-              <w:t xml:space="preserve">02-worth-quote.png</w:t>
-            </w:r>
-          </w:p>
-          <w:p>
-            <w:pPr>
-              <w:spacing w:after="80"/>
-            </w:pPr>
-            <w:r>
-              <w:rPr>
-                <w:b/>
-                <w:bCs/>
-                <w:color w:val="7D6E4C"/>
-                <w:spacing w:val="30"/>
-                <w:sz w:val="16"/>
-                <w:szCs w:val="16"/>
-              </w:rPr>
-              <w:t xml:space="preserve">CAPTION</w:t>
-            </w:r>
-          </w:p>
-          <w:p>
-            <w:pPr>
-              <w:spacing w:after="120"/>
-            </w:pPr>
-            <w:r>
-              <w:t xml:space="preserve">This is the line the firm is built on.</w:t>
-            </w:r>
-          </w:p>
-          <w:p>
-            <w:pPr>
-              <w:spacing w:after="120"/>
-            </w:pPr>
-            <w:r>
-              <w:t xml:space="preserve">Good counsel shouldn't depend on the size of your bank account or the size of the other side's legal team. Whether it's a courtroom in Davidson County or a fight with a platform over your own assets, you deserve someone in your corner who treats your matter like it matters.</w:t>
-            </w:r>
-          </w:p>
-          <w:p>
-            <w:pPr>
-              <w:spacing w:after="120"/>
-            </w:pPr>
-            <w:r>
-              <w:rPr>
-                <w:color w:val="7D6E4C"/>
-              </w:rPr>
-              <w:t xml:space="preserve">#AccessToJustice #NashvilleLawyer #ClientFirst #MTLegal</w:t>
-            </w:r>
-          </w:p>
-          <w:p>
-            <w:pPr>
-              <w:spacing w:after="60" w:before="80"/>
-            </w:pPr>
-            <w:r>
-              <w:rPr>
-                <w:b/>
-                <w:bCs/>
-                <w:color w:val="7D6E4C"/>
-                <w:spacing w:val="30"/>
-                <w:sz w:val="16"/>
-                <w:szCs w:val="16"/>
-              </w:rPr>
-              <w:t xml:space="preserve">ALT TEXT</w:t>
-            </w:r>
-          </w:p>
-          <w:p>
-            <w:pPr>
-              <w:spacing w:after="60"/>
-            </w:pPr>
-            <w:r>
-              <w:rPr>
-                <w:color w:val="5A606A"/>
-                <w:sz w:val="19"/>
-                <w:szCs w:val="19"/>
-              </w:rPr>
-              <w:t xml:space="preserve">Quote reading "A person's worth cannot be measured by their wealth, and neither should the quality of their counsel," attributed to Madison T. Biggs, Esq.</w:t>
-            </w:r>
-          </w:p>
-        </w:tc>
-      </w:tr>
-    </w:tbl>
-    <w:p>
-      <w:pPr>
-        <w:pBdr>
-          <w:bottom w:val="single" w:color="D3CDBF" w:sz="4" w:space="8"/>
-        </w:pBdr>
-        <w:spacing w:after="240"/>
-      </w:pPr>
-    </w:p>
-    <w:p>
-      <w:pPr>
-        <w:pStyle w:val="Heading2"/>
-        <w:keepNext/>
-      </w:pPr>
-      <w:r>
-        <w:t xml:space="preserve">03 · Carousel: If you died tomorrow, could your family reach your crypto?</w:t>
-      </w:r>
-    </w:p>
-    <w:tbl>
-      <w:tblPr>
-        <w:tblW w:type="dxa" w:w="9360"/>
-        <w:tblBorders>
-          <w:top w:val="none" w:color="FFFFFF" w:sz="0"/>
-          <w:left w:val="none" w:color="FFFFFF" w:sz="0"/>
-          <w:bottom w:val="none" w:color="FFFFFF" w:sz="0"/>
-          <w:right w:val="none" w:color="FFFFFF" w:sz="0"/>
-          <w:insideH w:val="none" w:color="FFFFFF" w:sz="0"/>
-          <w:insideV w:val="none" w:color="FFFFFF" w:sz="0"/>
-        </w:tblBorders>
-      </w:tblPr>
-      <w:tblGrid>
-        <w:gridCol w:w="2640"/>
-        <w:gridCol w:w="6720"/>
-      </w:tblGrid>
-      <w:tr>
-        <w:trPr>
-          <w:cantSplit/>
-        </w:trPr>
-        <w:tc>
-          <w:tcPr>
-            <w:tcW w:type="dxa" w:w="2640"/>
-            <w:tcMar>
-              <w:right w:type="dxa" w:w="240"/>
-            </w:tcMar>
-            <w:vAlign w:val="top"/>
-          </w:tcPr>
-          <w:p>
-            <w:pPr>
-              <w:spacing w:after="100"/>
-            </w:pPr>
-            <w:r>
-              <w:drawing>
-                <wp:inline distT="0" distB="0" distL="0" distR="0">
-                  <wp:extent cx="990600" cy="1238250"/>
-                  <wp:effectExtent t="0" r="0" b="0" l="0"/>
-                  <wp:docPr id="1" name="03a-crypto-estate-cover.png" descr="Alt text (cover): &quot;If you died tomorrow, could your family reach your crypto?&quot;" title="03a-crypto-estate-cover.png"/>
-                  <wp:cNvGraphicFramePr>
-                    <a:graphicFrameLocks xmlns:a="http://schemas.openxmlformats.org/drawingml/2006/main" noChangeAspect="1"/>
-                  </wp:cNvGraphicFramePr>
-                  <a:graphic xmlns:a="http://schemas.openxmlformats.org/drawingml/2006/main">
-                    <a:graphicData uri="http://schemas.openxmlformats.org/drawingml/2006/picture">
-                      <pic:pic xmlns:pic="http://schemas.openxmlformats.org/drawingml/2006/picture">
-                        <pic:nvPicPr>
-                          <pic:cNvPr id="0" name="" descr=""/>
-                          <pic:cNvPicPr>
-                            <a:picLocks noChangeAspect="1" noChangeArrowheads="1"/>
-                          </pic:cNvPicPr>
-                        </pic:nvPicPr>
-                        <pic:blipFill>
-                          <a:blip r:embed="rId10" cstate="none"/>
-                          <a:srcRect/>
-                          <a:stretch>
-                            <a:fillRect/>
-                          </a:stretch>
-                        </pic:blipFill>
-                        <pic:spPr bwMode="auto">
-                          <a:xfrm>
-                            <a:off x="0" y="0"/>
-                            <a:ext cx="990600" cy="1238250"/>
-                          </a:xfrm>
-                          <a:prstGeom prst="rect">
-                            <a:avLst/>
-                          </a:prstGeom>
-                        </pic:spPr>
-                      </pic:pic>
-                    </a:graphicData>
-                  </a:graphic>
-                </wp:inline>
-              </w:drawing>
-            </w:r>
-          </w:p>
-          <w:p>
-            <w:pPr>
-              <w:spacing w:after="100"/>
-            </w:pPr>
-            <w:r>
-              <w:drawing>
-                <wp:inline distT="0" distB="0" distL="0" distR="0">
-                  <wp:extent cx="990600" cy="1238250"/>
-                  <wp:effectExtent t="0" r="0" b="0" l="0"/>
-                  <wp:docPr id="1" name="03b-crypto-estate-keys.png" descr="Alt text (slide 2): &quot;Keys in a drawer are not an estate plan.&quot;" title="03b-crypto-estate-keys.png"/>
-                  <wp:cNvGraphicFramePr>
-                    <a:graphicFrameLocks xmlns:a="http://schemas.openxmlformats.org/drawingml/2006/main" noChangeAspect="1"/>
-                  </wp:cNvGraphicFramePr>
-                  <a:graphic xmlns:a="http://schemas.openxmlformats.org/drawingml/2006/main">
-                    <a:graphicData uri="http://schemas.openxmlformats.org/drawingml/2006/picture">
-                      <pic:pic xmlns:pic="http://schemas.openxmlformats.org/drawingml/2006/picture">
-                        <pic:nvPicPr>
-                          <pic:cNvPr id="0" name="" descr=""/>
-                          <pic:cNvPicPr>
-                            <a:picLocks noChangeAspect="1" noChangeArrowheads="1"/>
-                          </pic:cNvPicPr>
-                        </pic:nvPicPr>
-                        <pic:blipFill>
-                          <a:blip r:embed="rId11" cstate="none"/>
-                          <a:srcRect/>
-                          <a:stretch>
-                            <a:fillRect/>
-                          </a:stretch>
-                        </pic:blipFill>
-                        <pic:spPr bwMode="auto">
-                          <a:xfrm>
-                            <a:off x="0" y="0"/>
-                            <a:ext cx="990600" cy="1238250"/>
-                          </a:xfrm>
-                          <a:prstGeom prst="rect">
-                            <a:avLst/>
-                          </a:prstGeom>
-                        </pic:spPr>
-                      </pic:pic>
-                    </a:graphicData>
-                  </a:graphic>
-                </wp:inline>
-              </w:drawing>
-            </w:r>
-          </w:p>
-          <w:p>
-            <w:pPr>
-              <w:spacing w:after="100"/>
-            </w:pPr>
-            <w:r>
-              <w:drawing>
-                <wp:inline distT="0" distB="0" distL="0" distR="0">
-                  <wp:extent cx="990600" cy="1238250"/>
-                  <wp:effectExtent t="0" r="0" b="0" l="0"/>
-                  <wp:docPr id="1" name="03c-crypto-estate-checklist.png" descr="Alt text (slide 3): Checklist: a will or trust for digital assets, an inventory of wallets and accounts, legal authority for your executor, and a key-access plan." title="03c-crypto-estate-checklist.png"/>
-                  <wp:cNvGraphicFramePr>
-                    <a:graphicFrameLocks xmlns:a="http://schemas.openxmlformats.org/drawingml/2006/main" noChangeAspect="1"/>
-                  </wp:cNvGraphicFramePr>
-                  <a:graphic xmlns:a="http://schemas.openxmlformats.org/drawingml/2006/main">
-                    <a:graphicData uri="http://schemas.openxmlformats.org/drawingml/2006/picture">
-                      <pic:pic xmlns:pic="http://schemas.openxmlformats.org/drawingml/2006/picture">
-                        <pic:nvPicPr>
-                          <pic:cNvPr id="0" name="" descr=""/>
-                          <pic:cNvPicPr>
-                            <a:picLocks noChangeAspect="1" noChangeArrowheads="1"/>
-                          </pic:cNvPicPr>
-                        </pic:nvPicPr>
-                        <pic:blipFill>
-                          <a:blip r:embed="rId12" cstate="none"/>
-                          <a:srcRect/>
-                          <a:stretch>
-                            <a:fillRect/>
-                          </a:stretch>
-                        </pic:blipFill>
-                        <pic:spPr bwMode="auto">
-                          <a:xfrm>
-                            <a:off x="0" y="0"/>
-                            <a:ext cx="990600" cy="1238250"/>
-                          </a:xfrm>
-                          <a:prstGeom prst="rect">
-                            <a:avLst/>
-                          </a:prstGeom>
-                        </pic:spPr>
-                      </pic:pic>
-                    </a:graphicData>
-                  </a:graphic>
-                </wp:inline>
-              </w:drawing>
-            </w:r>
-          </w:p>
-        </w:tc>
-        <w:tc>
-          <w:tcPr>
-            <w:tcW w:type="dxa" w:w="6720"/>
-            <w:vAlign w:val="top"/>
-          </w:tcPr>
-          <w:p>
-            <w:pPr>
-              <w:spacing w:after="100"/>
-            </w:pPr>
-            <w:r>
-              <w:rPr>
-                <w:b/>
-                <w:bCs/>
-                <w:color w:val="7D6E4C"/>
-                <w:spacing w:val="30"/>
-                <w:sz w:val="16"/>
-                <w:szCs w:val="16"/>
-              </w:rPr>
-              <w:t xml:space="preserve">FILE  </w:t>
-            </w:r>
-            <w:r>
-              <w:rPr>
-                <w:rFonts w:ascii="Consolas" w:cs="Consolas" w:eastAsia="Consolas" w:hAnsi="Consolas"/>
-                <w:color w:val="5A606A"/>
-                <w:sz w:val="17"/>
-                <w:szCs w:val="17"/>
-              </w:rPr>
-              <w:t xml:space="preserve">03a-crypto-estate-cover.png, 03b-crypto-estate-keys.png, 03c-crypto-estate-checklist.png</w:t>
-            </w:r>
-          </w:p>
-          <w:p>
-            <w:pPr>
-              <w:spacing w:after="80"/>
-            </w:pPr>
-            <w:r>
-              <w:rPr>
-                <w:b/>
-                <w:bCs/>
-                <w:color w:val="7D6E4C"/>
-                <w:spacing w:val="30"/>
-                <w:sz w:val="16"/>
-                <w:szCs w:val="16"/>
-              </w:rPr>
-              <w:t xml:space="preserve">CAPTION</w:t>
-            </w:r>
-          </w:p>
-          <w:p>
-            <w:pPr>
-              <w:spacing w:after="120"/>
-            </w:pPr>
-            <w:r>
-              <w:t xml:space="preserve">I've been in the crypto space since 2017, and the most common way digital wealth disappears isn't a hack. It's a family that can't get in.</w:t>
-            </w:r>
-          </w:p>
-          <w:p>
-            <w:pPr>
-              <w:spacing w:after="120"/>
-            </w:pPr>
-            <w:r>
-              <w:t xml:space="preserve">A seed phrase in a drawer is not an estate plan. Your executor needs legal authority to act, and a secure way to reach your wallets and accounts, without anyone holding your keys while you're alive.</w:t>
-            </w:r>
-          </w:p>
-          <w:p>
-            <w:pPr>
-              <w:spacing w:after="120"/>
-            </w:pPr>
-            <w:r>
-              <w:t xml:space="preserve">Swipe for what a digital asset plan covers. Questions? Link in bio.</w:t>
-            </w:r>
-          </w:p>
-          <w:p>
-            <w:pPr>
-              <w:spacing w:after="120"/>
-            </w:pPr>
-            <w:r>
-              <w:rPr>
-                <w:color w:val="7D6E4C"/>
-              </w:rPr>
-              <w:t xml:space="preserve">#CryptoEstatePlanning #DigitalAssets #Bitcoin #EstatePlanning #NashvilleTN</w:t>
-            </w:r>
-          </w:p>
-          <w:p>
-            <w:pPr>
-              <w:spacing w:after="120"/>
-            </w:pPr>
-            <w:r>
-              <w:rPr>
-                <w:i/>
-                <w:iCs/>
-                <w:color w:val="5A606A"/>
-              </w:rPr>
-              <w:t xml:space="preserve">General information, not legal advice.</w:t>
-            </w:r>
-          </w:p>
-          <w:p>
-            <w:pPr>
-              <w:spacing w:after="60" w:before="80"/>
-            </w:pPr>
-            <w:r>
-              <w:rPr>
-                <w:b/>
-                <w:bCs/>
-                <w:color w:val="7D6E4C"/>
-                <w:spacing w:val="30"/>
-                <w:sz w:val="16"/>
-                <w:szCs w:val="16"/>
-              </w:rPr>
-              <w:t xml:space="preserve">ALT TEXT</w:t>
-            </w:r>
-          </w:p>
-          <w:p>
-            <w:pPr>
-              <w:spacing w:after="60"/>
-            </w:pPr>
-            <w:r>
-              <w:rPr>
-                <w:color w:val="5A606A"/>
-                <w:sz w:val="19"/>
-                <w:szCs w:val="19"/>
-              </w:rPr>
-              <w:t xml:space="preserve">Cover: "If you died tomorrow, could your family reach your crypto?"</w:t>
-            </w:r>
-          </w:p>
-          <w:p>
-            <w:pPr>
-              <w:spacing w:after="60"/>
-            </w:pPr>
-            <w:r>
-              <w:rPr>
-                <w:color w:val="5A606A"/>
-                <w:sz w:val="19"/>
-                <w:szCs w:val="19"/>
-              </w:rPr>
-              <w:t xml:space="preserve">Slide 2: "Keys in a drawer are not an estate plan."</w:t>
-            </w:r>
-          </w:p>
-          <w:p>
-            <w:pPr>
-              <w:spacing w:after="60"/>
-            </w:pPr>
-            <w:r>
-              <w:rPr>
-                <w:color w:val="5A606A"/>
-                <w:sz w:val="19"/>
-                <w:szCs w:val="19"/>
-              </w:rPr>
-              <w:t xml:space="preserve">Slide 3: Checklist: a will or trust for digital assets, an inventory of wallets and accounts, legal authority for your executor, and a key-access plan.</w:t>
-            </w:r>
-          </w:p>
-        </w:tc>
-      </w:tr>
-    </w:tbl>
-    <w:p>
-      <w:pPr>
-        <w:pBdr>
-          <w:bottom w:val="single" w:color="D3CDBF" w:sz="4" w:space="8"/>
-        </w:pBdr>
-        <w:spacing w:after="240"/>
-      </w:pPr>
-    </w:p>
-    <w:p>
-      <w:pPr>
-        <w:pStyle w:val="Heading2"/>
-        <w:keepNext/>
-      </w:pPr>
-      <w:r>
-        <w:t xml:space="preserve">04 · Pulled over in Tennessee?</w:t>
-      </w:r>
-    </w:p>
-    <w:tbl>
-      <w:tblPr>
-        <w:tblW w:type="dxa" w:w="9360"/>
-        <w:tblBorders>
-          <w:top w:val="none" w:color="FFFFFF" w:sz="0"/>
-          <w:left w:val="none" w:color="FFFFFF" w:sz="0"/>
-          <w:bottom w:val="none" w:color="FFFFFF" w:sz="0"/>
-          <w:right w:val="none" w:color="FFFFFF" w:sz="0"/>
-          <w:insideH w:val="none" w:color="FFFFFF" w:sz="0"/>
-          <w:insideV w:val="none" w:color="FFFFFF" w:sz="0"/>
-        </w:tblBorders>
-      </w:tblPr>
-      <w:tblGrid>
-        <w:gridCol w:w="2640"/>
-        <w:gridCol w:w="6720"/>
-      </w:tblGrid>
-      <w:tr>
-        <w:trPr>
-          <w:cantSplit/>
-        </w:trPr>
-        <w:tc>
-          <w:tcPr>
-            <w:tcW w:type="dxa" w:w="2640"/>
-            <w:tcMar>
-              <w:right w:type="dxa" w:w="240"/>
-            </w:tcMar>
-            <w:vAlign w:val="top"/>
-          </w:tcPr>
-          <w:p>
-            <w:pPr>
-              <w:spacing w:after="100"/>
-            </w:pPr>
-            <w:r>
-              <w:drawing>
-                <wp:inline distT="0" distB="0" distL="0" distR="0">
-                  <wp:extent cx="1428750" cy="1790700"/>
-                  <wp:effectExtent t="0" r="0" b="0" l="0"/>
-                  <wp:docPr id="1" name="04-pulled-over.png" descr="Alt text: &quot;Pulled over in Tennessee? Stay calm and be polite. You can decline to answer questions without a lawyer, and you can decline consent to a search.&quot;" title="04-pulled-over.png"/>
-                  <wp:cNvGraphicFramePr>
-                    <a:graphicFrameLocks xmlns:a="http://schemas.openxmlformats.org/drawingml/2006/main" noChangeAspect="1"/>
-                  </wp:cNvGraphicFramePr>
-                  <a:graphic xmlns:a="http://schemas.openxmlformats.org/drawingml/2006/main">
-                    <a:graphicData uri="http://schemas.openxmlformats.org/drawingml/2006/picture">
-                      <pic:pic xmlns:pic="http://schemas.openxmlformats.org/drawingml/2006/picture">
-                        <pic:nvPicPr>
-                          <pic:cNvPr id="0" name="" descr=""/>
-                          <pic:cNvPicPr>
-                            <a:picLocks noChangeAspect="1" noChangeArrowheads="1"/>
-                          </pic:cNvPicPr>
-                        </pic:nvPicPr>
-                        <pic:blipFill>
-                          <a:blip r:embed="rId13" cstate="none"/>
-                          <a:srcRect/>
-                          <a:stretch>
-                            <a:fillRect/>
-                          </a:stretch>
-                        </pic:blipFill>
-                        <pic:spPr bwMode="auto">
-                          <a:xfrm>
-                            <a:off x="0" y="0"/>
-                            <a:ext cx="1428750" cy="1790700"/>
-                          </a:xfrm>
-                          <a:prstGeom prst="rect">
-                            <a:avLst/>
-                          </a:prstGeom>
-                        </pic:spPr>
-                      </pic:pic>
-                    </a:graphicData>
-                  </a:graphic>
-                </wp:inline>
-              </w:drawing>
-            </w:r>
-          </w:p>
-        </w:tc>
-        <w:tc>
-          <w:tcPr>
-            <w:tcW w:type="dxa" w:w="6720"/>
-            <w:vAlign w:val="top"/>
-          </w:tcPr>
-          <w:p>
-            <w:pPr>
-              <w:spacing w:after="100"/>
-            </w:pPr>
-            <w:r>
-              <w:rPr>
-                <w:b/>
-                <w:bCs/>
-                <w:color w:val="7D6E4C"/>
-                <w:spacing w:val="30"/>
-                <w:sz w:val="16"/>
-                <w:szCs w:val="16"/>
-              </w:rPr>
-              <w:t xml:space="preserve">FILE  </w:t>
-            </w:r>
-            <w:r>
-              <w:rPr>
-                <w:rFonts w:ascii="Consolas" w:cs="Consolas" w:eastAsia="Consolas" w:hAnsi="Consolas"/>
-                <w:color w:val="5A606A"/>
-                <w:sz w:val="17"/>
-                <w:szCs w:val="17"/>
-              </w:rPr>
-              <w:t xml:space="preserve">04-pulled-over.png</w:t>
-            </w:r>
-          </w:p>
-          <w:p>
-            <w:pPr>
-              <w:spacing w:after="80"/>
-            </w:pPr>
-            <w:r>
-              <w:rPr>
-                <w:b/>
-                <w:bCs/>
-                <w:color w:val="7D6E4C"/>
-                <w:spacing w:val="30"/>
-                <w:sz w:val="16"/>
-                <w:szCs w:val="16"/>
-              </w:rPr>
-              <w:t xml:space="preserve">CAPTION</w:t>
-            </w:r>
-          </w:p>
-          <w:p>
-            <w:pPr>
-              <w:spacing w:after="120"/>
-            </w:pPr>
-            <w:r>
-              <w:t xml:space="preserve">Save this one.</w:t>
-            </w:r>
-          </w:p>
-          <w:p>
-            <w:pPr>
-              <w:spacing w:after="120"/>
-            </w:pPr>
-            <w:r>
-              <w:t xml:space="preserve">At a traffic stop, stay calm and be polite. You can decline to answer questions without a lawyer, and you can decline consent to a search. Provide your license, registration, and proof of insurance when asked. Ask for counsel, then call one.</w:t>
-            </w:r>
-          </w:p>
-          <w:p>
-            <w:pPr>
-              <w:spacing w:after="120"/>
-            </w:pPr>
-            <w:r>
-              <w:t xml:space="preserve">If you've already been charged, reach out before your first court date.</w:t>
-            </w:r>
-          </w:p>
-          <w:p>
-            <w:pPr>
-              <w:spacing w:after="120"/>
-            </w:pPr>
-            <w:r>
-              <w:rPr>
-                <w:color w:val="7D6E4C"/>
-              </w:rPr>
-              <w:t xml:space="preserve">#KnowYourRights #NashvilleLawyer #CriminalDefense #DavidsonCounty #Tennessee</w:t>
-            </w:r>
-          </w:p>
-          <w:p>
-            <w:pPr>
-              <w:spacing w:after="120"/>
-            </w:pPr>
-            <w:r>
-              <w:rPr>
-                <w:i/>
-                <w:iCs/>
-                <w:color w:val="5A606A"/>
-              </w:rPr>
-              <w:t xml:space="preserve">General information, not legal advice.</w:t>
-            </w:r>
-          </w:p>
-          <w:p>
-            <w:pPr>
-              <w:spacing w:after="60" w:before="80"/>
-            </w:pPr>
-            <w:r>
-              <w:rPr>
-                <w:b/>
-                <w:bCs/>
-                <w:color w:val="7D6E4C"/>
-                <w:spacing w:val="30"/>
-                <w:sz w:val="16"/>
-                <w:szCs w:val="16"/>
-              </w:rPr>
-              <w:t xml:space="preserve">ALT TEXT</w:t>
-            </w:r>
-          </w:p>
-          <w:p>
-            <w:pPr>
-              <w:spacing w:after="60"/>
-            </w:pPr>
-            <w:r>
-              <w:rPr>
-                <w:color w:val="5A606A"/>
-                <w:sz w:val="19"/>
-                <w:szCs w:val="19"/>
-              </w:rPr>
-              <w:t xml:space="preserve">"Pulled over in Tennessee? Stay calm and be polite. You can decline to answer questions without a lawyer, and you can decline consent to a search."</w:t>
-            </w:r>
-          </w:p>
-        </w:tc>
-      </w:tr>
-    </w:tbl>
-    <w:p>
-      <w:pPr>
-        <w:pBdr>
-          <w:bottom w:val="single" w:color="D3CDBF" w:sz="4" w:space="8"/>
-        </w:pBdr>
-        <w:spacing w:after="240"/>
-      </w:pPr>
-    </w:p>
-    <w:p>
-      <w:pPr>
-        <w:pStyle w:val="Heading2"/>
-        <w:keepNext/>
-      </w:pPr>
-      <w:r>
-        <w:t xml:space="preserve">05 · Stablecoins now have federal rules</w:t>
-      </w:r>
-    </w:p>
-    <w:tbl>
-      <w:tblPr>
-        <w:tblW w:type="dxa" w:w="9360"/>
-        <w:tblBorders>
-          <w:top w:val="none" w:color="FFFFFF" w:sz="0"/>
-          <w:left w:val="none" w:color="FFFFFF" w:sz="0"/>
-          <w:bottom w:val="none" w:color="FFFFFF" w:sz="0"/>
-          <w:right w:val="none" w:color="FFFFFF" w:sz="0"/>
-          <w:insideH w:val="none" w:color="FFFFFF" w:sz="0"/>
-          <w:insideV w:val="none" w:color="FFFFFF" w:sz="0"/>
-        </w:tblBorders>
-      </w:tblPr>
-      <w:tblGrid>
-        <w:gridCol w:w="2640"/>
-        <w:gridCol w:w="6720"/>
-      </w:tblGrid>
-      <w:tr>
-        <w:trPr>
-          <w:cantSplit/>
-        </w:trPr>
-        <w:tc>
-          <w:tcPr>
-            <w:tcW w:type="dxa" w:w="2640"/>
-            <w:tcMar>
-              <w:right w:type="dxa" w:w="240"/>
-            </w:tcMar>
-            <w:vAlign w:val="top"/>
-          </w:tcPr>
-          <w:p>
-            <w:pPr>
-              <w:spacing w:after="100"/>
-            </w:pPr>
-            <w:r>
-              <w:drawing>
-                <wp:inline distT="0" distB="0" distL="0" distR="0">
-                  <wp:extent cx="1428750" cy="1790700"/>
-                  <wp:effectExtent t="0" r="0" b="0" l="0"/>
-                  <wp:docPr id="1" name="05-stablecoins-genius-act.png" descr="Alt text: &quot;Stablecoins now have federal rules,&quot; with a short summary of the GENIUS Act." title="05-stablecoins-genius-act.png"/>
+                  <wp:docPr id="1" name="01-counsel-for-what-comes-next.png" descr="Alt text: Nashville skyline in black and white with the words &quot;Counsel for what comes next.&quot;" title="01-counsel-for-what-comes-next.png"/>
                   <wp:cNvGraphicFramePr>
                     <a:graphicFrameLocks xmlns:a="http://schemas.openxmlformats.org/drawingml/2006/main" noChangeAspect="1"/>
                   </wp:cNvGraphicFramePr>
@@ -1294,7 +855,7 @@
                 <w:sz w:val="17"/>
                 <w:szCs w:val="17"/>
               </w:rPr>
-              <w:t xml:space="preserve">05-stablecoins-genius-act.png</w:t>
+              <w:t xml:space="preserve">01-counsel-for-what-comes-next.png</w:t>
             </w:r>
           </w:p>
           <w:p>
@@ -1318,47 +879,34 @@
               <w:spacing w:after="120"/>
             </w:pPr>
             <w:r>
-              <w:t xml:space="preserve">The GENIUS Act (2025) created the first federal framework for payment stablecoins: reserve, disclosure, and licensing rules for issuers.</w:t>
-            </w:r>
-          </w:p>
-          <w:p>
-            <w:pPr>
-              <w:spacing w:after="120"/>
-            </w:pPr>
-            <w:r>
-              <w:t xml:space="preserve">For Nashville businesses that opens a real opportunity: settle payments in minutes, cut card and wire fees, and reach customers abroad. It also means the structure has to be right before you accept, hold, or issue them.</w:t>
-            </w:r>
-          </w:p>
-          <w:p>
-            <w:pPr>
-              <w:spacing w:after="120"/>
-            </w:pPr>
-            <w:r>
-              <w:t xml:space="preserve">Building something with stablecoins or AI agents that pay? Let's talk.</w:t>
-            </w:r>
-          </w:p>
-          <w:p>
-            <w:pPr>
-              <w:spacing w:after="120"/>
-            </w:pPr>
-            <w:r>
-              <w:rPr>
-                <w:color w:val="7D6E4C"/>
-              </w:rPr>
-              <w:t xml:space="preserve">#Stablecoins #GENIUSAct #Fintech #AgenticPayments #NashvilleBusiness</w:t>
-            </w:r>
-          </w:p>
-          <w:p>
-            <w:pPr>
-              <w:spacing w:after="120"/>
-            </w:pPr>
-            <w:r>
-              <w:rPr>
-                <w:i/>
-                <w:iCs/>
-                <w:color w:val="5A606A"/>
-              </w:rPr>
-              <w:t xml:space="preserve">General information, not legal advice.</w:t>
+              <w:t xml:space="preserve">Every matter we take starts the same way: one person on one side, and a far bigger power on the other.</w:t>
+            </w:r>
+          </w:p>
+          <w:p>
+            <w:pPr>
+              <w:spacing w:after="120"/>
+            </w:pPr>
+            <w:r>
+              <w:t xml:space="preserve">MT Legal is a client-centered Nashville firm with dedicated support for DeFi and digital assets, plus traditional practice from criminal defense to estate planning. Whether you face the state in court or the banks, exchanges, and gatekeepers that control money and property, you work directly with your attorney.</w:t>
+            </w:r>
+          </w:p>
+          <w:p>
+            <w:pPr>
+              <w:spacing w:after="120"/>
+            </w:pPr>
+            <w:r>
+              <w:t xml:space="preserve">Start with a brief call at no cost. Link in bio.</w:t>
+            </w:r>
+          </w:p>
+          <w:p>
+            <w:pPr>
+              <w:spacing w:after="120"/>
+            </w:pPr>
+            <w:r>
+              <w:rPr>
+                <w:color w:val="7D6E4C"/>
+              </w:rPr>
+              <w:t xml:space="preserve">#NashvilleLawyer #MiddleTennessee #DeFi #DigitalAssets #NashvilleTN</w:t>
             </w:r>
           </w:p>
           <w:p>
@@ -1387,7 +935,7 @@
                 <w:sz w:val="19"/>
                 <w:szCs w:val="19"/>
               </w:rPr>
-              <w:t xml:space="preserve">"Stablecoins now have federal rules," with a short summary of the GENIUS Act.</w:t>
+              <w:t xml:space="preserve">Nashville skyline in black and white with the words "Counsel for what comes next."</w:t>
             </w:r>
           </w:p>
         </w:tc>
@@ -1407,7 +955,7 @@
         <w:keepNext/>
       </w:pPr>
       <w:r>
-        <w:t xml:space="preserve">06 · One person. A bigger power.</w:t>
+        <w:t xml:space="preserve">02 · Our principle</w:t>
       </w:r>
     </w:p>
     <w:tbl>
@@ -1447,7 +995,7 @@
                 <wp:inline distT="0" distB="0" distL="0" distR="0">
                   <wp:extent cx="1428750" cy="1790700"/>
                   <wp:effectExtent t="0" r="0" b="0" l="0"/>
-                  <wp:docPr id="1" name="06-one-person-bigger-power.png" descr="Alt text: Davidson County courthouse in black and white with the words &quot;One person. A bigger power.&quot;" title="06-one-person-bigger-power.png"/>
+                  <wp:docPr id="1" name="02-worth-quote.png" descr="Alt text: Quote reading &quot;A person's worth cannot be measured by their wealth, and neither should the quality of their counsel,&quot; attributed to Madison T. Biggs, Esq." title="02-worth-quote.png"/>
                   <wp:cNvGraphicFramePr>
                     <a:graphicFrameLocks xmlns:a="http://schemas.openxmlformats.org/drawingml/2006/main" noChangeAspect="1"/>
                   </wp:cNvGraphicFramePr>
@@ -1511,7 +1059,7 @@
                 <w:sz w:val="17"/>
                 <w:szCs w:val="17"/>
               </w:rPr>
-              <w:t xml:space="preserve">06-one-person-bigger-power.png</w:t>
+              <w:t xml:space="preserve">02-worth-quote.png</w:t>
             </w:r>
           </w:p>
           <w:p>
@@ -1535,26 +1083,26 @@
               <w:spacing w:after="120"/>
             </w:pPr>
             <w:r>
-              <w:t xml:space="preserve">I learned how the system works from the inside: two years as a deputy court clerk, an internship with the District Attorney's Office, and then the defense table.</w:t>
-            </w:r>
-          </w:p>
-          <w:p>
-            <w:pPr>
-              <w:spacing w:after="120"/>
-            </w:pPr>
-            <w:r>
-              <w:t xml:space="preserve">That's still the job. One person on one side, a bigger power on the other, and someone making sure your side gets heard. Today that fight happens in courtrooms and in the new economy.</w:t>
-            </w:r>
-          </w:p>
-          <w:p>
-            <w:pPr>
-              <w:spacing w:after="120"/>
-            </w:pPr>
-            <w:r>
-              <w:rPr>
-                <w:color w:val="7D6E4C"/>
-              </w:rPr>
-              <w:t xml:space="preserve">#Litigation #NashvilleLawyer #CivilRights #ClientFirst #MiddleTennessee</w:t>
+              <w:t xml:space="preserve">This is the line the firm is built on.</w:t>
+            </w:r>
+          </w:p>
+          <w:p>
+            <w:pPr>
+              <w:spacing w:after="120"/>
+            </w:pPr>
+            <w:r>
+              <w:t xml:space="preserve">Good counsel shouldn't depend on the size of your bank account or the size of the other side's legal team. Whether it's a courtroom in Davidson County or a fight with a platform over your own assets, you deserve someone in your corner who treats your matter like it matters.</w:t>
+            </w:r>
+          </w:p>
+          <w:p>
+            <w:pPr>
+              <w:spacing w:after="120"/>
+            </w:pPr>
+            <w:r>
+              <w:rPr>
+                <w:color w:val="7D6E4C"/>
+              </w:rPr>
+              <w:t xml:space="preserve">#AccessToJustice #NashvilleLawyer #ClientFirst #MTLegal</w:t>
             </w:r>
           </w:p>
           <w:p>
@@ -1583,7 +1131,7 @@
                 <w:sz w:val="19"/>
                 <w:szCs w:val="19"/>
               </w:rPr>
-              <w:t xml:space="preserve">Davidson County courthouse in black and white with the words "One person. A bigger power."</w:t>
+              <w:t xml:space="preserve">Quote reading "A person's worth cannot be measured by their wealth, and neither should the quality of their counsel," attributed to Madison T. Biggs, Esq.</w:t>
             </w:r>
           </w:p>
         </w:tc>
@@ -1603,7 +1151,7 @@
         <w:keepNext/>
       </w:pPr>
       <w:r>
-        <w:t xml:space="preserve">07 · Can you tokenize a Nashville duplex?</w:t>
+        <w:t xml:space="preserve">03 · Carousel: If you died tomorrow, could your family reach your crypto?</w:t>
       </w:r>
     </w:p>
     <w:tbl>
@@ -1641,9 +1189,9 @@
             <w:r>
               <w:drawing>
                 <wp:inline distT="0" distB="0" distL="0" distR="0">
-                  <wp:extent cx="1428750" cy="1790700"/>
+                  <wp:extent cx="990600" cy="1238250"/>
                   <wp:effectExtent t="0" r="0" b="0" l="0"/>
-                  <wp:docPr id="1" name="07-tokenize-a-duplex.png" descr="Alt text: &quot;Can you tokenize a Nashville duplex? Yes, if the structure is right.&quot;" title="07-tokenize-a-duplex.png"/>
+                  <wp:docPr id="1" name="03a-crypto-estate-cover.png" descr="Alt text (cover): &quot;If you died tomorrow, could your family reach your crypto?&quot;" title="03a-crypto-estate-cover.png"/>
                   <wp:cNvGraphicFramePr>
                     <a:graphicFrameLocks xmlns:a="http://schemas.openxmlformats.org/drawingml/2006/main" noChangeAspect="1"/>
                   </wp:cNvGraphicFramePr>
@@ -1666,7 +1214,7 @@
                         <pic:spPr bwMode="auto">
                           <a:xfrm>
                             <a:off x="0" y="0"/>
-                            <a:ext cx="1428750" cy="1790700"/>
+                            <a:ext cx="990600" cy="1238250"/>
                           </a:xfrm>
                           <a:prstGeom prst="rect">
                             <a:avLst/>
@@ -1679,6 +1227,96 @@
               </w:drawing>
             </w:r>
           </w:p>
+          <w:p>
+            <w:pPr>
+              <w:spacing w:after="100"/>
+            </w:pPr>
+            <w:r>
+              <w:drawing>
+                <wp:inline distT="0" distB="0" distL="0" distR="0">
+                  <wp:extent cx="990600" cy="1238250"/>
+                  <wp:effectExtent t="0" r="0" b="0" l="0"/>
+                  <wp:docPr id="1" name="03b-crypto-estate-keys.png" descr="Alt text (slide 2): &quot;Keys in a drawer are not an estate plan.&quot;" title="03b-crypto-estate-keys.png"/>
+                  <wp:cNvGraphicFramePr>
+                    <a:graphicFrameLocks xmlns:a="http://schemas.openxmlformats.org/drawingml/2006/main" noChangeAspect="1"/>
+                  </wp:cNvGraphicFramePr>
+                  <a:graphic xmlns:a="http://schemas.openxmlformats.org/drawingml/2006/main">
+                    <a:graphicData uri="http://schemas.openxmlformats.org/drawingml/2006/picture">
+                      <pic:pic xmlns:pic="http://schemas.openxmlformats.org/drawingml/2006/picture">
+                        <pic:nvPicPr>
+                          <pic:cNvPr id="0" name="" descr=""/>
+                          <pic:cNvPicPr>
+                            <a:picLocks noChangeAspect="1" noChangeArrowheads="1"/>
+                          </pic:cNvPicPr>
+                        </pic:nvPicPr>
+                        <pic:blipFill>
+                          <a:blip r:embed="rId17" cstate="none"/>
+                          <a:srcRect/>
+                          <a:stretch>
+                            <a:fillRect/>
+                          </a:stretch>
+                        </pic:blipFill>
+                        <pic:spPr bwMode="auto">
+                          <a:xfrm>
+                            <a:off x="0" y="0"/>
+                            <a:ext cx="990600" cy="1238250"/>
+                          </a:xfrm>
+                          <a:prstGeom prst="rect">
+                            <a:avLst/>
+                          </a:prstGeom>
+                        </pic:spPr>
+                      </pic:pic>
+                    </a:graphicData>
+                  </a:graphic>
+                </wp:inline>
+              </w:drawing>
+            </w:r>
+          </w:p>
+          <w:p>
+            <w:pPr>
+              <w:spacing w:after="100"/>
+            </w:pPr>
+            <w:r>
+              <w:drawing>
+                <wp:inline distT="0" distB="0" distL="0" distR="0">
+                  <wp:extent cx="990600" cy="1238250"/>
+                  <wp:effectExtent t="0" r="0" b="0" l="0"/>
+                  <wp:docPr id="1" name="03c-crypto-estate-checklist.png" descr="Alt text (slide 3): Checklist: a will or trust for digital assets, an inventory of wallets and accounts, legal authority for your executor, and a key-access plan." title="03c-crypto-estate-checklist.png"/>
+                  <wp:cNvGraphicFramePr>
+                    <a:graphicFrameLocks xmlns:a="http://schemas.openxmlformats.org/drawingml/2006/main" noChangeAspect="1"/>
+                  </wp:cNvGraphicFramePr>
+                  <a:graphic xmlns:a="http://schemas.openxmlformats.org/drawingml/2006/main">
+                    <a:graphicData uri="http://schemas.openxmlformats.org/drawingml/2006/picture">
+                      <pic:pic xmlns:pic="http://schemas.openxmlformats.org/drawingml/2006/picture">
+                        <pic:nvPicPr>
+                          <pic:cNvPr id="0" name="" descr=""/>
+                          <pic:cNvPicPr>
+                            <a:picLocks noChangeAspect="1" noChangeArrowheads="1"/>
+                          </pic:cNvPicPr>
+                        </pic:nvPicPr>
+                        <pic:blipFill>
+                          <a:blip r:embed="rId18" cstate="none"/>
+                          <a:srcRect/>
+                          <a:stretch>
+                            <a:fillRect/>
+                          </a:stretch>
+                        </pic:blipFill>
+                        <pic:spPr bwMode="auto">
+                          <a:xfrm>
+                            <a:off x="0" y="0"/>
+                            <a:ext cx="990600" cy="1238250"/>
+                          </a:xfrm>
+                          <a:prstGeom prst="rect">
+                            <a:avLst/>
+                          </a:prstGeom>
+                        </pic:spPr>
+                      </pic:pic>
+                    </a:graphicData>
+                  </a:graphic>
+                </wp:inline>
+              </w:drawing>
+            </w:r>
+          </w:p>
         </w:tc>
         <w:tc>
           <w:tcPr>
@@ -1707,7 +1345,7 @@
                 <w:sz w:val="17"/>
                 <w:szCs w:val="17"/>
               </w:rPr>
-              <w:t xml:space="preserve">07-tokenize-a-duplex.png</w:t>
+              <w:t xml:space="preserve">03a-crypto-estate-cover.png, 03b-crypto-estate-keys.png, 03c-crypto-estate-checklist.png</w:t>
             </w:r>
           </w:p>
           <w:p>
@@ -1731,26 +1369,34 @@
               <w:spacing w:after="120"/>
             </w:pPr>
             <w:r>
-              <w:t xml:space="preserve">Short answer: yes, if the structure is right.</w:t>
-            </w:r>
-          </w:p>
-          <w:p>
-            <w:pPr>
-              <w:spacing w:after="120"/>
-            </w:pPr>
-            <w:r>
-              <w:t xml:space="preserve">Tokenization can open a property to smaller investors and faster transfers. Done wrong, it's an unregistered securities offering. The legal work is what makes the token mean something: the right entity, a securities exemption, clean title, and transfer rules that hold up.</w:t>
-            </w:r>
-          </w:p>
-          <w:p>
-            <w:pPr>
-              <w:spacing w:after="120"/>
-            </w:pPr>
-            <w:r>
-              <w:rPr>
-                <w:color w:val="7D6E4C"/>
-              </w:rPr>
-              <w:t xml:space="preserve">#Tokenization #RealWorldAssets #RWA #NashvilleRealEstate #Web3</w:t>
+              <w:t xml:space="preserve">I've been in the crypto space since 2017, and the most common way digital wealth disappears isn't a hack. It's a family that can't get in.</w:t>
+            </w:r>
+          </w:p>
+          <w:p>
+            <w:pPr>
+              <w:spacing w:after="120"/>
+            </w:pPr>
+            <w:r>
+              <w:t xml:space="preserve">A seed phrase in a drawer is not an estate plan. Your executor needs legal authority to act, and a secure way to reach your wallets and accounts, without anyone holding your keys while you're alive.</w:t>
+            </w:r>
+          </w:p>
+          <w:p>
+            <w:pPr>
+              <w:spacing w:after="120"/>
+            </w:pPr>
+            <w:r>
+              <w:t xml:space="preserve">Swipe for what a digital asset plan covers. Questions? Link in bio.</w:t>
+            </w:r>
+          </w:p>
+          <w:p>
+            <w:pPr>
+              <w:spacing w:after="120"/>
+            </w:pPr>
+            <w:r>
+              <w:rPr>
+                <w:color w:val="7D6E4C"/>
+              </w:rPr>
+              <w:t xml:space="preserve">#CryptoEstatePlanning #DigitalAssets #Bitcoin #EstatePlanning #NashvilleTN</w:t>
             </w:r>
           </w:p>
           <w:p>
@@ -1792,7 +1438,33 @@
                 <w:sz w:val="19"/>
                 <w:szCs w:val="19"/>
               </w:rPr>
-              <w:t xml:space="preserve">"Can you tokenize a Nashville duplex? Yes, if the structure is right."</w:t>
+              <w:t xml:space="preserve">Cover: "If you died tomorrow, could your family reach your crypto?"</w:t>
+            </w:r>
+          </w:p>
+          <w:p>
+            <w:pPr>
+              <w:spacing w:after="60"/>
+            </w:pPr>
+            <w:r>
+              <w:rPr>
+                <w:color w:val="5A606A"/>
+                <w:sz w:val="19"/>
+                <w:szCs w:val="19"/>
+              </w:rPr>
+              <w:t xml:space="preserve">Slide 2: "Keys in a drawer are not an estate plan."</w:t>
+            </w:r>
+          </w:p>
+          <w:p>
+            <w:pPr>
+              <w:spacing w:after="60"/>
+            </w:pPr>
+            <w:r>
+              <w:rPr>
+                <w:color w:val="5A606A"/>
+                <w:sz w:val="19"/>
+                <w:szCs w:val="19"/>
+              </w:rPr>
+              <w:t xml:space="preserve">Slide 3: Checklist: a will or trust for digital assets, an inventory of wallets and accounts, legal authority for your executor, and a key-access plan.</w:t>
             </w:r>
           </w:p>
         </w:tc>
@@ -1812,7 +1484,7 @@
         <w:keepNext/>
       </w:pPr>
       <w:r>
-        <w:t xml:space="preserve">08 · Your rights have a deadline</w:t>
+        <w:t xml:space="preserve">04 · Pulled over in Tennessee?</w:t>
       </w:r>
     </w:p>
     <w:tbl>
@@ -1852,7 +1524,7 @@
                 <wp:inline distT="0" distB="0" distL="0" distR="0">
                   <wp:extent cx="1428750" cy="1790700"/>
                   <wp:effectExtent t="0" r="0" b="0" l="0"/>
-                  <wp:docPr id="1" name="08-one-year-deadline.png" descr="Alt text: &quot;Your rights have a deadline. In Tennessee, most civil rights and personal injury claims must be filed within one year.&quot;" title="08-one-year-deadline.png"/>
+                  <wp:docPr id="1" name="04-pulled-over.png" descr="Alt text: &quot;Pulled over in Tennessee? Stay calm and be polite. You can decline to answer questions without a lawyer, and you can decline consent to a search.&quot;" title="04-pulled-over.png"/>
                   <wp:cNvGraphicFramePr>
                     <a:graphicFrameLocks xmlns:a="http://schemas.openxmlformats.org/drawingml/2006/main" noChangeAspect="1"/>
                   </wp:cNvGraphicFramePr>
@@ -1866,7 +1538,7 @@
                           </pic:cNvPicPr>
                         </pic:nvPicPr>
                         <pic:blipFill>
-                          <a:blip r:embed="rId17" cstate="none"/>
+                          <a:blip r:embed="rId19" cstate="none"/>
                           <a:srcRect/>
                           <a:stretch>
                             <a:fillRect/>
@@ -1916,7 +1588,7 @@
                 <w:sz w:val="17"/>
                 <w:szCs w:val="17"/>
               </w:rPr>
-              <w:t xml:space="preserve">08-one-year-deadline.png</w:t>
+              <w:t xml:space="preserve">04-pulled-over.png</w:t>
             </w:r>
           </w:p>
           <w:p>
@@ -1940,26 +1612,34 @@
               <w:spacing w:after="120"/>
             </w:pPr>
             <w:r>
-              <w:t xml:space="preserve">Tennessee has one of the shortest filing deadlines in the country. Most civil rights and personal injury claims must be filed within one year.</w:t>
-            </w:r>
-          </w:p>
-          <w:p>
-            <w:pPr>
-              <w:spacing w:after="120"/>
-            </w:pPr>
-            <w:r>
-              <w:t xml:space="preserve">Evidence fades, footage gets deleted, and insurers count on you waiting. If something happened to you, don't sit on it.</w:t>
-            </w:r>
-          </w:p>
-          <w:p>
-            <w:pPr>
-              <w:spacing w:after="120"/>
-            </w:pPr>
-            <w:r>
-              <w:rPr>
-                <w:color w:val="7D6E4C"/>
-              </w:rPr>
-              <w:t xml:space="preserve">#PersonalInjury #CivilRights #Tennessee #NashvilleLawyer #KnowYourRights</w:t>
+              <w:t xml:space="preserve">Save this one.</w:t>
+            </w:r>
+          </w:p>
+          <w:p>
+            <w:pPr>
+              <w:spacing w:after="120"/>
+            </w:pPr>
+            <w:r>
+              <w:t xml:space="preserve">At a traffic stop, stay calm and be polite. You can decline to answer questions without a lawyer, and you can decline consent to a search. Provide your license, registration, and proof of insurance when asked. Ask for counsel, then call one.</w:t>
+            </w:r>
+          </w:p>
+          <w:p>
+            <w:pPr>
+              <w:spacing w:after="120"/>
+            </w:pPr>
+            <w:r>
+              <w:t xml:space="preserve">If you've already been charged, reach out before your first court date.</w:t>
+            </w:r>
+          </w:p>
+          <w:p>
+            <w:pPr>
+              <w:spacing w:after="120"/>
+            </w:pPr>
+            <w:r>
+              <w:rPr>
+                <w:color w:val="7D6E4C"/>
+              </w:rPr>
+              <w:t xml:space="preserve">#KnowYourRights #NashvilleLawyer #CriminalDefense #DavidsonCounty #Tennessee</w:t>
             </w:r>
           </w:p>
           <w:p>
@@ -2001,7 +1681,7 @@
                 <w:sz w:val="19"/>
                 <w:szCs w:val="19"/>
               </w:rPr>
-              <w:t xml:space="preserve">"Your rights have a deadline. In Tennessee, most civil rights and personal injury claims must be filed within one year."</w:t>
+              <w:t xml:space="preserve">"Pulled over in Tennessee? Stay calm and be polite. You can decline to answer questions without a lawyer, and you can decline consent to a search."</w:t>
             </w:r>
           </w:p>
         </w:tc>
@@ -2021,7 +1701,7 @@
         <w:keepNext/>
       </w:pPr>
       <w:r>
-        <w:t xml:space="preserve">09 · Meet Madison</w:t>
+        <w:t xml:space="preserve">05 · Stablecoins now have federal rules</w:t>
       </w:r>
     </w:p>
     <w:tbl>
@@ -2061,7 +1741,7 @@
                 <wp:inline distT="0" distB="0" distL="0" distR="0">
                   <wp:extent cx="1428750" cy="1790700"/>
                   <wp:effectExtent t="0" r="0" b="0" l="0"/>
-                  <wp:docPr id="1" name="09-meet-madison.png" descr="Alt text: Portrait of Madison T. Biggs, Esq. with the words &quot;The lawyer you meet is the lawyer on your case.&quot;" title="09-meet-madison.png"/>
+                  <wp:docPr id="1" name="05-stablecoins-genius-act.png" descr="Alt text: &quot;Stablecoins now have federal rules,&quot; with a short summary of the GENIUS Act." title="05-stablecoins-genius-act.png"/>
                   <wp:cNvGraphicFramePr>
                     <a:graphicFrameLocks xmlns:a="http://schemas.openxmlformats.org/drawingml/2006/main" noChangeAspect="1"/>
                   </wp:cNvGraphicFramePr>
@@ -2075,7 +1755,7 @@
                           </pic:cNvPicPr>
                         </pic:nvPicPr>
                         <pic:blipFill>
-                          <a:blip r:embed="rId18" cstate="none"/>
+                          <a:blip r:embed="rId20" cstate="none"/>
                           <a:srcRect/>
                           <a:stretch>
                             <a:fillRect/>
@@ -2125,7 +1805,7 @@
                 <w:sz w:val="17"/>
                 <w:szCs w:val="17"/>
               </w:rPr>
-              <w:t xml:space="preserve">09-meet-madison.png</w:t>
+              <w:t xml:space="preserve">05-stablecoins-genius-act.png</w:t>
             </w:r>
           </w:p>
           <w:p>
@@ -2149,34 +1829,47 @@
               <w:spacing w:after="120"/>
             </w:pPr>
             <w:r>
-              <w:t xml:space="preserve">Hi, I'm Madison.</w:t>
-            </w:r>
-          </w:p>
-          <w:p>
-            <w:pPr>
-              <w:spacing w:after="120"/>
-            </w:pPr>
-            <w:r>
-              <w:t xml:space="preserve">I've been in the crypto space since 2017 and in courtrooms across Middle Tennessee as a litigator. I started MT Legal so clients would always know who is handling their matter: me, from the first call to the last.</w:t>
-            </w:r>
-          </w:p>
-          <w:p>
-            <w:pPr>
-              <w:spacing w:after="120"/>
-            </w:pPr>
-            <w:r>
-              <w:t xml:space="preserve">Belmont Law graduate. Adjunct professor of Business Law at Fisk University. Member of Nashville's Bitcoin community.</w:t>
-            </w:r>
-          </w:p>
-          <w:p>
-            <w:pPr>
-              <w:spacing w:after="120"/>
-            </w:pPr>
-            <w:r>
-              <w:rPr>
-                <w:color w:val="7D6E4C"/>
-              </w:rPr>
-              <w:t xml:space="preserve">#MeetTheAttorney #NashvilleLawyer #Bitcoin #CryptoLawyer #MTLegal</w:t>
+              <w:t xml:space="preserve">The GENIUS Act (2025) created the first federal framework for payment stablecoins: reserve, disclosure, and licensing rules for issuers.</w:t>
+            </w:r>
+          </w:p>
+          <w:p>
+            <w:pPr>
+              <w:spacing w:after="120"/>
+            </w:pPr>
+            <w:r>
+              <w:t xml:space="preserve">For Nashville businesses that opens a real opportunity: settle payments in minutes, cut card and wire fees, and reach customers abroad. It also means the structure has to be right before you accept, hold, or issue them.</w:t>
+            </w:r>
+          </w:p>
+          <w:p>
+            <w:pPr>
+              <w:spacing w:after="120"/>
+            </w:pPr>
+            <w:r>
+              <w:t xml:space="preserve">Building something with stablecoins or agentic commerce? Let's talk.</w:t>
+            </w:r>
+          </w:p>
+          <w:p>
+            <w:pPr>
+              <w:spacing w:after="120"/>
+            </w:pPr>
+            <w:r>
+              <w:rPr>
+                <w:color w:val="7D6E4C"/>
+              </w:rPr>
+              <w:t xml:space="preserve">#Stablecoins #GENIUSAct #Fintech #AgenticCommerce #NashvilleBusiness</w:t>
+            </w:r>
+          </w:p>
+          <w:p>
+            <w:pPr>
+              <w:spacing w:after="120"/>
+            </w:pPr>
+            <w:r>
+              <w:rPr>
+                <w:i/>
+                <w:iCs/>
+                <w:color w:val="5A606A"/>
+              </w:rPr>
+              <w:t xml:space="preserve">General information, not legal advice.</w:t>
             </w:r>
           </w:p>
           <w:p>
@@ -2205,7 +1898,7 @@
                 <w:sz w:val="19"/>
                 <w:szCs w:val="19"/>
               </w:rPr>
-              <w:t xml:space="preserve">Portrait of Madison T. Biggs, Esq. with the words "The lawyer you meet is the lawyer on your case."</w:t>
+              <w:t xml:space="preserve">"Stablecoins now have federal rules," with a short summary of the GENIUS Act.</w:t>
             </w:r>
           </w:p>
         </w:tc>
@@ -2221,7 +1914,826 @@
     </w:p>
     <w:p>
       <w:pPr>
+        <w:pStyle w:val="Heading2"/>
+        <w:keepNext/>
+      </w:pPr>
+      <w:r>
+        <w:t xml:space="preserve">06 · One person. A bigger power.</w:t>
+      </w:r>
+    </w:p>
+    <w:tbl>
+      <w:tblPr>
+        <w:tblW w:type="dxa" w:w="9360"/>
+        <w:tblBorders>
+          <w:top w:val="none" w:color="FFFFFF" w:sz="0"/>
+          <w:left w:val="none" w:color="FFFFFF" w:sz="0"/>
+          <w:bottom w:val="none" w:color="FFFFFF" w:sz="0"/>
+          <w:right w:val="none" w:color="FFFFFF" w:sz="0"/>
+          <w:insideH w:val="none" w:color="FFFFFF" w:sz="0"/>
+          <w:insideV w:val="none" w:color="FFFFFF" w:sz="0"/>
+        </w:tblBorders>
+      </w:tblPr>
+      <w:tblGrid>
+        <w:gridCol w:w="2640"/>
+        <w:gridCol w:w="6720"/>
+      </w:tblGrid>
+      <w:tr>
+        <w:trPr>
+          <w:cantSplit/>
+        </w:trPr>
+        <w:tc>
+          <w:tcPr>
+            <w:tcW w:type="dxa" w:w="2640"/>
+            <w:tcMar>
+              <w:right w:type="dxa" w:w="240"/>
+            </w:tcMar>
+            <w:vAlign w:val="top"/>
+          </w:tcPr>
+          <w:p>
+            <w:pPr>
+              <w:spacing w:after="100"/>
+            </w:pPr>
+            <w:r>
+              <w:drawing>
+                <wp:inline distT="0" distB="0" distL="0" distR="0">
+                  <wp:extent cx="1428750" cy="1790700"/>
+                  <wp:effectExtent t="0" r="0" b="0" l="0"/>
+                  <wp:docPr id="1" name="06-one-person-bigger-power.png" descr="Alt text: Davidson County courthouse in black and white with the words &quot;One person. A bigger power.&quot;" title="06-one-person-bigger-power.png"/>
+                  <wp:cNvGraphicFramePr>
+                    <a:graphicFrameLocks xmlns:a="http://schemas.openxmlformats.org/drawingml/2006/main" noChangeAspect="1"/>
+                  </wp:cNvGraphicFramePr>
+                  <a:graphic xmlns:a="http://schemas.openxmlformats.org/drawingml/2006/main">
+                    <a:graphicData uri="http://schemas.openxmlformats.org/drawingml/2006/picture">
+                      <pic:pic xmlns:pic="http://schemas.openxmlformats.org/drawingml/2006/picture">
+                        <pic:nvPicPr>
+                          <pic:cNvPr id="0" name="" descr=""/>
+                          <pic:cNvPicPr>
+                            <a:picLocks noChangeAspect="1" noChangeArrowheads="1"/>
+                          </pic:cNvPicPr>
+                        </pic:nvPicPr>
+                        <pic:blipFill>
+                          <a:blip r:embed="rId21" cstate="none"/>
+                          <a:srcRect/>
+                          <a:stretch>
+                            <a:fillRect/>
+                          </a:stretch>
+                        </pic:blipFill>
+                        <pic:spPr bwMode="auto">
+                          <a:xfrm>
+                            <a:off x="0" y="0"/>
+                            <a:ext cx="1428750" cy="1790700"/>
+                          </a:xfrm>
+                          <a:prstGeom prst="rect">
+                            <a:avLst/>
+                          </a:prstGeom>
+                        </pic:spPr>
+                      </pic:pic>
+                    </a:graphicData>
+                  </a:graphic>
+                </wp:inline>
+              </w:drawing>
+            </w:r>
+          </w:p>
+        </w:tc>
+        <w:tc>
+          <w:tcPr>
+            <w:tcW w:type="dxa" w:w="6720"/>
+            <w:vAlign w:val="top"/>
+          </w:tcPr>
+          <w:p>
+            <w:pPr>
+              <w:spacing w:after="100"/>
+            </w:pPr>
+            <w:r>
+              <w:rPr>
+                <w:b/>
+                <w:bCs/>
+                <w:color w:val="7D6E4C"/>
+                <w:spacing w:val="30"/>
+                <w:sz w:val="16"/>
+                <w:szCs w:val="16"/>
+              </w:rPr>
+              <w:t xml:space="preserve">FILE  </w:t>
+            </w:r>
+            <w:r>
+              <w:rPr>
+                <w:rFonts w:ascii="Consolas" w:cs="Consolas" w:eastAsia="Consolas" w:hAnsi="Consolas"/>
+                <w:color w:val="5A606A"/>
+                <w:sz w:val="17"/>
+                <w:szCs w:val="17"/>
+              </w:rPr>
+              <w:t xml:space="preserve">06-one-person-bigger-power.png</w:t>
+            </w:r>
+          </w:p>
+          <w:p>
+            <w:pPr>
+              <w:spacing w:after="80"/>
+            </w:pPr>
+            <w:r>
+              <w:rPr>
+                <w:b/>
+                <w:bCs/>
+                <w:color w:val="7D6E4C"/>
+                <w:spacing w:val="30"/>
+                <w:sz w:val="16"/>
+                <w:szCs w:val="16"/>
+              </w:rPr>
+              <w:t xml:space="preserve">CAPTION</w:t>
+            </w:r>
+          </w:p>
+          <w:p>
+            <w:pPr>
+              <w:spacing w:after="120"/>
+            </w:pPr>
+            <w:r>
+              <w:t xml:space="preserve">I learned how the system works from the inside: two years as a deputy court clerk, an internship with the District Attorney's Office, and then the defense table.</w:t>
+            </w:r>
+          </w:p>
+          <w:p>
+            <w:pPr>
+              <w:spacing w:after="120"/>
+            </w:pPr>
+            <w:r>
+              <w:t xml:space="preserve">That's still the job. One person on one side, a bigger power on the other, and someone making sure your side gets heard. Today that fight happens in courtrooms and in the new economy.</w:t>
+            </w:r>
+          </w:p>
+          <w:p>
+            <w:pPr>
+              <w:spacing w:after="120"/>
+            </w:pPr>
+            <w:r>
+              <w:rPr>
+                <w:color w:val="7D6E4C"/>
+              </w:rPr>
+              <w:t xml:space="preserve">#TrialAttorney #NashvilleLawyer #CivilRights #ClientFirst #MiddleTennessee</w:t>
+            </w:r>
+          </w:p>
+          <w:p>
+            <w:pPr>
+              <w:spacing w:after="60" w:before="80"/>
+            </w:pPr>
+            <w:r>
+              <w:rPr>
+                <w:b/>
+                <w:bCs/>
+                <w:color w:val="7D6E4C"/>
+                <w:spacing w:val="30"/>
+                <w:sz w:val="16"/>
+                <w:szCs w:val="16"/>
+              </w:rPr>
+              <w:t xml:space="preserve">ALT TEXT</w:t>
+            </w:r>
+          </w:p>
+          <w:p>
+            <w:pPr>
+              <w:spacing w:after="60"/>
+            </w:pPr>
+            <w:r>
+              <w:rPr>
+                <w:color w:val="5A606A"/>
+                <w:sz w:val="19"/>
+                <w:szCs w:val="19"/>
+              </w:rPr>
+              <w:t xml:space="preserve">Davidson County courthouse in black and white with the words "One person. A bigger power."</w:t>
+            </w:r>
+          </w:p>
+        </w:tc>
+      </w:tr>
+    </w:tbl>
+    <w:p>
+      <w:pPr>
+        <w:pBdr>
+          <w:bottom w:val="single" w:color="D3CDBF" w:sz="4" w:space="8"/>
+        </w:pBdr>
+        <w:spacing w:after="240"/>
+      </w:pPr>
+    </w:p>
+    <w:p>
+      <w:pPr>
+        <w:pStyle w:val="Heading2"/>
+        <w:keepNext/>
+      </w:pPr>
+      <w:r>
+        <w:t xml:space="preserve">07 · Can you tokenize a Nashville duplex?</w:t>
+      </w:r>
+    </w:p>
+    <w:tbl>
+      <w:tblPr>
+        <w:tblW w:type="dxa" w:w="9360"/>
+        <w:tblBorders>
+          <w:top w:val="none" w:color="FFFFFF" w:sz="0"/>
+          <w:left w:val="none" w:color="FFFFFF" w:sz="0"/>
+          <w:bottom w:val="none" w:color="FFFFFF" w:sz="0"/>
+          <w:right w:val="none" w:color="FFFFFF" w:sz="0"/>
+          <w:insideH w:val="none" w:color="FFFFFF" w:sz="0"/>
+          <w:insideV w:val="none" w:color="FFFFFF" w:sz="0"/>
+        </w:tblBorders>
+      </w:tblPr>
+      <w:tblGrid>
+        <w:gridCol w:w="2640"/>
+        <w:gridCol w:w="6720"/>
+      </w:tblGrid>
+      <w:tr>
+        <w:trPr>
+          <w:cantSplit/>
+        </w:trPr>
+        <w:tc>
+          <w:tcPr>
+            <w:tcW w:type="dxa" w:w="2640"/>
+            <w:tcMar>
+              <w:right w:type="dxa" w:w="240"/>
+            </w:tcMar>
+            <w:vAlign w:val="top"/>
+          </w:tcPr>
+          <w:p>
+            <w:pPr>
+              <w:spacing w:after="100"/>
+            </w:pPr>
+            <w:r>
+              <w:drawing>
+                <wp:inline distT="0" distB="0" distL="0" distR="0">
+                  <wp:extent cx="1428750" cy="1790700"/>
+                  <wp:effectExtent t="0" r="0" b="0" l="0"/>
+                  <wp:docPr id="1" name="07-tokenize-a-duplex.png" descr="Alt text: &quot;Can you tokenize a Nashville duplex? Yes, if the structure is right.&quot;" title="07-tokenize-a-duplex.png"/>
+                  <wp:cNvGraphicFramePr>
+                    <a:graphicFrameLocks xmlns:a="http://schemas.openxmlformats.org/drawingml/2006/main" noChangeAspect="1"/>
+                  </wp:cNvGraphicFramePr>
+                  <a:graphic xmlns:a="http://schemas.openxmlformats.org/drawingml/2006/main">
+                    <a:graphicData uri="http://schemas.openxmlformats.org/drawingml/2006/picture">
+                      <pic:pic xmlns:pic="http://schemas.openxmlformats.org/drawingml/2006/picture">
+                        <pic:nvPicPr>
+                          <pic:cNvPr id="0" name="" descr=""/>
+                          <pic:cNvPicPr>
+                            <a:picLocks noChangeAspect="1" noChangeArrowheads="1"/>
+                          </pic:cNvPicPr>
+                        </pic:nvPicPr>
+                        <pic:blipFill>
+                          <a:blip r:embed="rId22" cstate="none"/>
+                          <a:srcRect/>
+                          <a:stretch>
+                            <a:fillRect/>
+                          </a:stretch>
+                        </pic:blipFill>
+                        <pic:spPr bwMode="auto">
+                          <a:xfrm>
+                            <a:off x="0" y="0"/>
+                            <a:ext cx="1428750" cy="1790700"/>
+                          </a:xfrm>
+                          <a:prstGeom prst="rect">
+                            <a:avLst/>
+                          </a:prstGeom>
+                        </pic:spPr>
+                      </pic:pic>
+                    </a:graphicData>
+                  </a:graphic>
+                </wp:inline>
+              </w:drawing>
+            </w:r>
+          </w:p>
+        </w:tc>
+        <w:tc>
+          <w:tcPr>
+            <w:tcW w:type="dxa" w:w="6720"/>
+            <w:vAlign w:val="top"/>
+          </w:tcPr>
+          <w:p>
+            <w:pPr>
+              <w:spacing w:after="100"/>
+            </w:pPr>
+            <w:r>
+              <w:rPr>
+                <w:b/>
+                <w:bCs/>
+                <w:color w:val="7D6E4C"/>
+                <w:spacing w:val="30"/>
+                <w:sz w:val="16"/>
+                <w:szCs w:val="16"/>
+              </w:rPr>
+              <w:t xml:space="preserve">FILE  </w:t>
+            </w:r>
+            <w:r>
+              <w:rPr>
+                <w:rFonts w:ascii="Consolas" w:cs="Consolas" w:eastAsia="Consolas" w:hAnsi="Consolas"/>
+                <w:color w:val="5A606A"/>
+                <w:sz w:val="17"/>
+                <w:szCs w:val="17"/>
+              </w:rPr>
+              <w:t xml:space="preserve">07-tokenize-a-duplex.png</w:t>
+            </w:r>
+          </w:p>
+          <w:p>
+            <w:pPr>
+              <w:spacing w:after="80"/>
+            </w:pPr>
+            <w:r>
+              <w:rPr>
+                <w:b/>
+                <w:bCs/>
+                <w:color w:val="7D6E4C"/>
+                <w:spacing w:val="30"/>
+                <w:sz w:val="16"/>
+                <w:szCs w:val="16"/>
+              </w:rPr>
+              <w:t xml:space="preserve">CAPTION</w:t>
+            </w:r>
+          </w:p>
+          <w:p>
+            <w:pPr>
+              <w:spacing w:after="120"/>
+            </w:pPr>
+            <w:r>
+              <w:t xml:space="preserve">Short answer: yes, if the structure is right.</w:t>
+            </w:r>
+          </w:p>
+          <w:p>
+            <w:pPr>
+              <w:spacing w:after="120"/>
+            </w:pPr>
+            <w:r>
+              <w:t xml:space="preserve">Tokenization can open a property to smaller investors and faster transfers. Done wrong, it's an unregistered securities offering. The legal work is what makes the token mean something: the right entity, a securities exemption, clean title, and transfer rules that hold up.</w:t>
+            </w:r>
+          </w:p>
+          <w:p>
+            <w:pPr>
+              <w:spacing w:after="120"/>
+            </w:pPr>
+            <w:r>
+              <w:rPr>
+                <w:color w:val="7D6E4C"/>
+              </w:rPr>
+              <w:t xml:space="preserve">#Tokenization #RealWorldAssets #RWA #NashvilleRealEstate #Web3</w:t>
+            </w:r>
+          </w:p>
+          <w:p>
+            <w:pPr>
+              <w:spacing w:after="120"/>
+            </w:pPr>
+            <w:r>
+              <w:rPr>
+                <w:i/>
+                <w:iCs/>
+                <w:color w:val="5A606A"/>
+              </w:rPr>
+              <w:t xml:space="preserve">General information, not legal advice.</w:t>
+            </w:r>
+          </w:p>
+          <w:p>
+            <w:pPr>
+              <w:spacing w:after="60" w:before="80"/>
+            </w:pPr>
+            <w:r>
+              <w:rPr>
+                <w:b/>
+                <w:bCs/>
+                <w:color w:val="7D6E4C"/>
+                <w:spacing w:val="30"/>
+                <w:sz w:val="16"/>
+                <w:szCs w:val="16"/>
+              </w:rPr>
+              <w:t xml:space="preserve">ALT TEXT</w:t>
+            </w:r>
+          </w:p>
+          <w:p>
+            <w:pPr>
+              <w:spacing w:after="60"/>
+            </w:pPr>
+            <w:r>
+              <w:rPr>
+                <w:color w:val="5A606A"/>
+                <w:sz w:val="19"/>
+                <w:szCs w:val="19"/>
+              </w:rPr>
+              <w:t xml:space="preserve">"Can you tokenize a Nashville duplex? Yes, if the structure is right."</w:t>
+            </w:r>
+          </w:p>
+        </w:tc>
+      </w:tr>
+    </w:tbl>
+    <w:p>
+      <w:pPr>
+        <w:pBdr>
+          <w:bottom w:val="single" w:color="D3CDBF" w:sz="4" w:space="8"/>
+        </w:pBdr>
+        <w:spacing w:after="240"/>
+      </w:pPr>
+    </w:p>
+    <w:p>
+      <w:pPr>
+        <w:pStyle w:val="Heading2"/>
+        <w:keepNext/>
+      </w:pPr>
+      <w:r>
+        <w:t xml:space="preserve">08 · Your rights have a deadline</w:t>
+      </w:r>
+    </w:p>
+    <w:tbl>
+      <w:tblPr>
+        <w:tblW w:type="dxa" w:w="9360"/>
+        <w:tblBorders>
+          <w:top w:val="none" w:color="FFFFFF" w:sz="0"/>
+          <w:left w:val="none" w:color="FFFFFF" w:sz="0"/>
+          <w:bottom w:val="none" w:color="FFFFFF" w:sz="0"/>
+          <w:right w:val="none" w:color="FFFFFF" w:sz="0"/>
+          <w:insideH w:val="none" w:color="FFFFFF" w:sz="0"/>
+          <w:insideV w:val="none" w:color="FFFFFF" w:sz="0"/>
+        </w:tblBorders>
+      </w:tblPr>
+      <w:tblGrid>
+        <w:gridCol w:w="2640"/>
+        <w:gridCol w:w="6720"/>
+      </w:tblGrid>
+      <w:tr>
+        <w:trPr>
+          <w:cantSplit/>
+        </w:trPr>
+        <w:tc>
+          <w:tcPr>
+            <w:tcW w:type="dxa" w:w="2640"/>
+            <w:tcMar>
+              <w:right w:type="dxa" w:w="240"/>
+            </w:tcMar>
+            <w:vAlign w:val="top"/>
+          </w:tcPr>
+          <w:p>
+            <w:pPr>
+              <w:spacing w:after="100"/>
+            </w:pPr>
+            <w:r>
+              <w:drawing>
+                <wp:inline distT="0" distB="0" distL="0" distR="0">
+                  <wp:extent cx="1428750" cy="1790700"/>
+                  <wp:effectExtent t="0" r="0" b="0" l="0"/>
+                  <wp:docPr id="1" name="08-one-year-deadline.png" descr="Alt text: &quot;Your rights have a deadline. In Tennessee, most civil rights and personal injury claims must be filed within one year.&quot;" title="08-one-year-deadline.png"/>
+                  <wp:cNvGraphicFramePr>
+                    <a:graphicFrameLocks xmlns:a="http://schemas.openxmlformats.org/drawingml/2006/main" noChangeAspect="1"/>
+                  </wp:cNvGraphicFramePr>
+                  <a:graphic xmlns:a="http://schemas.openxmlformats.org/drawingml/2006/main">
+                    <a:graphicData uri="http://schemas.openxmlformats.org/drawingml/2006/picture">
+                      <pic:pic xmlns:pic="http://schemas.openxmlformats.org/drawingml/2006/picture">
+                        <pic:nvPicPr>
+                          <pic:cNvPr id="0" name="" descr=""/>
+                          <pic:cNvPicPr>
+                            <a:picLocks noChangeAspect="1" noChangeArrowheads="1"/>
+                          </pic:cNvPicPr>
+                        </pic:nvPicPr>
+                        <pic:blipFill>
+                          <a:blip r:embed="rId23" cstate="none"/>
+                          <a:srcRect/>
+                          <a:stretch>
+                            <a:fillRect/>
+                          </a:stretch>
+                        </pic:blipFill>
+                        <pic:spPr bwMode="auto">
+                          <a:xfrm>
+                            <a:off x="0" y="0"/>
+                            <a:ext cx="1428750" cy="1790700"/>
+                          </a:xfrm>
+                          <a:prstGeom prst="rect">
+                            <a:avLst/>
+                          </a:prstGeom>
+                        </pic:spPr>
+                      </pic:pic>
+                    </a:graphicData>
+                  </a:graphic>
+                </wp:inline>
+              </w:drawing>
+            </w:r>
+          </w:p>
+        </w:tc>
+        <w:tc>
+          <w:tcPr>
+            <w:tcW w:type="dxa" w:w="6720"/>
+            <w:vAlign w:val="top"/>
+          </w:tcPr>
+          <w:p>
+            <w:pPr>
+              <w:spacing w:after="100"/>
+            </w:pPr>
+            <w:r>
+              <w:rPr>
+                <w:b/>
+                <w:bCs/>
+                <w:color w:val="7D6E4C"/>
+                <w:spacing w:val="30"/>
+                <w:sz w:val="16"/>
+                <w:szCs w:val="16"/>
+              </w:rPr>
+              <w:t xml:space="preserve">FILE  </w:t>
+            </w:r>
+            <w:r>
+              <w:rPr>
+                <w:rFonts w:ascii="Consolas" w:cs="Consolas" w:eastAsia="Consolas" w:hAnsi="Consolas"/>
+                <w:color w:val="5A606A"/>
+                <w:sz w:val="17"/>
+                <w:szCs w:val="17"/>
+              </w:rPr>
+              <w:t xml:space="preserve">08-one-year-deadline.png</w:t>
+            </w:r>
+          </w:p>
+          <w:p>
+            <w:pPr>
+              <w:spacing w:after="80"/>
+            </w:pPr>
+            <w:r>
+              <w:rPr>
+                <w:b/>
+                <w:bCs/>
+                <w:color w:val="7D6E4C"/>
+                <w:spacing w:val="30"/>
+                <w:sz w:val="16"/>
+                <w:szCs w:val="16"/>
+              </w:rPr>
+              <w:t xml:space="preserve">CAPTION</w:t>
+            </w:r>
+          </w:p>
+          <w:p>
+            <w:pPr>
+              <w:spacing w:after="120"/>
+            </w:pPr>
+            <w:r>
+              <w:t xml:space="preserve">Tennessee has one of the shortest filing deadlines in the country. Most civil rights and personal injury claims must be filed within one year.</w:t>
+            </w:r>
+          </w:p>
+          <w:p>
+            <w:pPr>
+              <w:spacing w:after="120"/>
+            </w:pPr>
+            <w:r>
+              <w:t xml:space="preserve">Evidence fades, footage gets deleted, and insurers count on you waiting. If something happened to you, don't sit on it.</w:t>
+            </w:r>
+          </w:p>
+          <w:p>
+            <w:pPr>
+              <w:spacing w:after="120"/>
+            </w:pPr>
+            <w:r>
+              <w:rPr>
+                <w:color w:val="7D6E4C"/>
+              </w:rPr>
+              <w:t xml:space="preserve">#PersonalInjury #CivilRights #Tennessee #NashvilleLawyer #KnowYourRights</w:t>
+            </w:r>
+          </w:p>
+          <w:p>
+            <w:pPr>
+              <w:spacing w:after="120"/>
+            </w:pPr>
+            <w:r>
+              <w:rPr>
+                <w:i/>
+                <w:iCs/>
+                <w:color w:val="5A606A"/>
+              </w:rPr>
+              <w:t xml:space="preserve">General information, not legal advice.</w:t>
+            </w:r>
+          </w:p>
+          <w:p>
+            <w:pPr>
+              <w:spacing w:after="60" w:before="80"/>
+            </w:pPr>
+            <w:r>
+              <w:rPr>
+                <w:b/>
+                <w:bCs/>
+                <w:color w:val="7D6E4C"/>
+                <w:spacing w:val="30"/>
+                <w:sz w:val="16"/>
+                <w:szCs w:val="16"/>
+              </w:rPr>
+              <w:t xml:space="preserve">ALT TEXT</w:t>
+            </w:r>
+          </w:p>
+          <w:p>
+            <w:pPr>
+              <w:spacing w:after="60"/>
+            </w:pPr>
+            <w:r>
+              <w:rPr>
+                <w:color w:val="5A606A"/>
+                <w:sz w:val="19"/>
+                <w:szCs w:val="19"/>
+              </w:rPr>
+              <w:t xml:space="preserve">"Your rights have a deadline. In Tennessee, most civil rights and personal injury claims must be filed within one year."</w:t>
+            </w:r>
+          </w:p>
+        </w:tc>
+      </w:tr>
+    </w:tbl>
+    <w:p>
+      <w:pPr>
+        <w:pBdr>
+          <w:bottom w:val="single" w:color="D3CDBF" w:sz="4" w:space="8"/>
+        </w:pBdr>
+        <w:spacing w:after="240"/>
+      </w:pPr>
+    </w:p>
+    <w:p>
+      <w:pPr>
+        <w:pStyle w:val="Heading2"/>
+        <w:keepNext/>
+      </w:pPr>
+      <w:r>
+        <w:t xml:space="preserve">09 · Meet Madison</w:t>
+      </w:r>
+    </w:p>
+    <w:tbl>
+      <w:tblPr>
+        <w:tblW w:type="dxa" w:w="9360"/>
+        <w:tblBorders>
+          <w:top w:val="none" w:color="FFFFFF" w:sz="0"/>
+          <w:left w:val="none" w:color="FFFFFF" w:sz="0"/>
+          <w:bottom w:val="none" w:color="FFFFFF" w:sz="0"/>
+          <w:right w:val="none" w:color="FFFFFF" w:sz="0"/>
+          <w:insideH w:val="none" w:color="FFFFFF" w:sz="0"/>
+          <w:insideV w:val="none" w:color="FFFFFF" w:sz="0"/>
+        </w:tblBorders>
+      </w:tblPr>
+      <w:tblGrid>
+        <w:gridCol w:w="2640"/>
+        <w:gridCol w:w="6720"/>
+      </w:tblGrid>
+      <w:tr>
+        <w:trPr>
+          <w:cantSplit/>
+        </w:trPr>
+        <w:tc>
+          <w:tcPr>
+            <w:tcW w:type="dxa" w:w="2640"/>
+            <w:tcMar>
+              <w:right w:type="dxa" w:w="240"/>
+            </w:tcMar>
+            <w:vAlign w:val="top"/>
+          </w:tcPr>
+          <w:p>
+            <w:pPr>
+              <w:spacing w:after="100"/>
+            </w:pPr>
+            <w:r>
+              <w:drawing>
+                <wp:inline distT="0" distB="0" distL="0" distR="0">
+                  <wp:extent cx="1428750" cy="1790700"/>
+                  <wp:effectExtent t="0" r="0" b="0" l="0"/>
+                  <wp:docPr id="1" name="09-meet-madison.png" descr="Alt text: Portrait of Madison T. Biggs, Esq. with the words &quot;The lawyer you meet is the lawyer on your case.&quot;" title="09-meet-madison.png"/>
+                  <wp:cNvGraphicFramePr>
+                    <a:graphicFrameLocks xmlns:a="http://schemas.openxmlformats.org/drawingml/2006/main" noChangeAspect="1"/>
+                  </wp:cNvGraphicFramePr>
+                  <a:graphic xmlns:a="http://schemas.openxmlformats.org/drawingml/2006/main">
+                    <a:graphicData uri="http://schemas.openxmlformats.org/drawingml/2006/picture">
+                      <pic:pic xmlns:pic="http://schemas.openxmlformats.org/drawingml/2006/picture">
+                        <pic:nvPicPr>
+                          <pic:cNvPr id="0" name="" descr=""/>
+                          <pic:cNvPicPr>
+                            <a:picLocks noChangeAspect="1" noChangeArrowheads="1"/>
+                          </pic:cNvPicPr>
+                        </pic:nvPicPr>
+                        <pic:blipFill>
+                          <a:blip r:embed="rId12" cstate="none"/>
+                          <a:srcRect/>
+                          <a:stretch>
+                            <a:fillRect/>
+                          </a:stretch>
+                        </pic:blipFill>
+                        <pic:spPr bwMode="auto">
+                          <a:xfrm>
+                            <a:off x="0" y="0"/>
+                            <a:ext cx="1428750" cy="1790700"/>
+                          </a:xfrm>
+                          <a:prstGeom prst="rect">
+                            <a:avLst/>
+                          </a:prstGeom>
+                        </pic:spPr>
+                      </pic:pic>
+                    </a:graphicData>
+                  </a:graphic>
+                </wp:inline>
+              </w:drawing>
+            </w:r>
+          </w:p>
+        </w:tc>
+        <w:tc>
+          <w:tcPr>
+            <w:tcW w:type="dxa" w:w="6720"/>
+            <w:vAlign w:val="top"/>
+          </w:tcPr>
+          <w:p>
+            <w:pPr>
+              <w:spacing w:after="100"/>
+            </w:pPr>
+            <w:r>
+              <w:rPr>
+                <w:b/>
+                <w:bCs/>
+                <w:color w:val="7D6E4C"/>
+                <w:spacing w:val="30"/>
+                <w:sz w:val="16"/>
+                <w:szCs w:val="16"/>
+              </w:rPr>
+              <w:t xml:space="preserve">FILE  </w:t>
+            </w:r>
+            <w:r>
+              <w:rPr>
+                <w:rFonts w:ascii="Consolas" w:cs="Consolas" w:eastAsia="Consolas" w:hAnsi="Consolas"/>
+                <w:color w:val="5A606A"/>
+                <w:sz w:val="17"/>
+                <w:szCs w:val="17"/>
+              </w:rPr>
+              <w:t xml:space="preserve">09-meet-madison.png</w:t>
+            </w:r>
+          </w:p>
+          <w:p>
+            <w:pPr>
+              <w:spacing w:after="80"/>
+            </w:pPr>
+            <w:r>
+              <w:rPr>
+                <w:b/>
+                <w:bCs/>
+                <w:color w:val="7D6E4C"/>
+                <w:spacing w:val="30"/>
+                <w:sz w:val="16"/>
+                <w:szCs w:val="16"/>
+              </w:rPr>
+              <w:t xml:space="preserve">CAPTION</w:t>
+            </w:r>
+          </w:p>
+          <w:p>
+            <w:pPr>
+              <w:spacing w:after="120"/>
+            </w:pPr>
+            <w:r>
+              <w:t xml:space="preserve">Hi, I'm Madison.</w:t>
+            </w:r>
+          </w:p>
+          <w:p>
+            <w:pPr>
+              <w:spacing w:after="120"/>
+            </w:pPr>
+            <w:r>
+              <w:t xml:space="preserve">I've been in the crypto space since 2017 and in courtrooms across Middle Tennessee as a trial attorney. I started MT Legal so clients would always know who is handling their matter: me, from the first call to the last.</w:t>
+            </w:r>
+          </w:p>
+          <w:p>
+            <w:pPr>
+              <w:spacing w:after="120"/>
+            </w:pPr>
+            <w:r>
+              <w:t xml:space="preserve">Belmont Law graduate. Adjunct professor of Business Law at Fisk University. Member of Nashville's Bitcoin community.</w:t>
+            </w:r>
+          </w:p>
+          <w:p>
+            <w:pPr>
+              <w:spacing w:after="120"/>
+            </w:pPr>
+            <w:r>
+              <w:rPr>
+                <w:color w:val="7D6E4C"/>
+              </w:rPr>
+              <w:t xml:space="preserve">#MeetTheAttorney #NashvilleLawyer #Bitcoin #CryptoLawyer #MTLegal</w:t>
+            </w:r>
+          </w:p>
+          <w:p>
+            <w:pPr>
+              <w:spacing w:after="60" w:before="80"/>
+            </w:pPr>
+            <w:r>
+              <w:rPr>
+                <w:b/>
+                <w:bCs/>
+                <w:color w:val="7D6E4C"/>
+                <w:spacing w:val="30"/>
+                <w:sz w:val="16"/>
+                <w:szCs w:val="16"/>
+              </w:rPr>
+              <w:t xml:space="preserve">ALT TEXT</w:t>
+            </w:r>
+          </w:p>
+          <w:p>
+            <w:pPr>
+              <w:spacing w:after="60"/>
+            </w:pPr>
+            <w:r>
+              <w:rPr>
+                <w:color w:val="5A606A"/>
+                <w:sz w:val="19"/>
+                <w:szCs w:val="19"/>
+              </w:rPr>
+              <w:t xml:space="preserve">Portrait of Madison T. Biggs, Esq. with the words "The lawyer you meet is the lawyer on your case."</w:t>
+            </w:r>
+          </w:p>
+        </w:tc>
+      </w:tr>
+    </w:tbl>
+    <w:p>
+      <w:pPr>
+        <w:pBdr>
+          <w:bottom w:val="single" w:color="D3CDBF" w:sz="4" w:space="8"/>
+        </w:pBdr>
+        <w:spacing w:after="240"/>
+      </w:pPr>
+    </w:p>
+    <w:p>
+      <w:pPr>
         <w:pStyle w:val="Heading1"/>
+        <w:keepNext/>
       </w:pPr>
       <w:r>
         <w:t xml:space="preserve">Stories and Reels ideas</w:t>
@@ -2330,6 +2842,7 @@
     <w:p>
       <w:pPr>
         <w:pStyle w:val="Heading1"/>
+        <w:keepNext/>
       </w:pPr>
       <w:r>
         <w:t xml:space="preserve">Before posting</w:t>

</xml_diff>

<commit_message>
refactor: restructure into services/, split portal and templates
Synced from the main repo (master 440920c) with scripts/sync_site.ps1:
- Domain logic moves into services/ (storage, accounts, gcal, documents,
  prompts, billing, conflicts, security, scheduling_orders); shared.py
  keeps only configuration, the Anthropic client and route decorators.
- portal_attorney.py is split: research routes join research.py, and
  insights, token usage and tax export become blueprints/insights.py.
- attorney_portal.html and base.html move their inline CSS/JS to static/
  files; the portal's tabs and modals become templates/attorney/ partials.
- Practice-area copy moves to content/practice_areas.toml.
- All plain JSON files share atomic read/write helpers.

URLs are unchanged and all 478 tests pass.

Co-Authored-By: Claude Opus 5.5 <noreply@anthropic.com>
</commit_message>
<xml_diff>
--- a/brand/instagram/MT-Legal-Instagram-Kit.docx
+++ b/brand/instagram/MT-Legal-Instagram-Kit.docx
@@ -1,13 +1,13 @@
 
 <file path=word/document.xml><?xml version="1.0" encoding="utf-8"?>
-<w:document xmlns:wpc="http://schemas.microsoft.com/office/word/2010/wordprocessingCanvas" xmlns:mc="http://schemas.openxmlformats.org/markup-compatibility/2006" xmlns:o="urn:schemas-microsoft-com:office:office" xmlns:r="http://schemas.openxmlformats.org/officeDocument/2006/relationships" xmlns:m="http://schemas.openxmlformats.org/officeDocument/2006/math" xmlns:v="urn:schemas-microsoft-com:vml" xmlns:wp14="http://schemas.microsoft.com/office/word/2010/wordprocessingDrawing" xmlns:wp="http://schemas.openxmlformats.org/drawingml/2006/wordprocessingDrawing" xmlns:w10="urn:schemas-microsoft-com:office:word" xmlns:w="http://schemas.openxmlformats.org/wordprocessingml/2006/main" xmlns:w14="http://schemas.microsoft.com/office/word/2010/wordml" xmlns:w15="http://schemas.microsoft.com/office/word/2012/wordml" xmlns:wpg="http://schemas.microsoft.com/office/word/2010/wordprocessingGroup" xmlns:wpi="http://schemas.microsoft.com/office/word/2010/wordprocessingInk" xmlns:wne="http://schemas.microsoft.com/office/word/2006/wordml" xmlns:wps="http://schemas.microsoft.com/office/word/2010/wordprocessingShape" xmlns:cx="http://schemas.microsoft.com/office/drawing/2014/chartex" xmlns:cx1="http://schemas.microsoft.com/office/drawing/2015/9/8/chartex" xmlns:cx2="http://schemas.microsoft.com/office/drawing/2015/10/21/chartex" xmlns:cx3="http://schemas.microsoft.com/office/drawing/2016/5/9/chartex" xmlns:cx4="http://schemas.microsoft.com/office/drawing/2016/5/10/chartex" xmlns:cx5="http://schemas.microsoft.com/office/drawing/2016/5/11/chartex" xmlns:cx6="http://schemas.microsoft.com/office/drawing/2016/5/12/chartex" xmlns:cx7="http://schemas.microsoft.com/office/drawing/2016/5/13/chartex" xmlns:cx8="http://schemas.microsoft.com/office/drawing/2016/5/14/chartex" xmlns:aink="http://schemas.microsoft.com/office/drawing/2016/ink" xmlns:am3d="http://schemas.microsoft.com/office/drawing/2017/model3d" xmlns:w16cex="http://schemas.microsoft.com/office/word/2018/wordml/cex" xmlns:w16cid="http://schemas.microsoft.com/office/word/2016/wordml/cid" xmlns:w16="http://schemas.microsoft.com/office/word/2018/wordml" xmlns:w16sdtdh="http://schemas.microsoft.com/office/word/2020/wordml/sdtdatahash" xmlns:w16se="http://schemas.microsoft.com/office/word/2015/wordml/symex" mc:Ignorable="w14 w15 wp14">
+<w:document xmlns:wpc="http://schemas.microsoft.com/office/word/2010/wordprocessingCanvas" xmlns:cx="http://schemas.microsoft.com/office/drawing/2014/chartex" xmlns:cx1="http://schemas.microsoft.com/office/drawing/2015/9/8/chartex" xmlns:cx2="http://schemas.microsoft.com/office/drawing/2015/10/21/chartex" xmlns:cx3="http://schemas.microsoft.com/office/drawing/2016/5/9/chartex" xmlns:cx4="http://schemas.microsoft.com/office/drawing/2016/5/10/chartex" xmlns:cx5="http://schemas.microsoft.com/office/drawing/2016/5/11/chartex" xmlns:cx6="http://schemas.microsoft.com/office/drawing/2016/5/12/chartex" xmlns:cx7="http://schemas.microsoft.com/office/drawing/2016/5/13/chartex" xmlns:cx8="http://schemas.microsoft.com/office/drawing/2016/5/14/chartex" xmlns:mc="http://schemas.openxmlformats.org/markup-compatibility/2006" xmlns:aink="http://schemas.microsoft.com/office/drawing/2016/ink" xmlns:am3d="http://schemas.microsoft.com/office/drawing/2017/model3d" xmlns:o="urn:schemas-microsoft-com:office:office" xmlns:oel="http://schemas.microsoft.com/office/2019/extlst" xmlns:r="http://schemas.openxmlformats.org/officeDocument/2006/relationships" xmlns:m="http://schemas.openxmlformats.org/officeDocument/2006/math" xmlns:v="urn:schemas-microsoft-com:vml" xmlns:wp14="http://schemas.microsoft.com/office/word/2010/wordprocessingDrawing" xmlns:wp="http://schemas.openxmlformats.org/drawingml/2006/wordprocessingDrawing" xmlns:w10="urn:schemas-microsoft-com:office:word" xmlns:w="http://schemas.openxmlformats.org/wordprocessingml/2006/main" xmlns:w14="http://schemas.microsoft.com/office/word/2010/wordml" xmlns:w15="http://schemas.microsoft.com/office/word/2012/wordml" xmlns:w16cex="http://schemas.microsoft.com/office/word/2018/wordml/cex" xmlns:w16cid="http://schemas.microsoft.com/office/word/2016/wordml/cid" xmlns:w16="http://schemas.microsoft.com/office/word/2018/wordml" xmlns:w16du="http://schemas.microsoft.com/office/word/2023/wordml/word16du" xmlns:w16sdtdh="http://schemas.microsoft.com/office/word/2020/wordml/sdtdatahash" xmlns:w16sdtfl="http://schemas.microsoft.com/office/word/2024/wordml/sdtformatlock" xmlns:w16se="http://schemas.microsoft.com/office/word/2015/wordml/symex" xmlns:wpg="http://schemas.microsoft.com/office/word/2010/wordprocessingGroup" xmlns:wpi="http://schemas.microsoft.com/office/word/2010/wordprocessingInk" xmlns:wne="http://schemas.microsoft.com/office/word/2006/wordml" xmlns:wps="http://schemas.microsoft.com/office/word/2010/wordprocessingShape" mc:Ignorable="w14 w15 w16se w16cid w16 w16cex w16sdtdh w16sdtfl w16du wp14">
   <w:body>
     <w:p>
       <w:pPr>
         <w:pStyle w:val="Title"/>
       </w:pPr>
       <w:r>
-        <w:t xml:space="preserve">MT Legal: Instagram launch kit</w:t>
+        <w:t>MT Legal: Instagram launch kit</w:t>
       </w:r>
     </w:p>
     <w:p>
@@ -15,27 +15,26 @@
         <w:spacing w:after="120"/>
       </w:pPr>
       <w:r>
-        <w:t xml:space="preserve">Ten posts, all 1080 x 1350 so they fill the feed: a six-slide launch carousel (00), then nine regular posts (03 is a three-slide carousel). Post the launch carousel first, then 01 through 09 in order; Instagram shows the newest at the top left, so the grid ends up looking like </w:t>
+        <w:t xml:space="preserve">Nine posts (one is a three-slide carousel), all 1080 x 1350 so they fill the feed. Post them in number order, 01 first; Instagram shows the newest at the top left, so the grid ends up looking like </w:t>
       </w:r>
       <w:r>
         <w:rPr>
-          <w:rFonts w:ascii="Consolas" w:cs="Consolas" w:eastAsia="Consolas" w:hAnsi="Consolas"/>
+          <w:rFonts w:ascii="Consolas" w:eastAsia="Consolas" w:hAnsi="Consolas" w:cs="Consolas"/>
           <w:sz w:val="19"/>
           <w:szCs w:val="19"/>
         </w:rPr>
-        <w:t xml:space="preserve">grid-preview.jpg</w:t>
-      </w:r>
-      <w:r>
-        <w:t xml:space="preserve">. Two or three posts a week is plenty.</w:t>
+        <w:t>grid-preview.jpg</w:t>
+      </w:r>
+      <w:r>
+        <w:t>. Two or three posts a week is plenty.</w:t>
       </w:r>
     </w:p>
     <w:p>
       <w:pPr>
         <w:pStyle w:val="Heading1"/>
-        <w:keepNext/>
-      </w:pPr>
-      <w:r>
-        <w:t xml:space="preserve">Profile</w:t>
+      </w:pPr>
+      <w:r>
+        <w:t>Profile</w:t>
       </w:r>
     </w:p>
     <w:p>
@@ -47,18 +46,18 @@
           <w:b/>
           <w:bCs/>
         </w:rPr>
-        <w:t xml:space="preserve">Name field:</w:t>
+        <w:t>Name field:</w:t>
       </w:r>
       <w:r>
         <w:t xml:space="preserve"> </w:t>
       </w:r>
       <w:r>
         <w:rPr>
-          <w:rFonts w:ascii="Consolas" w:cs="Consolas" w:eastAsia="Consolas" w:hAnsi="Consolas"/>
+          <w:rFonts w:ascii="Consolas" w:eastAsia="Consolas" w:hAnsi="Consolas" w:cs="Consolas"/>
           <w:sz w:val="19"/>
           <w:szCs w:val="19"/>
         </w:rPr>
-        <w:t xml:space="preserve">MT Legal | Nashville Attorney</w:t>
+        <w:t>MT Legal | Nashville Attorney</w:t>
       </w:r>
     </w:p>
     <w:p>
@@ -70,67 +69,78 @@
           <w:b/>
           <w:bCs/>
         </w:rPr>
-        <w:t xml:space="preserve">Bio (under 150 characters):</w:t>
+        <w:t>Bio (under 150 characters):</w:t>
       </w:r>
     </w:p>
     <w:tbl>
       <w:tblPr>
-        <w:tblW w:type="dxa" w:w="9360"/>
+        <w:tblW w:w="9360" w:type="dxa"/>
         <w:tblBorders>
-          <w:top w:val="none" w:color="FFFFFF" w:sz="0"/>
-          <w:left w:val="none" w:color="FFFFFF" w:sz="0"/>
-          <w:bottom w:val="none" w:color="FFFFFF" w:sz="0"/>
-          <w:right w:val="none" w:color="FFFFFF" w:sz="0"/>
-          <w:insideH w:val="none" w:color="FFFFFF" w:sz="0"/>
-          <w:insideV w:val="none" w:color="FFFFFF" w:sz="0"/>
+          <w:top w:val="none" w:sz="0" w:space="0" w:color="FFFFFF"/>
+          <w:left w:val="none" w:sz="0" w:space="0" w:color="FFFFFF"/>
+          <w:bottom w:val="none" w:sz="0" w:space="0" w:color="FFFFFF"/>
+          <w:right w:val="none" w:sz="0" w:space="0" w:color="FFFFFF"/>
+          <w:insideH w:val="none" w:sz="0" w:space="0" w:color="FFFFFF"/>
+          <w:insideV w:val="none" w:sz="0" w:space="0" w:color="FFFFFF"/>
         </w:tblBorders>
+        <w:tblCellMar>
+          <w:left w:w="10" w:type="dxa"/>
+          <w:right w:w="10" w:type="dxa"/>
+        </w:tblCellMar>
+        <w:tblLook w:val="04A0" w:firstRow="1" w:lastRow="0" w:firstColumn="1" w:lastColumn="0" w:noHBand="0" w:noVBand="1"/>
       </w:tblPr>
       <w:tblGrid>
         <w:gridCol w:w="9360"/>
       </w:tblGrid>
       <w:tr>
+        <w:tblPrEx>
+          <w:tblCellMar>
+            <w:top w:w="0" w:type="dxa"/>
+            <w:bottom w:w="0" w:type="dxa"/>
+          </w:tblCellMar>
+        </w:tblPrEx>
         <w:trPr>
           <w:cantSplit/>
         </w:trPr>
         <w:tc>
           <w:tcPr>
-            <w:tcW w:type="dxa" w:w="9360"/>
-            <w:shd w:fill="F0EBE0" w:color="auto" w:val="clear"/>
+            <w:tcW w:w="9360" w:type="dxa"/>
+            <w:shd w:val="clear" w:color="auto" w:fill="F0EBE0"/>
             <w:tcMar>
-              <w:top w:type="dxa" w:w="140"/>
-              <w:left w:type="dxa" w:w="200"/>
-              <w:bottom w:type="dxa" w:w="140"/>
-              <w:right w:type="dxa" w:w="200"/>
+              <w:top w:w="140" w:type="dxa"/>
+              <w:left w:w="200" w:type="dxa"/>
+              <w:bottom w:w="140" w:type="dxa"/>
+              <w:right w:w="200" w:type="dxa"/>
             </w:tcMar>
           </w:tcPr>
           <w:p>
             <w:r>
               <w:rPr>
-                <w:rFonts w:ascii="Consolas" w:cs="Consolas" w:eastAsia="Consolas" w:hAnsi="Consolas"/>
+                <w:rFonts w:ascii="Consolas" w:eastAsia="Consolas" w:hAnsi="Consolas" w:cs="Consolas"/>
                 <w:sz w:val="20"/>
                 <w:szCs w:val="20"/>
               </w:rPr>
-              <w:t xml:space="preserve">Client-centered counsel for DeFi, digital assets &amp; trial work.</w:t>
-            </w:r>
-          </w:p>
-          <w:p>
-            <w:r>
-              <w:rPr>
-                <w:rFonts w:ascii="Consolas" w:cs="Consolas" w:eastAsia="Consolas" w:hAnsi="Consolas"/>
+              <w:t>Client-centered counsel for DeFi, digital assets &amp; litigation.</w:t>
+            </w:r>
+          </w:p>
+          <w:p>
+            <w:r>
+              <w:rPr>
+                <w:rFonts w:ascii="Consolas" w:eastAsia="Consolas" w:hAnsi="Consolas" w:cs="Consolas"/>
                 <w:sz w:val="20"/>
                 <w:szCs w:val="20"/>
               </w:rPr>
-              <w:t xml:space="preserve">Madison T. Biggs, Esq. · Nashville, TN</w:t>
-            </w:r>
-          </w:p>
-          <w:p>
-            <w:r>
-              <w:rPr>
-                <w:rFonts w:ascii="Consolas" w:cs="Consolas" w:eastAsia="Consolas" w:hAnsi="Consolas"/>
+              <w:t>Madison T. Biggs, Esq. · Nashville, TN</w:t>
+            </w:r>
+          </w:p>
+          <w:p>
+            <w:r>
+              <w:rPr>
+                <w:rFonts w:ascii="Consolas" w:eastAsia="Consolas" w:hAnsi="Consolas" w:cs="Consolas"/>
                 <w:sz w:val="20"/>
                 <w:szCs w:val="20"/>
               </w:rPr>
-              <w:t xml:space="preserve">Attorney advertising. Not legal advice.</w:t>
+              <w:t>Attorney advertising. Not legal advice.</w:t>
             </w:r>
           </w:p>
         </w:tc>
@@ -150,18 +160,18 @@
           <w:b/>
           <w:bCs/>
         </w:rPr>
-        <w:t xml:space="preserve">Link:</w:t>
+        <w:t>Link:</w:t>
       </w:r>
       <w:r>
         <w:t xml:space="preserve"> </w:t>
       </w:r>
       <w:r>
         <w:rPr>
-          <w:rFonts w:ascii="Consolas" w:cs="Consolas" w:eastAsia="Consolas" w:hAnsi="Consolas"/>
+          <w:rFonts w:ascii="Consolas" w:eastAsia="Consolas" w:hAnsi="Consolas" w:cs="Consolas"/>
           <w:sz w:val="19"/>
           <w:szCs w:val="19"/>
         </w:rPr>
-        <w:t xml:space="preserve">https://midtennlegal.com</w:t>
+        <w:t>https://midtennlegal.com</w:t>
       </w:r>
     </w:p>
     <w:p>
@@ -173,18 +183,18 @@
           <w:b/>
           <w:bCs/>
         </w:rPr>
-        <w:t xml:space="preserve">Profile photo:</w:t>
+        <w:t>Profile photo:</w:t>
       </w:r>
       <w:r>
         <w:t xml:space="preserve"> </w:t>
       </w:r>
       <w:r>
         <w:rPr>
-          <w:rFonts w:ascii="Consolas" w:cs="Consolas" w:eastAsia="Consolas" w:hAnsi="Consolas"/>
+          <w:rFonts w:ascii="Consolas" w:eastAsia="Consolas" w:hAnsi="Consolas" w:cs="Consolas"/>
           <w:sz w:val="19"/>
           <w:szCs w:val="19"/>
         </w:rPr>
-        <w:t xml:space="preserve">brand/mt-legal-mark.png</w:t>
+        <w:t>brand/mt-legal-mark.png</w:t>
       </w:r>
       <w:r>
         <w:t xml:space="preserve"> (the MT mark with LEGAL)</w:t>
@@ -199,7 +209,7 @@
           <w:b/>
           <w:bCs/>
         </w:rPr>
-        <w:t xml:space="preserve">Category:</w:t>
+        <w:t>Category:</w:t>
       </w:r>
       <w:r>
         <w:t xml:space="preserve"> Lawyer &amp; Law Firm</w:t>
@@ -214,7 +224,7 @@
           <w:b/>
           <w:bCs/>
         </w:rPr>
-        <w:t xml:space="preserve">Contact buttons:</w:t>
+        <w:t>Contact buttons:</w:t>
       </w:r>
       <w:r>
         <w:t xml:space="preserve"> Call (615-601-0633) and Email (Mtbiggs@midtennlegal.com)</w:t>
@@ -229,7 +239,7 @@
           <w:b/>
           <w:bCs/>
         </w:rPr>
-        <w:t xml:space="preserve">Highlights to set up later:</w:t>
+        <w:t>Highlights to set up later:</w:t>
       </w:r>
       <w:r>
         <w:t xml:space="preserve"> About, DeFi, Estate, Know Your Rights, FAQ</w:t>
@@ -241,556 +251,59 @@
         <w:keepNext/>
       </w:pPr>
       <w:r>
-        <w:t xml:space="preserve">00 · Launch carousel: Introducing MT Legal</w:t>
+        <w:t>01 · Counsel for what comes next</w:t>
       </w:r>
     </w:p>
     <w:tbl>
       <w:tblPr>
-        <w:tblW w:type="dxa" w:w="9360"/>
+        <w:tblW w:w="9360" w:type="dxa"/>
         <w:tblBorders>
-          <w:top w:val="none" w:color="FFFFFF" w:sz="0"/>
-          <w:left w:val="none" w:color="FFFFFF" w:sz="0"/>
-          <w:bottom w:val="none" w:color="FFFFFF" w:sz="0"/>
-          <w:right w:val="none" w:color="FFFFFF" w:sz="0"/>
-          <w:insideH w:val="none" w:color="FFFFFF" w:sz="0"/>
-          <w:insideV w:val="none" w:color="FFFFFF" w:sz="0"/>
+          <w:top w:val="none" w:sz="0" w:space="0" w:color="FFFFFF"/>
+          <w:left w:val="none" w:sz="0" w:space="0" w:color="FFFFFF"/>
+          <w:bottom w:val="none" w:sz="0" w:space="0" w:color="FFFFFF"/>
+          <w:right w:val="none" w:sz="0" w:space="0" w:color="FFFFFF"/>
+          <w:insideH w:val="none" w:sz="0" w:space="0" w:color="FFFFFF"/>
+          <w:insideV w:val="none" w:sz="0" w:space="0" w:color="FFFFFF"/>
         </w:tblBorders>
+        <w:tblCellMar>
+          <w:left w:w="10" w:type="dxa"/>
+          <w:right w:w="10" w:type="dxa"/>
+        </w:tblCellMar>
+        <w:tblLook w:val="04A0" w:firstRow="1" w:lastRow="0" w:firstColumn="1" w:lastColumn="0" w:noHBand="0" w:noVBand="1"/>
       </w:tblPr>
       <w:tblGrid>
         <w:gridCol w:w="2640"/>
         <w:gridCol w:w="6720"/>
       </w:tblGrid>
       <w:tr>
+        <w:tblPrEx>
+          <w:tblCellMar>
+            <w:top w:w="0" w:type="dxa"/>
+            <w:bottom w:w="0" w:type="dxa"/>
+          </w:tblCellMar>
+        </w:tblPrEx>
         <w:trPr>
           <w:cantSplit/>
         </w:trPr>
         <w:tc>
           <w:tcPr>
-            <w:tcW w:type="dxa" w:w="2640"/>
+            <w:tcW w:w="2640" w:type="dxa"/>
             <w:tcMar>
-              <w:right w:type="dxa" w:w="240"/>
+              <w:right w:w="240" w:type="dxa"/>
             </w:tcMar>
-            <w:vAlign w:val="top"/>
           </w:tcPr>
           <w:p>
             <w:pPr>
               <w:spacing w:after="100"/>
             </w:pPr>
             <w:r>
+              <w:rPr>
+                <w:noProof/>
+              </w:rPr>
               <w:drawing>
-                <wp:inline distT="0" distB="0" distL="0" distR="0">
-                  <wp:extent cx="685800" cy="857250"/>
-                  <wp:effectExtent t="0" r="0" b="0" l="0"/>
-                  <wp:docPr id="1" name="00a-launch-cover.png" descr="Alt text (cover): Nashville skyline in black and white with the words &quot;Introducing MT Legal.&quot;" title="00a-launch-cover.png"/>
-                  <wp:cNvGraphicFramePr>
-                    <a:graphicFrameLocks xmlns:a="http://schemas.openxmlformats.org/drawingml/2006/main" noChangeAspect="1"/>
-                  </wp:cNvGraphicFramePr>
-                  <a:graphic xmlns:a="http://schemas.openxmlformats.org/drawingml/2006/main">
-                    <a:graphicData uri="http://schemas.openxmlformats.org/drawingml/2006/picture">
-                      <pic:pic xmlns:pic="http://schemas.openxmlformats.org/drawingml/2006/picture">
-                        <pic:nvPicPr>
-                          <pic:cNvPr id="0" name="" descr=""/>
-                          <pic:cNvPicPr>
-                            <a:picLocks noChangeAspect="1" noChangeArrowheads="1"/>
-                          </pic:cNvPicPr>
-                        </pic:nvPicPr>
-                        <pic:blipFill>
-                          <a:blip r:embed="rId8" cstate="none"/>
-                          <a:srcRect/>
-                          <a:stretch>
-                            <a:fillRect/>
-                          </a:stretch>
-                        </pic:blipFill>
-                        <pic:spPr bwMode="auto">
-                          <a:xfrm>
-                            <a:off x="0" y="0"/>
-                            <a:ext cx="685800" cy="857250"/>
-                          </a:xfrm>
-                          <a:prstGeom prst="rect">
-                            <a:avLst/>
-                          </a:prstGeom>
-                        </pic:spPr>
-                      </pic:pic>
-                    </a:graphicData>
-                  </a:graphic>
-                </wp:inline>
-              </w:drawing>
-            </w:r>
-          </w:p>
-          <w:p>
-            <w:pPr>
-              <w:spacing w:after="100"/>
-            </w:pPr>
-            <w:r>
-              <w:drawing>
-                <wp:inline distT="0" distB="0" distL="0" distR="0">
-                  <wp:extent cx="685800" cy="857250"/>
-                  <wp:effectExtent t="0" r="0" b="0" l="0"/>
-                  <wp:docPr id="1" name="00b-launch-who-we-are.png" descr="Alt text (slide 2): &quot;Every case begins the same way. One person, one matter, and a bigger power on the other side.&quot;" title="00b-launch-who-we-are.png"/>
-                  <wp:cNvGraphicFramePr>
-                    <a:graphicFrameLocks xmlns:a="http://schemas.openxmlformats.org/drawingml/2006/main" noChangeAspect="1"/>
-                  </wp:cNvGraphicFramePr>
-                  <a:graphic xmlns:a="http://schemas.openxmlformats.org/drawingml/2006/main">
-                    <a:graphicData uri="http://schemas.openxmlformats.org/drawingml/2006/picture">
-                      <pic:pic xmlns:pic="http://schemas.openxmlformats.org/drawingml/2006/picture">
-                        <pic:nvPicPr>
-                          <pic:cNvPr id="0" name="" descr=""/>
-                          <pic:cNvPicPr>
-                            <a:picLocks noChangeAspect="1" noChangeArrowheads="1"/>
-                          </pic:cNvPicPr>
-                        </pic:nvPicPr>
-                        <pic:blipFill>
-                          <a:blip r:embed="rId9" cstate="none"/>
-                          <a:srcRect/>
-                          <a:stretch>
-                            <a:fillRect/>
-                          </a:stretch>
-                        </pic:blipFill>
-                        <pic:spPr bwMode="auto">
-                          <a:xfrm>
-                            <a:off x="0" y="0"/>
-                            <a:ext cx="685800" cy="857250"/>
-                          </a:xfrm>
-                          <a:prstGeom prst="rect">
-                            <a:avLst/>
-                          </a:prstGeom>
-                        </pic:spPr>
-                      </pic:pic>
-                    </a:graphicData>
-                  </a:graphic>
-                </wp:inline>
-              </w:drawing>
-            </w:r>
-          </w:p>
-          <w:p>
-            <w:pPr>
-              <w:spacing w:after="100"/>
-            </w:pPr>
-            <w:r>
-              <w:drawing>
-                <wp:inline distT="0" distB="0" distL="0" distR="0">
-                  <wp:extent cx="685800" cy="857250"/>
-                  <wp:effectExtent t="0" r="0" b="0" l="0"/>
-                  <wp:docPr id="1" name="00c-launch-approach.png" descr="Alt text (slide 3): &quot;Client-centered, start to finish.&quot;" title="00c-launch-approach.png"/>
-                  <wp:cNvGraphicFramePr>
-                    <a:graphicFrameLocks xmlns:a="http://schemas.openxmlformats.org/drawingml/2006/main" noChangeAspect="1"/>
-                  </wp:cNvGraphicFramePr>
-                  <a:graphic xmlns:a="http://schemas.openxmlformats.org/drawingml/2006/main">
-                    <a:graphicData uri="http://schemas.openxmlformats.org/drawingml/2006/picture">
-                      <pic:pic xmlns:pic="http://schemas.openxmlformats.org/drawingml/2006/picture">
-                        <pic:nvPicPr>
-                          <pic:cNvPr id="0" name="" descr=""/>
-                          <pic:cNvPicPr>
-                            <a:picLocks noChangeAspect="1" noChangeArrowheads="1"/>
-                          </pic:cNvPicPr>
-                        </pic:nvPicPr>
-                        <pic:blipFill>
-                          <a:blip r:embed="rId10" cstate="none"/>
-                          <a:srcRect/>
-                          <a:stretch>
-                            <a:fillRect/>
-                          </a:stretch>
-                        </pic:blipFill>
-                        <pic:spPr bwMode="auto">
-                          <a:xfrm>
-                            <a:off x="0" y="0"/>
-                            <a:ext cx="685800" cy="857250"/>
-                          </a:xfrm>
-                          <a:prstGeom prst="rect">
-                            <a:avLst/>
-                          </a:prstGeom>
-                        </pic:spPr>
-                      </pic:pic>
-                    </a:graphicData>
-                  </a:graphic>
-                </wp:inline>
-              </w:drawing>
-            </w:r>
-          </w:p>
-          <w:p>
-            <w:pPr>
-              <w:spacing w:after="100"/>
-            </w:pPr>
-            <w:r>
-              <w:drawing>
-                <wp:inline distT="0" distB="0" distL="0" distR="0">
-                  <wp:extent cx="685800" cy="857250"/>
-                  <wp:effectExtent t="0" r="0" b="0" l="0"/>
-                  <wp:docPr id="1" name="00d-launch-practice-areas.png" descr="Alt text (slide 4): List of practice areas, from Digital Asset Structuring to Personal Injury &amp; Liabilities." title="00d-launch-practice-areas.png"/>
-                  <wp:cNvGraphicFramePr>
-                    <a:graphicFrameLocks xmlns:a="http://schemas.openxmlformats.org/drawingml/2006/main" noChangeAspect="1"/>
-                  </wp:cNvGraphicFramePr>
-                  <a:graphic xmlns:a="http://schemas.openxmlformats.org/drawingml/2006/main">
-                    <a:graphicData uri="http://schemas.openxmlformats.org/drawingml/2006/picture">
-                      <pic:pic xmlns:pic="http://schemas.openxmlformats.org/drawingml/2006/picture">
-                        <pic:nvPicPr>
-                          <pic:cNvPr id="0" name="" descr=""/>
-                          <pic:cNvPicPr>
-                            <a:picLocks noChangeAspect="1" noChangeArrowheads="1"/>
-                          </pic:cNvPicPr>
-                        </pic:nvPicPr>
-                        <pic:blipFill>
-                          <a:blip r:embed="rId11" cstate="none"/>
-                          <a:srcRect/>
-                          <a:stretch>
-                            <a:fillRect/>
-                          </a:stretch>
-                        </pic:blipFill>
-                        <pic:spPr bwMode="auto">
-                          <a:xfrm>
-                            <a:off x="0" y="0"/>
-                            <a:ext cx="685800" cy="857250"/>
-                          </a:xfrm>
-                          <a:prstGeom prst="rect">
-                            <a:avLst/>
-                          </a:prstGeom>
-                        </pic:spPr>
-                      </pic:pic>
-                    </a:graphicData>
-                  </a:graphic>
-                </wp:inline>
-              </w:drawing>
-            </w:r>
-          </w:p>
-          <w:p>
-            <w:pPr>
-              <w:spacing w:after="100"/>
-            </w:pPr>
-            <w:r>
-              <w:drawing>
-                <wp:inline distT="0" distB="0" distL="0" distR="0">
-                  <wp:extent cx="685800" cy="857250"/>
-                  <wp:effectExtent t="0" r="0" b="0" l="0"/>
-                  <wp:docPr id="1" name="00e-launch-meet-madison.png" descr="Alt text (slide 5): Portrait of Madison T. Biggs, Esq., trial attorney, with the words &quot;The lawyer you meet is the lawyer on your case.&quot;" title="00e-launch-meet-madison.png"/>
-                  <wp:cNvGraphicFramePr>
-                    <a:graphicFrameLocks xmlns:a="http://schemas.openxmlformats.org/drawingml/2006/main" noChangeAspect="1"/>
-                  </wp:cNvGraphicFramePr>
-                  <a:graphic xmlns:a="http://schemas.openxmlformats.org/drawingml/2006/main">
-                    <a:graphicData uri="http://schemas.openxmlformats.org/drawingml/2006/picture">
-                      <pic:pic xmlns:pic="http://schemas.openxmlformats.org/drawingml/2006/picture">
-                        <pic:nvPicPr>
-                          <pic:cNvPr id="0" name="" descr=""/>
-                          <pic:cNvPicPr>
-                            <a:picLocks noChangeAspect="1" noChangeArrowheads="1"/>
-                          </pic:cNvPicPr>
-                        </pic:nvPicPr>
-                        <pic:blipFill>
-                          <a:blip r:embed="rId12" cstate="none"/>
-                          <a:srcRect/>
-                          <a:stretch>
-                            <a:fillRect/>
-                          </a:stretch>
-                        </pic:blipFill>
-                        <pic:spPr bwMode="auto">
-                          <a:xfrm>
-                            <a:off x="0" y="0"/>
-                            <a:ext cx="685800" cy="857250"/>
-                          </a:xfrm>
-                          <a:prstGeom prst="rect">
-                            <a:avLst/>
-                          </a:prstGeom>
-                        </pic:spPr>
-                      </pic:pic>
-                    </a:graphicData>
-                  </a:graphic>
-                </wp:inline>
-              </w:drawing>
-            </w:r>
-          </w:p>
-          <w:p>
-            <w:pPr>
-              <w:spacing w:after="100"/>
-            </w:pPr>
-            <w:r>
-              <w:drawing>
-                <wp:inline distT="0" distB="0" distL="0" distR="0">
-                  <wp:extent cx="685800" cy="857250"/>
-                  <wp:effectExtent t="0" r="0" b="0" l="0"/>
-                  <wp:docPr id="1" name="00f-launch-get-started.png" descr="Alt text (slide 6): &quot;Start with a brief call, at no cost,&quot; with the website, phone number, and a QR code." title="00f-launch-get-started.png"/>
-                  <wp:cNvGraphicFramePr>
-                    <a:graphicFrameLocks xmlns:a="http://schemas.openxmlformats.org/drawingml/2006/main" noChangeAspect="1"/>
-                  </wp:cNvGraphicFramePr>
-                  <a:graphic xmlns:a="http://schemas.openxmlformats.org/drawingml/2006/main">
-                    <a:graphicData uri="http://schemas.openxmlformats.org/drawingml/2006/picture">
-                      <pic:pic xmlns:pic="http://schemas.openxmlformats.org/drawingml/2006/picture">
-                        <pic:nvPicPr>
-                          <pic:cNvPr id="0" name="" descr=""/>
-                          <pic:cNvPicPr>
-                            <a:picLocks noChangeAspect="1" noChangeArrowheads="1"/>
-                          </pic:cNvPicPr>
-                        </pic:nvPicPr>
-                        <pic:blipFill>
-                          <a:blip r:embed="rId13" cstate="none"/>
-                          <a:srcRect/>
-                          <a:stretch>
-                            <a:fillRect/>
-                          </a:stretch>
-                        </pic:blipFill>
-                        <pic:spPr bwMode="auto">
-                          <a:xfrm>
-                            <a:off x="0" y="0"/>
-                            <a:ext cx="685800" cy="857250"/>
-                          </a:xfrm>
-                          <a:prstGeom prst="rect">
-                            <a:avLst/>
-                          </a:prstGeom>
-                        </pic:spPr>
-                      </pic:pic>
-                    </a:graphicData>
-                  </a:graphic>
-                </wp:inline>
-              </w:drawing>
-            </w:r>
-          </w:p>
-        </w:tc>
-        <w:tc>
-          <w:tcPr>
-            <w:tcW w:type="dxa" w:w="6720"/>
-            <w:vAlign w:val="top"/>
-          </w:tcPr>
-          <w:p>
-            <w:pPr>
-              <w:spacing w:after="100"/>
-            </w:pPr>
-            <w:r>
-              <w:rPr>
-                <w:b/>
-                <w:bCs/>
-                <w:color w:val="7D6E4C"/>
-                <w:spacing w:val="30"/>
-                <w:sz w:val="16"/>
-                <w:szCs w:val="16"/>
-              </w:rPr>
-              <w:t xml:space="preserve">FILE  </w:t>
-            </w:r>
-            <w:r>
-              <w:rPr>
-                <w:rFonts w:ascii="Consolas" w:cs="Consolas" w:eastAsia="Consolas" w:hAnsi="Consolas"/>
-                <w:color w:val="5A606A"/>
-                <w:sz w:val="17"/>
-                <w:szCs w:val="17"/>
-              </w:rPr>
-              <w:t xml:space="preserve">00a-launch-cover.png, 00b-launch-who-we-are.png, 00c-launch-approach.png, 00d-launch-practice-areas.png, 00e-launch-meet-madison.png, 00f-launch-get-started.png</w:t>
-            </w:r>
-          </w:p>
-          <w:p>
-            <w:pPr>
-              <w:spacing w:after="80"/>
-            </w:pPr>
-            <w:r>
-              <w:rPr>
-                <w:b/>
-                <w:bCs/>
-                <w:color w:val="7D6E4C"/>
-                <w:spacing w:val="30"/>
-                <w:sz w:val="16"/>
-                <w:szCs w:val="16"/>
-              </w:rPr>
-              <w:t xml:space="preserve">CAPTION</w:t>
-            </w:r>
-          </w:p>
-          <w:p>
-            <w:pPr>
-              <w:spacing w:after="120"/>
-            </w:pPr>
-            <w:r>
-              <w:t xml:space="preserve">MT Legal is open in Nashville.</w:t>
-            </w:r>
-          </w:p>
-          <w:p>
-            <w:pPr>
-              <w:spacing w:after="120"/>
-            </w:pPr>
-            <w:r>
-              <w:t xml:space="preserve">Every case begins the same way: one person, one matter, and a bigger power on the other side. How it ends depends on who stands beside you. I built this firm to be that person: someone who listens first, speaks plainly, and stays with you from the first call to the final appearance.</w:t>
-            </w:r>
-          </w:p>
-          <w:p>
-            <w:pPr>
-              <w:spacing w:after="120"/>
-            </w:pPr>
-            <w:r>
-              <w:t xml:space="preserve">Dedicated support for DeFi and digital assets, alongside criminal defense, civil rights, estate and family planning, and personal injury. Swipe to see how we can help, then start with a brief call at no cost.</w:t>
-            </w:r>
-          </w:p>
-          <w:p>
-            <w:pPr>
-              <w:spacing w:after="120"/>
-            </w:pPr>
-            <w:r>
-              <w:t xml:space="preserve">Link in bio, or scan the code on the last slide.</w:t>
-            </w:r>
-          </w:p>
-          <w:p>
-            <w:pPr>
-              <w:spacing w:after="120"/>
-            </w:pPr>
-            <w:r>
-              <w:rPr>
-                <w:color w:val="7D6E4C"/>
-              </w:rPr>
-              <w:t xml:space="preserve">#NashvilleLawyer #MTLegal #MiddleTennessee #DeFi #DigitalAssets #CriminalDefense</w:t>
-            </w:r>
-          </w:p>
-          <w:p>
-            <w:pPr>
-              <w:spacing w:after="120"/>
-            </w:pPr>
-            <w:r>
-              <w:t xml:space="preserve">Attorney advertising.</w:t>
-            </w:r>
-          </w:p>
-          <w:p>
-            <w:pPr>
-              <w:spacing w:after="60" w:before="80"/>
-            </w:pPr>
-            <w:r>
-              <w:rPr>
-                <w:b/>
-                <w:bCs/>
-                <w:color w:val="7D6E4C"/>
-                <w:spacing w:val="30"/>
-                <w:sz w:val="16"/>
-                <w:szCs w:val="16"/>
-              </w:rPr>
-              <w:t xml:space="preserve">ALT TEXT</w:t>
-            </w:r>
-          </w:p>
-          <w:p>
-            <w:pPr>
-              <w:spacing w:after="60"/>
-            </w:pPr>
-            <w:r>
-              <w:rPr>
-                <w:color w:val="5A606A"/>
-                <w:sz w:val="19"/>
-                <w:szCs w:val="19"/>
-              </w:rPr>
-              <w:t xml:space="preserve">Cover: Nashville skyline in black and white with the words "Introducing MT Legal."</w:t>
-            </w:r>
-          </w:p>
-          <w:p>
-            <w:pPr>
-              <w:spacing w:after="60"/>
-            </w:pPr>
-            <w:r>
-              <w:rPr>
-                <w:color w:val="5A606A"/>
-                <w:sz w:val="19"/>
-                <w:szCs w:val="19"/>
-              </w:rPr>
-              <w:t xml:space="preserve">Slide 2: "Every case begins the same way. One person, one matter, and a bigger power on the other side."</w:t>
-            </w:r>
-          </w:p>
-          <w:p>
-            <w:pPr>
-              <w:spacing w:after="60"/>
-            </w:pPr>
-            <w:r>
-              <w:rPr>
-                <w:color w:val="5A606A"/>
-                <w:sz w:val="19"/>
-                <w:szCs w:val="19"/>
-              </w:rPr>
-              <w:t xml:space="preserve">Slide 3: "Client-centered, start to finish."</w:t>
-            </w:r>
-          </w:p>
-          <w:p>
-            <w:pPr>
-              <w:spacing w:after="60"/>
-            </w:pPr>
-            <w:r>
-              <w:rPr>
-                <w:color w:val="5A606A"/>
-                <w:sz w:val="19"/>
-                <w:szCs w:val="19"/>
-              </w:rPr>
-              <w:t xml:space="preserve">Slide 4: List of practice areas, from Digital Asset Structuring to Personal Injury &amp; Liabilities.</w:t>
-            </w:r>
-          </w:p>
-          <w:p>
-            <w:pPr>
-              <w:spacing w:after="60"/>
-            </w:pPr>
-            <w:r>
-              <w:rPr>
-                <w:color w:val="5A606A"/>
-                <w:sz w:val="19"/>
-                <w:szCs w:val="19"/>
-              </w:rPr>
-              <w:t xml:space="preserve">Slide 5: Portrait of Madison T. Biggs, Esq., trial attorney, with the words "The lawyer you meet is the lawyer on your case."</w:t>
-            </w:r>
-          </w:p>
-          <w:p>
-            <w:pPr>
-              <w:spacing w:after="60"/>
-            </w:pPr>
-            <w:r>
-              <w:rPr>
-                <w:color w:val="5A606A"/>
-                <w:sz w:val="19"/>
-                <w:szCs w:val="19"/>
-              </w:rPr>
-              <w:t xml:space="preserve">Slide 6: "Start with a brief call, at no cost," with the website, phone number, and a QR code.</w:t>
-            </w:r>
-          </w:p>
-        </w:tc>
-      </w:tr>
-    </w:tbl>
-    <w:p>
-      <w:pPr>
-        <w:pBdr>
-          <w:bottom w:val="single" w:color="D3CDBF" w:sz="4" w:space="8"/>
-        </w:pBdr>
-        <w:spacing w:after="240"/>
-      </w:pPr>
-    </w:p>
-    <w:p>
-      <w:pPr>
-        <w:pStyle w:val="Heading2"/>
-        <w:keepNext/>
-      </w:pPr>
-      <w:r>
-        <w:t xml:space="preserve">01 · Counsel for what comes next</w:t>
-      </w:r>
-    </w:p>
-    <w:tbl>
-      <w:tblPr>
-        <w:tblW w:type="dxa" w:w="9360"/>
-        <w:tblBorders>
-          <w:top w:val="none" w:color="FFFFFF" w:sz="0"/>
-          <w:left w:val="none" w:color="FFFFFF" w:sz="0"/>
-          <w:bottom w:val="none" w:color="FFFFFF" w:sz="0"/>
-          <w:right w:val="none" w:color="FFFFFF" w:sz="0"/>
-          <w:insideH w:val="none" w:color="FFFFFF" w:sz="0"/>
-          <w:insideV w:val="none" w:color="FFFFFF" w:sz="0"/>
-        </w:tblBorders>
-      </w:tblPr>
-      <w:tblGrid>
-        <w:gridCol w:w="2640"/>
-        <w:gridCol w:w="6720"/>
-      </w:tblGrid>
-      <w:tr>
-        <w:trPr>
-          <w:cantSplit/>
-        </w:trPr>
-        <w:tc>
-          <w:tcPr>
-            <w:tcW w:type="dxa" w:w="2640"/>
-            <w:tcMar>
-              <w:right w:type="dxa" w:w="240"/>
-            </w:tcMar>
-            <w:vAlign w:val="top"/>
-          </w:tcPr>
-          <w:p>
-            <w:pPr>
-              <w:spacing w:after="100"/>
-            </w:pPr>
-            <w:r>
-              <w:drawing>
-                <wp:inline distT="0" distB="0" distL="0" distR="0">
+                <wp:inline distT="0" distB="0" distL="0" distR="0" wp14:anchorId="419371C7" wp14:editId="419371C8">
                   <wp:extent cx="1428750" cy="1790700"/>
-                  <wp:effectExtent t="0" r="0" b="0" l="0"/>
+                  <wp:effectExtent l="0" t="0" r="0" b="0"/>
                   <wp:docPr id="1" name="01-counsel-for-what-comes-next.png" descr="Alt text: Nashville skyline in black and white with the words &quot;Counsel for what comes next.&quot;" title="01-counsel-for-what-comes-next.png"/>
                   <wp:cNvGraphicFramePr>
                     <a:graphicFrameLocks xmlns:a="http://schemas.openxmlformats.org/drawingml/2006/main" noChangeAspect="1"/>
@@ -799,13 +312,13 @@
                     <a:graphicData uri="http://schemas.openxmlformats.org/drawingml/2006/picture">
                       <pic:pic xmlns:pic="http://schemas.openxmlformats.org/drawingml/2006/picture">
                         <pic:nvPicPr>
-                          <pic:cNvPr id="0" name="" descr=""/>
+                          <pic:cNvPr id="0" name=""/>
                           <pic:cNvPicPr>
                             <a:picLocks noChangeAspect="1" noChangeArrowheads="1"/>
                           </pic:cNvPicPr>
                         </pic:nvPicPr>
                         <pic:blipFill>
-                          <a:blip r:embed="rId14" cstate="none"/>
+                          <a:blip r:embed="rId7"/>
                           <a:srcRect/>
                           <a:stretch>
                             <a:fillRect/>
@@ -830,13 +343,13 @@
         </w:tc>
         <w:tc>
           <w:tcPr>
-            <w:tcW w:type="dxa" w:w="6720"/>
-            <w:vAlign w:val="top"/>
+            <w:tcW w:w="6720" w:type="dxa"/>
           </w:tcPr>
           <w:p>
             <w:pPr>
               <w:spacing w:after="100"/>
             </w:pPr>
+            <w:proofErr w:type="gramStart"/>
             <w:r>
               <w:rPr>
                 <w:b/>
@@ -850,13 +363,14 @@
             </w:r>
             <w:r>
               <w:rPr>
-                <w:rFonts w:ascii="Consolas" w:cs="Consolas" w:eastAsia="Consolas" w:hAnsi="Consolas"/>
+                <w:rFonts w:ascii="Consolas" w:eastAsia="Consolas" w:hAnsi="Consolas" w:cs="Consolas"/>
                 <w:color w:val="5A606A"/>
                 <w:sz w:val="17"/>
                 <w:szCs w:val="17"/>
               </w:rPr>
-              <w:t xml:space="preserve">01-counsel-for-what-comes-next.png</w:t>
-            </w:r>
+              <w:t>01-counsel-for-what-comes-next.png</w:t>
+            </w:r>
+            <w:proofErr w:type="gramEnd"/>
           </w:p>
           <w:p>
             <w:pPr>
@@ -871,7 +385,7 @@
                 <w:sz w:val="16"/>
                 <w:szCs w:val="16"/>
               </w:rPr>
-              <w:t xml:space="preserve">CAPTION</w:t>
+              <w:t>CAPTION</w:t>
             </w:r>
           </w:p>
           <w:p>
@@ -879,7 +393,7 @@
               <w:spacing w:after="120"/>
             </w:pPr>
             <w:r>
-              <w:t xml:space="preserve">Every matter we take starts the same way: one person on one side, and a far bigger power on the other.</w:t>
+              <w:t>Every matter we take starts the same way: one person on one side, and a far bigger power on the other.</w:t>
             </w:r>
           </w:p>
           <w:p>
@@ -887,7 +401,7 @@
               <w:spacing w:after="120"/>
             </w:pPr>
             <w:r>
-              <w:t xml:space="preserve">MT Legal is a client-centered Nashville firm with dedicated support for DeFi and digital assets, plus traditional practice from criminal defense to estate planning. Whether you face the state in court or the banks, exchanges, and gatekeepers that control money and property, you work directly with your attorney.</w:t>
+              <w:t>MT Legal is a client-centered Nashville firm with dedicated support for DeFi and digital assets, plus traditional practice from criminal defense to estate planning. Whether you face the state in court or the banks, exchanges, and gatekeepers that control money and property, you work directly with your attorney.</w:t>
             </w:r>
           </w:p>
           <w:p>
@@ -895,7 +409,7 @@
               <w:spacing w:after="120"/>
             </w:pPr>
             <w:r>
-              <w:t xml:space="preserve">Start with a brief call at no cost. Link in bio.</w:t>
+              <w:t>Start with a brief call at no cost. Link in bio.</w:t>
             </w:r>
           </w:p>
           <w:p>
@@ -906,12 +420,12 @@
               <w:rPr>
                 <w:color w:val="7D6E4C"/>
               </w:rPr>
-              <w:t xml:space="preserve">#NashvilleLawyer #MiddleTennessee #DeFi #DigitalAssets #NashvilleTN</w:t>
-            </w:r>
-          </w:p>
-          <w:p>
-            <w:pPr>
-              <w:spacing w:after="60" w:before="80"/>
+              <w:t>#NashvilleLawyer #MiddleTennessee #DeFi #DigitalAssets #NashvilleTN</w:t>
+            </w:r>
+          </w:p>
+          <w:p>
+            <w:pPr>
+              <w:spacing w:before="80" w:after="60"/>
             </w:pPr>
             <w:r>
               <w:rPr>
@@ -922,7 +436,7 @@
                 <w:sz w:val="16"/>
                 <w:szCs w:val="16"/>
               </w:rPr>
-              <w:t xml:space="preserve">ALT TEXT</w:t>
+              <w:t>ALT TEXT</w:t>
             </w:r>
           </w:p>
           <w:p>
@@ -935,7 +449,7 @@
                 <w:sz w:val="19"/>
                 <w:szCs w:val="19"/>
               </w:rPr>
-              <w:t xml:space="preserve">Nashville skyline in black and white with the words "Counsel for what comes next."</w:t>
+              <w:t>Nashville skyline in black and white with the words "Counsel for what comes next."</w:t>
             </w:r>
           </w:p>
         </w:tc>
@@ -944,7 +458,7 @@
     <w:p>
       <w:pPr>
         <w:pBdr>
-          <w:bottom w:val="single" w:color="D3CDBF" w:sz="4" w:space="8"/>
+          <w:bottom w:val="single" w:sz="4" w:space="8" w:color="D3CDBF"/>
         </w:pBdr>
         <w:spacing w:after="240"/>
       </w:pPr>
@@ -955,47 +469,61 @@
         <w:keepNext/>
       </w:pPr>
       <w:r>
-        <w:t xml:space="preserve">02 · Our principle</w:t>
+        <w:lastRenderedPageBreak/>
+        <w:t>02 · Our principle</w:t>
       </w:r>
     </w:p>
     <w:tbl>
       <w:tblPr>
-        <w:tblW w:type="dxa" w:w="9360"/>
+        <w:tblW w:w="9360" w:type="dxa"/>
         <w:tblBorders>
-          <w:top w:val="none" w:color="FFFFFF" w:sz="0"/>
-          <w:left w:val="none" w:color="FFFFFF" w:sz="0"/>
-          <w:bottom w:val="none" w:color="FFFFFF" w:sz="0"/>
-          <w:right w:val="none" w:color="FFFFFF" w:sz="0"/>
-          <w:insideH w:val="none" w:color="FFFFFF" w:sz="0"/>
-          <w:insideV w:val="none" w:color="FFFFFF" w:sz="0"/>
+          <w:top w:val="none" w:sz="0" w:space="0" w:color="FFFFFF"/>
+          <w:left w:val="none" w:sz="0" w:space="0" w:color="FFFFFF"/>
+          <w:bottom w:val="none" w:sz="0" w:space="0" w:color="FFFFFF"/>
+          <w:right w:val="none" w:sz="0" w:space="0" w:color="FFFFFF"/>
+          <w:insideH w:val="none" w:sz="0" w:space="0" w:color="FFFFFF"/>
+          <w:insideV w:val="none" w:sz="0" w:space="0" w:color="FFFFFF"/>
         </w:tblBorders>
+        <w:tblCellMar>
+          <w:left w:w="10" w:type="dxa"/>
+          <w:right w:w="10" w:type="dxa"/>
+        </w:tblCellMar>
+        <w:tblLook w:val="04A0" w:firstRow="1" w:lastRow="0" w:firstColumn="1" w:lastColumn="0" w:noHBand="0" w:noVBand="1"/>
       </w:tblPr>
       <w:tblGrid>
         <w:gridCol w:w="2640"/>
         <w:gridCol w:w="6720"/>
       </w:tblGrid>
       <w:tr>
+        <w:tblPrEx>
+          <w:tblCellMar>
+            <w:top w:w="0" w:type="dxa"/>
+            <w:bottom w:w="0" w:type="dxa"/>
+          </w:tblCellMar>
+        </w:tblPrEx>
         <w:trPr>
           <w:cantSplit/>
         </w:trPr>
         <w:tc>
           <w:tcPr>
-            <w:tcW w:type="dxa" w:w="2640"/>
+            <w:tcW w:w="2640" w:type="dxa"/>
             <w:tcMar>
-              <w:right w:type="dxa" w:w="240"/>
+              <w:right w:w="240" w:type="dxa"/>
             </w:tcMar>
-            <w:vAlign w:val="top"/>
           </w:tcPr>
           <w:p>
             <w:pPr>
               <w:spacing w:after="100"/>
             </w:pPr>
             <w:r>
+              <w:rPr>
+                <w:noProof/>
+              </w:rPr>
               <w:drawing>
-                <wp:inline distT="0" distB="0" distL="0" distR="0">
+                <wp:inline distT="0" distB="0" distL="0" distR="0" wp14:anchorId="419371C9" wp14:editId="419371CA">
                   <wp:extent cx="1428750" cy="1790700"/>
-                  <wp:effectExtent t="0" r="0" b="0" l="0"/>
-                  <wp:docPr id="1" name="02-worth-quote.png" descr="Alt text: Quote reading &quot;A person's worth cannot be measured by their wealth, and neither should the quality of their counsel,&quot; attributed to Madison T. Biggs, Esq." title="02-worth-quote.png"/>
+                  <wp:effectExtent l="0" t="0" r="0" b="0"/>
+                  <wp:docPr id="52241285" name="02-worth-quote.png" descr="Alt text: Quote reading &quot;A person's worth cannot be measured by their wealth, and neither should the quality of their counsel,&quot; attributed to Madison T. Biggs, Esq." title="02-worth-quote.png"/>
                   <wp:cNvGraphicFramePr>
                     <a:graphicFrameLocks xmlns:a="http://schemas.openxmlformats.org/drawingml/2006/main" noChangeAspect="1"/>
                   </wp:cNvGraphicFramePr>
@@ -1003,13 +531,13 @@
                     <a:graphicData uri="http://schemas.openxmlformats.org/drawingml/2006/picture">
                       <pic:pic xmlns:pic="http://schemas.openxmlformats.org/drawingml/2006/picture">
                         <pic:nvPicPr>
-                          <pic:cNvPr id="0" name="" descr=""/>
+                          <pic:cNvPr id="0" name=""/>
                           <pic:cNvPicPr>
                             <a:picLocks noChangeAspect="1" noChangeArrowheads="1"/>
                           </pic:cNvPicPr>
                         </pic:nvPicPr>
                         <pic:blipFill>
-                          <a:blip r:embed="rId15" cstate="none"/>
+                          <a:blip r:embed="rId8"/>
                           <a:srcRect/>
                           <a:stretch>
                             <a:fillRect/>
@@ -1034,13 +562,13 @@
         </w:tc>
         <w:tc>
           <w:tcPr>
-            <w:tcW w:type="dxa" w:w="6720"/>
-            <w:vAlign w:val="top"/>
+            <w:tcW w:w="6720" w:type="dxa"/>
           </w:tcPr>
           <w:p>
             <w:pPr>
               <w:spacing w:after="100"/>
             </w:pPr>
+            <w:proofErr w:type="gramStart"/>
             <w:r>
               <w:rPr>
                 <w:b/>
@@ -1054,13 +582,14 @@
             </w:r>
             <w:r>
               <w:rPr>
-                <w:rFonts w:ascii="Consolas" w:cs="Consolas" w:eastAsia="Consolas" w:hAnsi="Consolas"/>
+                <w:rFonts w:ascii="Consolas" w:eastAsia="Consolas" w:hAnsi="Consolas" w:cs="Consolas"/>
                 <w:color w:val="5A606A"/>
                 <w:sz w:val="17"/>
                 <w:szCs w:val="17"/>
               </w:rPr>
-              <w:t xml:space="preserve">02-worth-quote.png</w:t>
-            </w:r>
+              <w:t>02-worth-quote.png</w:t>
+            </w:r>
+            <w:proofErr w:type="gramEnd"/>
           </w:p>
           <w:p>
             <w:pPr>
@@ -1075,7 +604,7 @@
                 <w:sz w:val="16"/>
                 <w:szCs w:val="16"/>
               </w:rPr>
-              <w:t xml:space="preserve">CAPTION</w:t>
+              <w:t>CAPTION</w:t>
             </w:r>
           </w:p>
           <w:p>
@@ -1083,7 +612,7 @@
               <w:spacing w:after="120"/>
             </w:pPr>
             <w:r>
-              <w:t xml:space="preserve">This is the line the firm is built on.</w:t>
+              <w:t>This is the line the firm is built on.</w:t>
             </w:r>
           </w:p>
           <w:p>
@@ -1091,7 +620,7 @@
               <w:spacing w:after="120"/>
             </w:pPr>
             <w:r>
-              <w:t xml:space="preserve">Good counsel shouldn't depend on the size of your bank account or the size of the other side's legal team. Whether it's a courtroom in Davidson County or a fight with a platform over your own assets, you deserve someone in your corner who treats your matter like it matters.</w:t>
+              <w:t>Good counsel shouldn't depend on the size of your bank account or the size of the other side's legal team. Whether it's a courtroom in Davidson County or a fight with a platform over your own assets, you deserve someone in your corner who treats your matter like it matters.</w:t>
             </w:r>
           </w:p>
           <w:p>
@@ -1102,12 +631,12 @@
               <w:rPr>
                 <w:color w:val="7D6E4C"/>
               </w:rPr>
-              <w:t xml:space="preserve">#AccessToJustice #NashvilleLawyer #ClientFirst #MTLegal</w:t>
-            </w:r>
-          </w:p>
-          <w:p>
-            <w:pPr>
-              <w:spacing w:after="60" w:before="80"/>
+              <w:t>#AccessToJustice #NashvilleLawyer #ClientFirst #MTLegal</w:t>
+            </w:r>
+          </w:p>
+          <w:p>
+            <w:pPr>
+              <w:spacing w:before="80" w:after="60"/>
             </w:pPr>
             <w:r>
               <w:rPr>
@@ -1118,7 +647,7 @@
                 <w:sz w:val="16"/>
                 <w:szCs w:val="16"/>
               </w:rPr>
-              <w:t xml:space="preserve">ALT TEXT</w:t>
+              <w:t>ALT TEXT</w:t>
             </w:r>
           </w:p>
           <w:p>
@@ -1131,7 +660,7 @@
                 <w:sz w:val="19"/>
                 <w:szCs w:val="19"/>
               </w:rPr>
-              <w:t xml:space="preserve">Quote reading "A person's worth cannot be measured by their wealth, and neither should the quality of their counsel," attributed to Madison T. Biggs, Esq.</w:t>
+              <w:t>Quote reading "A person's worth cannot be measured by their wealth, and neither should the quality of their counsel," attributed to Madison T. Biggs, Esq.</w:t>
             </w:r>
           </w:p>
         </w:tc>
@@ -1140,7 +669,7 @@
     <w:p>
       <w:pPr>
         <w:pBdr>
-          <w:bottom w:val="single" w:color="D3CDBF" w:sz="4" w:space="8"/>
+          <w:bottom w:val="single" w:sz="4" w:space="8" w:color="D3CDBF"/>
         </w:pBdr>
         <w:spacing w:after="240"/>
       </w:pPr>
@@ -1151,47 +680,60 @@
         <w:keepNext/>
       </w:pPr>
       <w:r>
-        <w:t xml:space="preserve">03 · Carousel: If you died tomorrow, could your family reach your crypto?</w:t>
+        <w:t>03 · Carousel: If you died tomorrow, could your family reach your crypto?</w:t>
       </w:r>
     </w:p>
     <w:tbl>
       <w:tblPr>
-        <w:tblW w:type="dxa" w:w="9360"/>
+        <w:tblW w:w="9360" w:type="dxa"/>
         <w:tblBorders>
-          <w:top w:val="none" w:color="FFFFFF" w:sz="0"/>
-          <w:left w:val="none" w:color="FFFFFF" w:sz="0"/>
-          <w:bottom w:val="none" w:color="FFFFFF" w:sz="0"/>
-          <w:right w:val="none" w:color="FFFFFF" w:sz="0"/>
-          <w:insideH w:val="none" w:color="FFFFFF" w:sz="0"/>
-          <w:insideV w:val="none" w:color="FFFFFF" w:sz="0"/>
+          <w:top w:val="none" w:sz="0" w:space="0" w:color="FFFFFF"/>
+          <w:left w:val="none" w:sz="0" w:space="0" w:color="FFFFFF"/>
+          <w:bottom w:val="none" w:sz="0" w:space="0" w:color="FFFFFF"/>
+          <w:right w:val="none" w:sz="0" w:space="0" w:color="FFFFFF"/>
+          <w:insideH w:val="none" w:sz="0" w:space="0" w:color="FFFFFF"/>
+          <w:insideV w:val="none" w:sz="0" w:space="0" w:color="FFFFFF"/>
         </w:tblBorders>
+        <w:tblCellMar>
+          <w:left w:w="10" w:type="dxa"/>
+          <w:right w:w="10" w:type="dxa"/>
+        </w:tblCellMar>
+        <w:tblLook w:val="04A0" w:firstRow="1" w:lastRow="0" w:firstColumn="1" w:lastColumn="0" w:noHBand="0" w:noVBand="1"/>
       </w:tblPr>
       <w:tblGrid>
         <w:gridCol w:w="2640"/>
         <w:gridCol w:w="6720"/>
       </w:tblGrid>
       <w:tr>
+        <w:tblPrEx>
+          <w:tblCellMar>
+            <w:top w:w="0" w:type="dxa"/>
+            <w:bottom w:w="0" w:type="dxa"/>
+          </w:tblCellMar>
+        </w:tblPrEx>
         <w:trPr>
           <w:cantSplit/>
         </w:trPr>
         <w:tc>
           <w:tcPr>
-            <w:tcW w:type="dxa" w:w="2640"/>
+            <w:tcW w:w="2640" w:type="dxa"/>
             <w:tcMar>
-              <w:right w:type="dxa" w:w="240"/>
+              <w:right w:w="240" w:type="dxa"/>
             </w:tcMar>
-            <w:vAlign w:val="top"/>
           </w:tcPr>
           <w:p>
             <w:pPr>
               <w:spacing w:after="100"/>
             </w:pPr>
             <w:r>
+              <w:rPr>
+                <w:noProof/>
+              </w:rPr>
               <w:drawing>
-                <wp:inline distT="0" distB="0" distL="0" distR="0">
+                <wp:inline distT="0" distB="0" distL="0" distR="0" wp14:anchorId="419371CB" wp14:editId="419371CC">
                   <wp:extent cx="990600" cy="1238250"/>
-                  <wp:effectExtent t="0" r="0" b="0" l="0"/>
-                  <wp:docPr id="1" name="03a-crypto-estate-cover.png" descr="Alt text (cover): &quot;If you died tomorrow, could your family reach your crypto?&quot;" title="03a-crypto-estate-cover.png"/>
+                  <wp:effectExtent l="0" t="0" r="0" b="0"/>
+                  <wp:docPr id="1537106579" name="03a-crypto-estate-cover.png" descr="Alt text (cover): &quot;If you died tomorrow, could your family reach your crypto?&quot;" title="03a-crypto-estate-cover.png"/>
                   <wp:cNvGraphicFramePr>
                     <a:graphicFrameLocks xmlns:a="http://schemas.openxmlformats.org/drawingml/2006/main" noChangeAspect="1"/>
                   </wp:cNvGraphicFramePr>
@@ -1199,13 +741,13 @@
                     <a:graphicData uri="http://schemas.openxmlformats.org/drawingml/2006/picture">
                       <pic:pic xmlns:pic="http://schemas.openxmlformats.org/drawingml/2006/picture">
                         <pic:nvPicPr>
-                          <pic:cNvPr id="0" name="" descr=""/>
+                          <pic:cNvPr id="0" name=""/>
                           <pic:cNvPicPr>
                             <a:picLocks noChangeAspect="1" noChangeArrowheads="1"/>
                           </pic:cNvPicPr>
                         </pic:nvPicPr>
                         <pic:blipFill>
-                          <a:blip r:embed="rId16" cstate="none"/>
+                          <a:blip r:embed="rId9"/>
                           <a:srcRect/>
                           <a:stretch>
                             <a:fillRect/>
@@ -1232,11 +774,14 @@
               <w:spacing w:after="100"/>
             </w:pPr>
             <w:r>
+              <w:rPr>
+                <w:noProof/>
+              </w:rPr>
               <w:drawing>
-                <wp:inline distT="0" distB="0" distL="0" distR="0">
+                <wp:inline distT="0" distB="0" distL="0" distR="0" wp14:anchorId="419371CD" wp14:editId="419371CE">
                   <wp:extent cx="990600" cy="1238250"/>
-                  <wp:effectExtent t="0" r="0" b="0" l="0"/>
-                  <wp:docPr id="1" name="03b-crypto-estate-keys.png" descr="Alt text (slide 2): &quot;Keys in a drawer are not an estate plan.&quot;" title="03b-crypto-estate-keys.png"/>
+                  <wp:effectExtent l="0" t="0" r="0" b="0"/>
+                  <wp:docPr id="497843052" name="03b-crypto-estate-keys.png" descr="Alt text (slide 2): &quot;Keys in a drawer are not an estate plan.&quot;" title="03b-crypto-estate-keys.png"/>
                   <wp:cNvGraphicFramePr>
                     <a:graphicFrameLocks xmlns:a="http://schemas.openxmlformats.org/drawingml/2006/main" noChangeAspect="1"/>
                   </wp:cNvGraphicFramePr>
@@ -1244,13 +789,13 @@
                     <a:graphicData uri="http://schemas.openxmlformats.org/drawingml/2006/picture">
                       <pic:pic xmlns:pic="http://schemas.openxmlformats.org/drawingml/2006/picture">
                         <pic:nvPicPr>
-                          <pic:cNvPr id="0" name="" descr=""/>
+                          <pic:cNvPr id="0" name=""/>
                           <pic:cNvPicPr>
                             <a:picLocks noChangeAspect="1" noChangeArrowheads="1"/>
                           </pic:cNvPicPr>
                         </pic:nvPicPr>
                         <pic:blipFill>
-                          <a:blip r:embed="rId17" cstate="none"/>
+                          <a:blip r:embed="rId10"/>
                           <a:srcRect/>
                           <a:stretch>
                             <a:fillRect/>
@@ -1277,11 +822,14 @@
               <w:spacing w:after="100"/>
             </w:pPr>
             <w:r>
+              <w:rPr>
+                <w:noProof/>
+              </w:rPr>
               <w:drawing>
-                <wp:inline distT="0" distB="0" distL="0" distR="0">
+                <wp:inline distT="0" distB="0" distL="0" distR="0" wp14:anchorId="419371CF" wp14:editId="419371D0">
                   <wp:extent cx="990600" cy="1238250"/>
-                  <wp:effectExtent t="0" r="0" b="0" l="0"/>
-                  <wp:docPr id="1" name="03c-crypto-estate-checklist.png" descr="Alt text (slide 3): Checklist: a will or trust for digital assets, an inventory of wallets and accounts, legal authority for your executor, and a key-access plan." title="03c-crypto-estate-checklist.png"/>
+                  <wp:effectExtent l="0" t="0" r="0" b="0"/>
+                  <wp:docPr id="1240953061" name="03c-crypto-estate-checklist.png" descr="Alt text (slide 3): Checklist: a will or trust for digital assets, an inventory of wallets and accounts, legal authority for your executor, and a key-access plan." title="03c-crypto-estate-checklist.png"/>
                   <wp:cNvGraphicFramePr>
                     <a:graphicFrameLocks xmlns:a="http://schemas.openxmlformats.org/drawingml/2006/main" noChangeAspect="1"/>
                   </wp:cNvGraphicFramePr>
@@ -1289,13 +837,13 @@
                     <a:graphicData uri="http://schemas.openxmlformats.org/drawingml/2006/picture">
                       <pic:pic xmlns:pic="http://schemas.openxmlformats.org/drawingml/2006/picture">
                         <pic:nvPicPr>
-                          <pic:cNvPr id="0" name="" descr=""/>
+                          <pic:cNvPr id="0" name=""/>
                           <pic:cNvPicPr>
                             <a:picLocks noChangeAspect="1" noChangeArrowheads="1"/>
                           </pic:cNvPicPr>
                         </pic:nvPicPr>
                         <pic:blipFill>
-                          <a:blip r:embed="rId18" cstate="none"/>
+                          <a:blip r:embed="rId11"/>
                           <a:srcRect/>
                           <a:stretch>
                             <a:fillRect/>
@@ -1320,13 +868,13 @@
         </w:tc>
         <w:tc>
           <w:tcPr>
-            <w:tcW w:type="dxa" w:w="6720"/>
-            <w:vAlign w:val="top"/>
+            <w:tcW w:w="6720" w:type="dxa"/>
           </w:tcPr>
           <w:p>
             <w:pPr>
               <w:spacing w:after="100"/>
             </w:pPr>
+            <w:proofErr w:type="gramStart"/>
             <w:r>
               <w:rPr>
                 <w:b/>
@@ -1340,12 +888,22 @@
             </w:r>
             <w:r>
               <w:rPr>
-                <w:rFonts w:ascii="Consolas" w:cs="Consolas" w:eastAsia="Consolas" w:hAnsi="Consolas"/>
+                <w:rFonts w:ascii="Consolas" w:eastAsia="Consolas" w:hAnsi="Consolas" w:cs="Consolas"/>
                 <w:color w:val="5A606A"/>
                 <w:sz w:val="17"/>
                 <w:szCs w:val="17"/>
               </w:rPr>
-              <w:t xml:space="preserve">03a-crypto-estate-cover.png, 03b-crypto-estate-keys.png, 03c-crypto-estate-checklist.png</w:t>
+              <w:t>03a-crypto-estate-cover.png</w:t>
+            </w:r>
+            <w:proofErr w:type="gramEnd"/>
+            <w:r>
+              <w:rPr>
+                <w:rFonts w:ascii="Consolas" w:eastAsia="Consolas" w:hAnsi="Consolas" w:cs="Consolas"/>
+                <w:color w:val="5A606A"/>
+                <w:sz w:val="17"/>
+                <w:szCs w:val="17"/>
+              </w:rPr>
+              <w:t>, 03b-crypto-estate-keys.png, 03c-crypto-estate-checklist.png</w:t>
             </w:r>
           </w:p>
           <w:p>
@@ -1361,7 +919,7 @@
                 <w:sz w:val="16"/>
                 <w:szCs w:val="16"/>
               </w:rPr>
-              <w:t xml:space="preserve">CAPTION</w:t>
+              <w:t>CAPTION</w:t>
             </w:r>
           </w:p>
           <w:p>
@@ -1369,7 +927,7 @@
               <w:spacing w:after="120"/>
             </w:pPr>
             <w:r>
-              <w:t xml:space="preserve">I've been in the crypto space since 2017, and the most common way digital wealth disappears isn't a hack. It's a family that can't get in.</w:t>
+              <w:t>I've been in the crypto space since 2017, and the most common way digital wealth disappears isn't a hack. It's a family that can't get in.</w:t>
             </w:r>
           </w:p>
           <w:p>
@@ -1377,7 +935,7 @@
               <w:spacing w:after="120"/>
             </w:pPr>
             <w:r>
-              <w:t xml:space="preserve">A seed phrase in a drawer is not an estate plan. Your executor needs legal authority to act, and a secure way to reach your wallets and accounts, without anyone holding your keys while you're alive.</w:t>
+              <w:t>A seed phrase in a drawer is not an estate plan. Your executor needs legal authority to act, and a secure way to reach your wallets and accounts, without anyone holding your keys while you're alive.</w:t>
             </w:r>
           </w:p>
           <w:p>
@@ -1385,7 +943,7 @@
               <w:spacing w:after="120"/>
             </w:pPr>
             <w:r>
-              <w:t xml:space="preserve">Swipe for what a digital asset plan covers. Questions? Link in bio.</w:t>
+              <w:t>Swipe for what a digital asset plan covers. Questions? Link in bio.</w:t>
             </w:r>
           </w:p>
           <w:p>
@@ -1396,7 +954,7 @@
               <w:rPr>
                 <w:color w:val="7D6E4C"/>
               </w:rPr>
-              <w:t xml:space="preserve">#CryptoEstatePlanning #DigitalAssets #Bitcoin #EstatePlanning #NashvilleTN</w:t>
+              <w:t>#CryptoEstatePlanning #DigitalAssets #Bitcoin #EstatePlanning #NashvilleTN</w:t>
             </w:r>
           </w:p>
           <w:p>
@@ -1409,12 +967,12 @@
                 <w:iCs/>
                 <w:color w:val="5A606A"/>
               </w:rPr>
-              <w:t xml:space="preserve">General information, not legal advice.</w:t>
-            </w:r>
-          </w:p>
-          <w:p>
-            <w:pPr>
-              <w:spacing w:after="60" w:before="80"/>
+              <w:t>General information, not legal advice.</w:t>
+            </w:r>
+          </w:p>
+          <w:p>
+            <w:pPr>
+              <w:spacing w:before="80" w:after="60"/>
             </w:pPr>
             <w:r>
               <w:rPr>
@@ -1425,7 +983,7 @@
                 <w:sz w:val="16"/>
                 <w:szCs w:val="16"/>
               </w:rPr>
-              <w:t xml:space="preserve">ALT TEXT</w:t>
+              <w:t>ALT TEXT</w:t>
             </w:r>
           </w:p>
           <w:p>
@@ -1438,7 +996,7 @@
                 <w:sz w:val="19"/>
                 <w:szCs w:val="19"/>
               </w:rPr>
-              <w:t xml:space="preserve">Cover: "If you died tomorrow, could your family reach your crypto?"</w:t>
+              <w:t>Cover: "If you died tomorrow, could your family reach your crypto?"</w:t>
             </w:r>
           </w:p>
           <w:p>
@@ -1451,7 +1009,7 @@
                 <w:sz w:val="19"/>
                 <w:szCs w:val="19"/>
               </w:rPr>
-              <w:t xml:space="preserve">Slide 2: "Keys in a drawer are not an estate plan."</w:t>
+              <w:t>Slide 2: "Keys in a drawer are not an estate plan."</w:t>
             </w:r>
           </w:p>
           <w:p>
@@ -1464,7 +1022,7 @@
                 <w:sz w:val="19"/>
                 <w:szCs w:val="19"/>
               </w:rPr>
-              <w:t xml:space="preserve">Slide 3: Checklist: a will or trust for digital assets, an inventory of wallets and accounts, legal authority for your executor, and a key-access plan.</w:t>
+              <w:t>Slide 3: Checklist: a will or trust for digital assets, an inventory of wallets and accounts, legal authority for your executor, and a key-access plan.</w:t>
             </w:r>
           </w:p>
         </w:tc>
@@ -1473,7 +1031,7 @@
     <w:p>
       <w:pPr>
         <w:pBdr>
-          <w:bottom w:val="single" w:color="D3CDBF" w:sz="4" w:space="8"/>
+          <w:bottom w:val="single" w:sz="4" w:space="8" w:color="D3CDBF"/>
         </w:pBdr>
         <w:spacing w:after="240"/>
       </w:pPr>
@@ -1484,47 +1042,61 @@
         <w:keepNext/>
       </w:pPr>
       <w:r>
-        <w:t xml:space="preserve">04 · Pulled over in Tennessee?</w:t>
+        <w:lastRenderedPageBreak/>
+        <w:t>04 · Pulled over in Tennessee?</w:t>
       </w:r>
     </w:p>
     <w:tbl>
       <w:tblPr>
-        <w:tblW w:type="dxa" w:w="9360"/>
+        <w:tblW w:w="9360" w:type="dxa"/>
         <w:tblBorders>
-          <w:top w:val="none" w:color="FFFFFF" w:sz="0"/>
-          <w:left w:val="none" w:color="FFFFFF" w:sz="0"/>
-          <w:bottom w:val="none" w:color="FFFFFF" w:sz="0"/>
-          <w:right w:val="none" w:color="FFFFFF" w:sz="0"/>
-          <w:insideH w:val="none" w:color="FFFFFF" w:sz="0"/>
-          <w:insideV w:val="none" w:color="FFFFFF" w:sz="0"/>
+          <w:top w:val="none" w:sz="0" w:space="0" w:color="FFFFFF"/>
+          <w:left w:val="none" w:sz="0" w:space="0" w:color="FFFFFF"/>
+          <w:bottom w:val="none" w:sz="0" w:space="0" w:color="FFFFFF"/>
+          <w:right w:val="none" w:sz="0" w:space="0" w:color="FFFFFF"/>
+          <w:insideH w:val="none" w:sz="0" w:space="0" w:color="FFFFFF"/>
+          <w:insideV w:val="none" w:sz="0" w:space="0" w:color="FFFFFF"/>
         </w:tblBorders>
+        <w:tblCellMar>
+          <w:left w:w="10" w:type="dxa"/>
+          <w:right w:w="10" w:type="dxa"/>
+        </w:tblCellMar>
+        <w:tblLook w:val="04A0" w:firstRow="1" w:lastRow="0" w:firstColumn="1" w:lastColumn="0" w:noHBand="0" w:noVBand="1"/>
       </w:tblPr>
       <w:tblGrid>
         <w:gridCol w:w="2640"/>
         <w:gridCol w:w="6720"/>
       </w:tblGrid>
       <w:tr>
+        <w:tblPrEx>
+          <w:tblCellMar>
+            <w:top w:w="0" w:type="dxa"/>
+            <w:bottom w:w="0" w:type="dxa"/>
+          </w:tblCellMar>
+        </w:tblPrEx>
         <w:trPr>
           <w:cantSplit/>
         </w:trPr>
         <w:tc>
           <w:tcPr>
-            <w:tcW w:type="dxa" w:w="2640"/>
+            <w:tcW w:w="2640" w:type="dxa"/>
             <w:tcMar>
-              <w:right w:type="dxa" w:w="240"/>
+              <w:right w:w="240" w:type="dxa"/>
             </w:tcMar>
-            <w:vAlign w:val="top"/>
           </w:tcPr>
           <w:p>
             <w:pPr>
               <w:spacing w:after="100"/>
             </w:pPr>
             <w:r>
+              <w:rPr>
+                <w:noProof/>
+              </w:rPr>
               <w:drawing>
-                <wp:inline distT="0" distB="0" distL="0" distR="0">
+                <wp:inline distT="0" distB="0" distL="0" distR="0" wp14:anchorId="419371D1" wp14:editId="419371D2">
                   <wp:extent cx="1428750" cy="1790700"/>
-                  <wp:effectExtent t="0" r="0" b="0" l="0"/>
-                  <wp:docPr id="1" name="04-pulled-over.png" descr="Alt text: &quot;Pulled over in Tennessee? Stay calm and be polite. You can decline to answer questions without a lawyer, and you can decline consent to a search.&quot;" title="04-pulled-over.png"/>
+                  <wp:effectExtent l="0" t="0" r="0" b="0"/>
+                  <wp:docPr id="2132159877" name="04-pulled-over.png" descr="Alt text: &quot;Pulled over in Tennessee? Stay calm and be polite. You can decline to answer questions without a lawyer, and you can decline consent to a search.&quot;" title="04-pulled-over.png"/>
                   <wp:cNvGraphicFramePr>
                     <a:graphicFrameLocks xmlns:a="http://schemas.openxmlformats.org/drawingml/2006/main" noChangeAspect="1"/>
                   </wp:cNvGraphicFramePr>
@@ -1532,13 +1104,13 @@
                     <a:graphicData uri="http://schemas.openxmlformats.org/drawingml/2006/picture">
                       <pic:pic xmlns:pic="http://schemas.openxmlformats.org/drawingml/2006/picture">
                         <pic:nvPicPr>
-                          <pic:cNvPr id="0" name="" descr=""/>
+                          <pic:cNvPr id="0" name=""/>
                           <pic:cNvPicPr>
                             <a:picLocks noChangeAspect="1" noChangeArrowheads="1"/>
                           </pic:cNvPicPr>
                         </pic:nvPicPr>
                         <pic:blipFill>
-                          <a:blip r:embed="rId19" cstate="none"/>
+                          <a:blip r:embed="rId12"/>
                           <a:srcRect/>
                           <a:stretch>
                             <a:fillRect/>
@@ -1563,13 +1135,13 @@
         </w:tc>
         <w:tc>
           <w:tcPr>
-            <w:tcW w:type="dxa" w:w="6720"/>
-            <w:vAlign w:val="top"/>
+            <w:tcW w:w="6720" w:type="dxa"/>
           </w:tcPr>
           <w:p>
             <w:pPr>
               <w:spacing w:after="100"/>
             </w:pPr>
+            <w:proofErr w:type="gramStart"/>
             <w:r>
               <w:rPr>
                 <w:b/>
@@ -1583,13 +1155,14 @@
             </w:r>
             <w:r>
               <w:rPr>
-                <w:rFonts w:ascii="Consolas" w:cs="Consolas" w:eastAsia="Consolas" w:hAnsi="Consolas"/>
+                <w:rFonts w:ascii="Consolas" w:eastAsia="Consolas" w:hAnsi="Consolas" w:cs="Consolas"/>
                 <w:color w:val="5A606A"/>
                 <w:sz w:val="17"/>
                 <w:szCs w:val="17"/>
               </w:rPr>
-              <w:t xml:space="preserve">04-pulled-over.png</w:t>
-            </w:r>
+              <w:t>04-pulled-over.png</w:t>
+            </w:r>
+            <w:proofErr w:type="gramEnd"/>
           </w:p>
           <w:p>
             <w:pPr>
@@ -1604,7 +1177,7 @@
                 <w:sz w:val="16"/>
                 <w:szCs w:val="16"/>
               </w:rPr>
-              <w:t xml:space="preserve">CAPTION</w:t>
+              <w:t>CAPTION</w:t>
             </w:r>
           </w:p>
           <w:p>
@@ -1612,7 +1185,7 @@
               <w:spacing w:after="120"/>
             </w:pPr>
             <w:r>
-              <w:t xml:space="preserve">Save this one.</w:t>
+              <w:t>Save this one.</w:t>
             </w:r>
           </w:p>
           <w:p>
@@ -1620,7 +1193,19 @@
               <w:spacing w:after="120"/>
             </w:pPr>
             <w:r>
-              <w:t xml:space="preserve">At a traffic stop, stay calm and be polite. You can decline to answer questions without a lawyer, and you can decline consent to a search. Provide your license, registration, and proof of insurance when asked. Ask for counsel, then call one.</w:t>
+              <w:t xml:space="preserve">At a traffic stop, </w:t>
+            </w:r>
+            <w:r>
+              <w:t xml:space="preserve">try to </w:t>
+            </w:r>
+            <w:r>
+              <w:t>stay cal</w:t>
+            </w:r>
+            <w:r>
+              <w:t>m</w:t>
+            </w:r>
+            <w:r>
+              <w:t>. You can decline to answer questions without a lawyer, and you can decline consent to a search. Provide your license, registration, and proof of insurance when asked. Ask for counsel, then call one.</w:t>
             </w:r>
           </w:p>
           <w:p>
@@ -1628,7 +1213,7 @@
               <w:spacing w:after="120"/>
             </w:pPr>
             <w:r>
-              <w:t xml:space="preserve">If you've already been charged, reach out before your first court date.</w:t>
+              <w:t>If you've already been charged, reach out before your first court date.</w:t>
             </w:r>
           </w:p>
           <w:p>
@@ -1639,7 +1224,7 @@
               <w:rPr>
                 <w:color w:val="7D6E4C"/>
               </w:rPr>
-              <w:t xml:space="preserve">#KnowYourRights #NashvilleLawyer #CriminalDefense #DavidsonCounty #Tennessee</w:t>
+              <w:t>#KnowYourRights #NashvilleLawyer #CriminalDefense #DavidsonCounty #Tennessee</w:t>
             </w:r>
           </w:p>
           <w:p>
@@ -1652,12 +1237,12 @@
                 <w:iCs/>
                 <w:color w:val="5A606A"/>
               </w:rPr>
-              <w:t xml:space="preserve">General information, not legal advice.</w:t>
-            </w:r>
-          </w:p>
-          <w:p>
-            <w:pPr>
-              <w:spacing w:after="60" w:before="80"/>
+              <w:t>General information, not legal advice.</w:t>
+            </w:r>
+          </w:p>
+          <w:p>
+            <w:pPr>
+              <w:spacing w:before="80" w:after="60"/>
             </w:pPr>
             <w:r>
               <w:rPr>
@@ -1668,7 +1253,7 @@
                 <w:sz w:val="16"/>
                 <w:szCs w:val="16"/>
               </w:rPr>
-              <w:t xml:space="preserve">ALT TEXT</w:t>
+              <w:t>ALT TEXT</w:t>
             </w:r>
           </w:p>
           <w:p>
@@ -1681,7 +1266,7 @@
                 <w:sz w:val="19"/>
                 <w:szCs w:val="19"/>
               </w:rPr>
-              <w:t xml:space="preserve">"Pulled over in Tennessee? Stay calm and be polite. You can decline to answer questions without a lawyer, and you can decline consent to a search."</w:t>
+              <w:t>"Pulled over in Tennessee? Stay calm and be polite. You can decline to answer questions without a lawyer, and you can decline consent to a search."</w:t>
             </w:r>
           </w:p>
         </w:tc>
@@ -1690,7 +1275,7 @@
     <w:p>
       <w:pPr>
         <w:pBdr>
-          <w:bottom w:val="single" w:color="D3CDBF" w:sz="4" w:space="8"/>
+          <w:bottom w:val="single" w:sz="4" w:space="8" w:color="D3CDBF"/>
         </w:pBdr>
         <w:spacing w:after="240"/>
       </w:pPr>
@@ -1701,47 +1286,60 @@
         <w:keepNext/>
       </w:pPr>
       <w:r>
-        <w:t xml:space="preserve">05 · Stablecoins now have federal rules</w:t>
+        <w:t>05 · Stablecoins now have federal rules</w:t>
       </w:r>
     </w:p>
     <w:tbl>
       <w:tblPr>
-        <w:tblW w:type="dxa" w:w="9360"/>
+        <w:tblW w:w="9360" w:type="dxa"/>
         <w:tblBorders>
-          <w:top w:val="none" w:color="FFFFFF" w:sz="0"/>
-          <w:left w:val="none" w:color="FFFFFF" w:sz="0"/>
-          <w:bottom w:val="none" w:color="FFFFFF" w:sz="0"/>
-          <w:right w:val="none" w:color="FFFFFF" w:sz="0"/>
-          <w:insideH w:val="none" w:color="FFFFFF" w:sz="0"/>
-          <w:insideV w:val="none" w:color="FFFFFF" w:sz="0"/>
+          <w:top w:val="none" w:sz="0" w:space="0" w:color="FFFFFF"/>
+          <w:left w:val="none" w:sz="0" w:space="0" w:color="FFFFFF"/>
+          <w:bottom w:val="none" w:sz="0" w:space="0" w:color="FFFFFF"/>
+          <w:right w:val="none" w:sz="0" w:space="0" w:color="FFFFFF"/>
+          <w:insideH w:val="none" w:sz="0" w:space="0" w:color="FFFFFF"/>
+          <w:insideV w:val="none" w:sz="0" w:space="0" w:color="FFFFFF"/>
         </w:tblBorders>
+        <w:tblCellMar>
+          <w:left w:w="10" w:type="dxa"/>
+          <w:right w:w="10" w:type="dxa"/>
+        </w:tblCellMar>
+        <w:tblLook w:val="04A0" w:firstRow="1" w:lastRow="0" w:firstColumn="1" w:lastColumn="0" w:noHBand="0" w:noVBand="1"/>
       </w:tblPr>
       <w:tblGrid>
         <w:gridCol w:w="2640"/>
         <w:gridCol w:w="6720"/>
       </w:tblGrid>
       <w:tr>
+        <w:tblPrEx>
+          <w:tblCellMar>
+            <w:top w:w="0" w:type="dxa"/>
+            <w:bottom w:w="0" w:type="dxa"/>
+          </w:tblCellMar>
+        </w:tblPrEx>
         <w:trPr>
           <w:cantSplit/>
         </w:trPr>
         <w:tc>
           <w:tcPr>
-            <w:tcW w:type="dxa" w:w="2640"/>
+            <w:tcW w:w="2640" w:type="dxa"/>
             <w:tcMar>
-              <w:right w:type="dxa" w:w="240"/>
+              <w:right w:w="240" w:type="dxa"/>
             </w:tcMar>
-            <w:vAlign w:val="top"/>
           </w:tcPr>
           <w:p>
             <w:pPr>
               <w:spacing w:after="100"/>
             </w:pPr>
             <w:r>
+              <w:rPr>
+                <w:noProof/>
+              </w:rPr>
               <w:drawing>
-                <wp:inline distT="0" distB="0" distL="0" distR="0">
+                <wp:inline distT="0" distB="0" distL="0" distR="0" wp14:anchorId="419371D3" wp14:editId="419371D4">
                   <wp:extent cx="1428750" cy="1790700"/>
-                  <wp:effectExtent t="0" r="0" b="0" l="0"/>
-                  <wp:docPr id="1" name="05-stablecoins-genius-act.png" descr="Alt text: &quot;Stablecoins now have federal rules,&quot; with a short summary of the GENIUS Act." title="05-stablecoins-genius-act.png"/>
+                  <wp:effectExtent l="0" t="0" r="0" b="0"/>
+                  <wp:docPr id="1533145639" name="05-stablecoins-genius-act.png" descr="Alt text: &quot;Stablecoins now have federal rules,&quot; with a short summary of the GENIUS Act." title="05-stablecoins-genius-act.png"/>
                   <wp:cNvGraphicFramePr>
                     <a:graphicFrameLocks xmlns:a="http://schemas.openxmlformats.org/drawingml/2006/main" noChangeAspect="1"/>
                   </wp:cNvGraphicFramePr>
@@ -1749,13 +1347,13 @@
                     <a:graphicData uri="http://schemas.openxmlformats.org/drawingml/2006/picture">
                       <pic:pic xmlns:pic="http://schemas.openxmlformats.org/drawingml/2006/picture">
                         <pic:nvPicPr>
-                          <pic:cNvPr id="0" name="" descr=""/>
+                          <pic:cNvPr id="0" name=""/>
                           <pic:cNvPicPr>
                             <a:picLocks noChangeAspect="1" noChangeArrowheads="1"/>
                           </pic:cNvPicPr>
                         </pic:nvPicPr>
                         <pic:blipFill>
-                          <a:blip r:embed="rId20" cstate="none"/>
+                          <a:blip r:embed="rId13"/>
                           <a:srcRect/>
                           <a:stretch>
                             <a:fillRect/>
@@ -1780,13 +1378,13 @@
         </w:tc>
         <w:tc>
           <w:tcPr>
-            <w:tcW w:type="dxa" w:w="6720"/>
-            <w:vAlign w:val="top"/>
+            <w:tcW w:w="6720" w:type="dxa"/>
           </w:tcPr>
           <w:p>
             <w:pPr>
               <w:spacing w:after="100"/>
             </w:pPr>
+            <w:proofErr w:type="gramStart"/>
             <w:r>
               <w:rPr>
                 <w:b/>
@@ -1800,13 +1398,14 @@
             </w:r>
             <w:r>
               <w:rPr>
-                <w:rFonts w:ascii="Consolas" w:cs="Consolas" w:eastAsia="Consolas" w:hAnsi="Consolas"/>
+                <w:rFonts w:ascii="Consolas" w:eastAsia="Consolas" w:hAnsi="Consolas" w:cs="Consolas"/>
                 <w:color w:val="5A606A"/>
                 <w:sz w:val="17"/>
                 <w:szCs w:val="17"/>
               </w:rPr>
-              <w:t xml:space="preserve">05-stablecoins-genius-act.png</w:t>
-            </w:r>
+              <w:t>05-stablecoins-genius-act.png</w:t>
+            </w:r>
+            <w:proofErr w:type="gramEnd"/>
           </w:p>
           <w:p>
             <w:pPr>
@@ -1821,7 +1420,7 @@
                 <w:sz w:val="16"/>
                 <w:szCs w:val="16"/>
               </w:rPr>
-              <w:t xml:space="preserve">CAPTION</w:t>
+              <w:t>CAPTION</w:t>
             </w:r>
           </w:p>
           <w:p>
@@ -1829,7 +1428,7 @@
               <w:spacing w:after="120"/>
             </w:pPr>
             <w:r>
-              <w:t xml:space="preserve">The GENIUS Act (2025) created the first federal framework for payment stablecoins: reserve, disclosure, and licensing rules for issuers.</w:t>
+              <w:t>The GENIUS Act (2025) created the first federal framework for payment stablecoins: reserve, disclosure, and licensing rules for issuers.</w:t>
             </w:r>
           </w:p>
           <w:p>
@@ -1837,7 +1436,7 @@
               <w:spacing w:after="120"/>
             </w:pPr>
             <w:r>
-              <w:t xml:space="preserve">For Nashville businesses that opens a real opportunity: settle payments in minutes, cut card and wire fees, and reach customers abroad. It also means the structure has to be right before you accept, hold, or issue them.</w:t>
+              <w:t>For Nashville businesses that opens a real opportunity: settle payments in minutes, cut card and wire fees, and reach customers abroad. It also means the structure has to be right before you accept, hold, or issue them.</w:t>
             </w:r>
           </w:p>
           <w:p>
@@ -1845,7 +1444,7 @@
               <w:spacing w:after="120"/>
             </w:pPr>
             <w:r>
-              <w:t xml:space="preserve">Building something with stablecoins or agentic commerce? Let's talk.</w:t>
+              <w:t>Building something with stablecoins or AI agents that pay? Let's talk.</w:t>
             </w:r>
           </w:p>
           <w:p>
@@ -1856,7 +1455,7 @@
               <w:rPr>
                 <w:color w:val="7D6E4C"/>
               </w:rPr>
-              <w:t xml:space="preserve">#Stablecoins #GENIUSAct #Fintech #AgenticCommerce #NashvilleBusiness</w:t>
+              <w:t>#Stablecoins #GENIUSAct #Fintech #AgenticPayments #NashvilleBusiness</w:t>
             </w:r>
           </w:p>
           <w:p>
@@ -1869,12 +1468,12 @@
                 <w:iCs/>
                 <w:color w:val="5A606A"/>
               </w:rPr>
-              <w:t xml:space="preserve">General information, not legal advice.</w:t>
-            </w:r>
-          </w:p>
-          <w:p>
-            <w:pPr>
-              <w:spacing w:after="60" w:before="80"/>
+              <w:t>General information, not legal advice.</w:t>
+            </w:r>
+          </w:p>
+          <w:p>
+            <w:pPr>
+              <w:spacing w:before="80" w:after="60"/>
             </w:pPr>
             <w:r>
               <w:rPr>
@@ -1885,7 +1484,7 @@
                 <w:sz w:val="16"/>
                 <w:szCs w:val="16"/>
               </w:rPr>
-              <w:t xml:space="preserve">ALT TEXT</w:t>
+              <w:t>ALT TEXT</w:t>
             </w:r>
           </w:p>
           <w:p>
@@ -1898,7 +1497,7 @@
                 <w:sz w:val="19"/>
                 <w:szCs w:val="19"/>
               </w:rPr>
-              <w:t xml:space="preserve">"Stablecoins now have federal rules," with a short summary of the GENIUS Act.</w:t>
+              <w:t>"Stablecoins now have federal rules," with a short summary of the GENIUS Act.</w:t>
             </w:r>
           </w:p>
         </w:tc>
@@ -1907,7 +1506,7 @@
     <w:p>
       <w:pPr>
         <w:pBdr>
-          <w:bottom w:val="single" w:color="D3CDBF" w:sz="4" w:space="8"/>
+          <w:bottom w:val="single" w:sz="4" w:space="8" w:color="D3CDBF"/>
         </w:pBdr>
         <w:spacing w:after="240"/>
       </w:pPr>
@@ -1918,47 +1517,61 @@
         <w:keepNext/>
       </w:pPr>
       <w:r>
-        <w:t xml:space="preserve">06 · One person. A bigger power.</w:t>
+        <w:lastRenderedPageBreak/>
+        <w:t>06 · One person. A bigger power.</w:t>
       </w:r>
     </w:p>
     <w:tbl>
       <w:tblPr>
-        <w:tblW w:type="dxa" w:w="9360"/>
+        <w:tblW w:w="9360" w:type="dxa"/>
         <w:tblBorders>
-          <w:top w:val="none" w:color="FFFFFF" w:sz="0"/>
-          <w:left w:val="none" w:color="FFFFFF" w:sz="0"/>
-          <w:bottom w:val="none" w:color="FFFFFF" w:sz="0"/>
-          <w:right w:val="none" w:color="FFFFFF" w:sz="0"/>
-          <w:insideH w:val="none" w:color="FFFFFF" w:sz="0"/>
-          <w:insideV w:val="none" w:color="FFFFFF" w:sz="0"/>
+          <w:top w:val="none" w:sz="0" w:space="0" w:color="FFFFFF"/>
+          <w:left w:val="none" w:sz="0" w:space="0" w:color="FFFFFF"/>
+          <w:bottom w:val="none" w:sz="0" w:space="0" w:color="FFFFFF"/>
+          <w:right w:val="none" w:sz="0" w:space="0" w:color="FFFFFF"/>
+          <w:insideH w:val="none" w:sz="0" w:space="0" w:color="FFFFFF"/>
+          <w:insideV w:val="none" w:sz="0" w:space="0" w:color="FFFFFF"/>
         </w:tblBorders>
+        <w:tblCellMar>
+          <w:left w:w="10" w:type="dxa"/>
+          <w:right w:w="10" w:type="dxa"/>
+        </w:tblCellMar>
+        <w:tblLook w:val="04A0" w:firstRow="1" w:lastRow="0" w:firstColumn="1" w:lastColumn="0" w:noHBand="0" w:noVBand="1"/>
       </w:tblPr>
       <w:tblGrid>
         <w:gridCol w:w="2640"/>
         <w:gridCol w:w="6720"/>
       </w:tblGrid>
       <w:tr>
+        <w:tblPrEx>
+          <w:tblCellMar>
+            <w:top w:w="0" w:type="dxa"/>
+            <w:bottom w:w="0" w:type="dxa"/>
+          </w:tblCellMar>
+        </w:tblPrEx>
         <w:trPr>
           <w:cantSplit/>
         </w:trPr>
         <w:tc>
           <w:tcPr>
-            <w:tcW w:type="dxa" w:w="2640"/>
+            <w:tcW w:w="2640" w:type="dxa"/>
             <w:tcMar>
-              <w:right w:type="dxa" w:w="240"/>
+              <w:right w:w="240" w:type="dxa"/>
             </w:tcMar>
-            <w:vAlign w:val="top"/>
           </w:tcPr>
           <w:p>
             <w:pPr>
               <w:spacing w:after="100"/>
             </w:pPr>
             <w:r>
+              <w:rPr>
+                <w:noProof/>
+              </w:rPr>
               <w:drawing>
-                <wp:inline distT="0" distB="0" distL="0" distR="0">
+                <wp:inline distT="0" distB="0" distL="0" distR="0" wp14:anchorId="419371D5" wp14:editId="419371D6">
                   <wp:extent cx="1428750" cy="1790700"/>
-                  <wp:effectExtent t="0" r="0" b="0" l="0"/>
-                  <wp:docPr id="1" name="06-one-person-bigger-power.png" descr="Alt text: Davidson County courthouse in black and white with the words &quot;One person. A bigger power.&quot;" title="06-one-person-bigger-power.png"/>
+                  <wp:effectExtent l="0" t="0" r="0" b="0"/>
+                  <wp:docPr id="1800576547" name="06-one-person-bigger-power.png" descr="Alt text: Davidson County courthouse in black and white with the words &quot;One person. A bigger power.&quot;" title="06-one-person-bigger-power.png"/>
                   <wp:cNvGraphicFramePr>
                     <a:graphicFrameLocks xmlns:a="http://schemas.openxmlformats.org/drawingml/2006/main" noChangeAspect="1"/>
                   </wp:cNvGraphicFramePr>
@@ -1966,13 +1579,13 @@
                     <a:graphicData uri="http://schemas.openxmlformats.org/drawingml/2006/picture">
                       <pic:pic xmlns:pic="http://schemas.openxmlformats.org/drawingml/2006/picture">
                         <pic:nvPicPr>
-                          <pic:cNvPr id="0" name="" descr=""/>
+                          <pic:cNvPr id="0" name=""/>
                           <pic:cNvPicPr>
                             <a:picLocks noChangeAspect="1" noChangeArrowheads="1"/>
                           </pic:cNvPicPr>
                         </pic:nvPicPr>
                         <pic:blipFill>
-                          <a:blip r:embed="rId21" cstate="none"/>
+                          <a:blip r:embed="rId14"/>
                           <a:srcRect/>
                           <a:stretch>
                             <a:fillRect/>
@@ -1997,13 +1610,13 @@
         </w:tc>
         <w:tc>
           <w:tcPr>
-            <w:tcW w:type="dxa" w:w="6720"/>
-            <w:vAlign w:val="top"/>
+            <w:tcW w:w="6720" w:type="dxa"/>
           </w:tcPr>
           <w:p>
             <w:pPr>
               <w:spacing w:after="100"/>
             </w:pPr>
+            <w:proofErr w:type="gramStart"/>
             <w:r>
               <w:rPr>
                 <w:b/>
@@ -2017,13 +1630,14 @@
             </w:r>
             <w:r>
               <w:rPr>
-                <w:rFonts w:ascii="Consolas" w:cs="Consolas" w:eastAsia="Consolas" w:hAnsi="Consolas"/>
+                <w:rFonts w:ascii="Consolas" w:eastAsia="Consolas" w:hAnsi="Consolas" w:cs="Consolas"/>
                 <w:color w:val="5A606A"/>
                 <w:sz w:val="17"/>
                 <w:szCs w:val="17"/>
               </w:rPr>
-              <w:t xml:space="preserve">06-one-person-bigger-power.png</w:t>
-            </w:r>
+              <w:t>06-one-person-bigger-power.png</w:t>
+            </w:r>
+            <w:proofErr w:type="gramEnd"/>
           </w:p>
           <w:p>
             <w:pPr>
@@ -2038,7 +1652,7 @@
                 <w:sz w:val="16"/>
                 <w:szCs w:val="16"/>
               </w:rPr>
-              <w:t xml:space="preserve">CAPTION</w:t>
+              <w:t>CAPTION</w:t>
             </w:r>
           </w:p>
           <w:p>
@@ -2046,7 +1660,7 @@
               <w:spacing w:after="120"/>
             </w:pPr>
             <w:r>
-              <w:t xml:space="preserve">I learned how the system works from the inside: two years as a deputy court clerk, an internship with the District Attorney's Office, and then the defense table.</w:t>
+              <w:t>I learned how the system works from the inside: two years as a deputy court clerk, an internship with the District Attorney's Office, and then the defense table.</w:t>
             </w:r>
           </w:p>
           <w:p>
@@ -2054,7 +1668,7 @@
               <w:spacing w:after="120"/>
             </w:pPr>
             <w:r>
-              <w:t xml:space="preserve">That's still the job. One person on one side, a bigger power on the other, and someone making sure your side gets heard. Today that fight happens in courtrooms and in the new economy.</w:t>
+              <w:t>That's still the job. One person on one side, a bigger power on the other, and someone making sure your side gets heard. Today that fight happens in courtrooms and in the new economy.</w:t>
             </w:r>
           </w:p>
           <w:p>
@@ -2065,12 +1679,12 @@
               <w:rPr>
                 <w:color w:val="7D6E4C"/>
               </w:rPr>
-              <w:t xml:space="preserve">#TrialAttorney #NashvilleLawyer #CivilRights #ClientFirst #MiddleTennessee</w:t>
-            </w:r>
-          </w:p>
-          <w:p>
-            <w:pPr>
-              <w:spacing w:after="60" w:before="80"/>
+              <w:t>#Litigation #NashvilleLawyer #CivilRights #ClientFirst #MiddleTennessee</w:t>
+            </w:r>
+          </w:p>
+          <w:p>
+            <w:pPr>
+              <w:spacing w:before="80" w:after="60"/>
             </w:pPr>
             <w:r>
               <w:rPr>
@@ -2081,7 +1695,7 @@
                 <w:sz w:val="16"/>
                 <w:szCs w:val="16"/>
               </w:rPr>
-              <w:t xml:space="preserve">ALT TEXT</w:t>
+              <w:t>ALT TEXT</w:t>
             </w:r>
           </w:p>
           <w:p>
@@ -2094,7 +1708,7 @@
                 <w:sz w:val="19"/>
                 <w:szCs w:val="19"/>
               </w:rPr>
-              <w:t xml:space="preserve">Davidson County courthouse in black and white with the words "One person. A bigger power."</w:t>
+              <w:t>Davidson County courthouse in black and white with the words "One person. A bigger power."</w:t>
             </w:r>
           </w:p>
         </w:tc>
@@ -2103,7 +1717,7 @@
     <w:p>
       <w:pPr>
         <w:pBdr>
-          <w:bottom w:val="single" w:color="D3CDBF" w:sz="4" w:space="8"/>
+          <w:bottom w:val="single" w:sz="4" w:space="8" w:color="D3CDBF"/>
         </w:pBdr>
         <w:spacing w:after="240"/>
       </w:pPr>
@@ -2114,47 +1728,60 @@
         <w:keepNext/>
       </w:pPr>
       <w:r>
-        <w:t xml:space="preserve">07 · Can you tokenize a Nashville duplex?</w:t>
+        <w:t>07 · Can you tokenize a Nashville duplex?</w:t>
       </w:r>
     </w:p>
     <w:tbl>
       <w:tblPr>
-        <w:tblW w:type="dxa" w:w="9360"/>
+        <w:tblW w:w="9360" w:type="dxa"/>
         <w:tblBorders>
-          <w:top w:val="none" w:color="FFFFFF" w:sz="0"/>
-          <w:left w:val="none" w:color="FFFFFF" w:sz="0"/>
-          <w:bottom w:val="none" w:color="FFFFFF" w:sz="0"/>
-          <w:right w:val="none" w:color="FFFFFF" w:sz="0"/>
-          <w:insideH w:val="none" w:color="FFFFFF" w:sz="0"/>
-          <w:insideV w:val="none" w:color="FFFFFF" w:sz="0"/>
+          <w:top w:val="none" w:sz="0" w:space="0" w:color="FFFFFF"/>
+          <w:left w:val="none" w:sz="0" w:space="0" w:color="FFFFFF"/>
+          <w:bottom w:val="none" w:sz="0" w:space="0" w:color="FFFFFF"/>
+          <w:right w:val="none" w:sz="0" w:space="0" w:color="FFFFFF"/>
+          <w:insideH w:val="none" w:sz="0" w:space="0" w:color="FFFFFF"/>
+          <w:insideV w:val="none" w:sz="0" w:space="0" w:color="FFFFFF"/>
         </w:tblBorders>
+        <w:tblCellMar>
+          <w:left w:w="10" w:type="dxa"/>
+          <w:right w:w="10" w:type="dxa"/>
+        </w:tblCellMar>
+        <w:tblLook w:val="04A0" w:firstRow="1" w:lastRow="0" w:firstColumn="1" w:lastColumn="0" w:noHBand="0" w:noVBand="1"/>
       </w:tblPr>
       <w:tblGrid>
         <w:gridCol w:w="2640"/>
         <w:gridCol w:w="6720"/>
       </w:tblGrid>
       <w:tr>
+        <w:tblPrEx>
+          <w:tblCellMar>
+            <w:top w:w="0" w:type="dxa"/>
+            <w:bottom w:w="0" w:type="dxa"/>
+          </w:tblCellMar>
+        </w:tblPrEx>
         <w:trPr>
           <w:cantSplit/>
         </w:trPr>
         <w:tc>
           <w:tcPr>
-            <w:tcW w:type="dxa" w:w="2640"/>
+            <w:tcW w:w="2640" w:type="dxa"/>
             <w:tcMar>
-              <w:right w:type="dxa" w:w="240"/>
+              <w:right w:w="240" w:type="dxa"/>
             </w:tcMar>
-            <w:vAlign w:val="top"/>
           </w:tcPr>
           <w:p>
             <w:pPr>
               <w:spacing w:after="100"/>
             </w:pPr>
             <w:r>
+              <w:rPr>
+                <w:noProof/>
+              </w:rPr>
               <w:drawing>
-                <wp:inline distT="0" distB="0" distL="0" distR="0">
+                <wp:inline distT="0" distB="0" distL="0" distR="0" wp14:anchorId="419371D7" wp14:editId="419371D8">
                   <wp:extent cx="1428750" cy="1790700"/>
-                  <wp:effectExtent t="0" r="0" b="0" l="0"/>
-                  <wp:docPr id="1" name="07-tokenize-a-duplex.png" descr="Alt text: &quot;Can you tokenize a Nashville duplex? Yes, if the structure is right.&quot;" title="07-tokenize-a-duplex.png"/>
+                  <wp:effectExtent l="0" t="0" r="0" b="0"/>
+                  <wp:docPr id="1308586788" name="07-tokenize-a-duplex.png" descr="Alt text: &quot;Can you tokenize a Nashville duplex? Yes, if the structure is right.&quot;" title="07-tokenize-a-duplex.png"/>
                   <wp:cNvGraphicFramePr>
                     <a:graphicFrameLocks xmlns:a="http://schemas.openxmlformats.org/drawingml/2006/main" noChangeAspect="1"/>
                   </wp:cNvGraphicFramePr>
@@ -2162,13 +1789,13 @@
                     <a:graphicData uri="http://schemas.openxmlformats.org/drawingml/2006/picture">
                       <pic:pic xmlns:pic="http://schemas.openxmlformats.org/drawingml/2006/picture">
                         <pic:nvPicPr>
-                          <pic:cNvPr id="0" name="" descr=""/>
+                          <pic:cNvPr id="0" name=""/>
                           <pic:cNvPicPr>
                             <a:picLocks noChangeAspect="1" noChangeArrowheads="1"/>
                           </pic:cNvPicPr>
                         </pic:nvPicPr>
                         <pic:blipFill>
-                          <a:blip r:embed="rId22" cstate="none"/>
+                          <a:blip r:embed="rId15"/>
                           <a:srcRect/>
                           <a:stretch>
                             <a:fillRect/>
@@ -2193,13 +1820,13 @@
         </w:tc>
         <w:tc>
           <w:tcPr>
-            <w:tcW w:type="dxa" w:w="6720"/>
-            <w:vAlign w:val="top"/>
+            <w:tcW w:w="6720" w:type="dxa"/>
           </w:tcPr>
           <w:p>
             <w:pPr>
               <w:spacing w:after="100"/>
             </w:pPr>
+            <w:proofErr w:type="gramStart"/>
             <w:r>
               <w:rPr>
                 <w:b/>
@@ -2213,13 +1840,14 @@
             </w:r>
             <w:r>
               <w:rPr>
-                <w:rFonts w:ascii="Consolas" w:cs="Consolas" w:eastAsia="Consolas" w:hAnsi="Consolas"/>
+                <w:rFonts w:ascii="Consolas" w:eastAsia="Consolas" w:hAnsi="Consolas" w:cs="Consolas"/>
                 <w:color w:val="5A606A"/>
                 <w:sz w:val="17"/>
                 <w:szCs w:val="17"/>
               </w:rPr>
-              <w:t xml:space="preserve">07-tokenize-a-duplex.png</w:t>
-            </w:r>
+              <w:t>07-tokenize-a-duplex.png</w:t>
+            </w:r>
+            <w:proofErr w:type="gramEnd"/>
           </w:p>
           <w:p>
             <w:pPr>
@@ -2234,7 +1862,7 @@
                 <w:sz w:val="16"/>
                 <w:szCs w:val="16"/>
               </w:rPr>
-              <w:t xml:space="preserve">CAPTION</w:t>
+              <w:t>CAPTION</w:t>
             </w:r>
           </w:p>
           <w:p>
@@ -2242,7 +1870,7 @@
               <w:spacing w:after="120"/>
             </w:pPr>
             <w:r>
-              <w:t xml:space="preserve">Short answer: yes, if the structure is right.</w:t>
+              <w:t>Short answer: yes, if the structure is right.</w:t>
             </w:r>
           </w:p>
           <w:p>
@@ -2250,7 +1878,7 @@
               <w:spacing w:after="120"/>
             </w:pPr>
             <w:r>
-              <w:t xml:space="preserve">Tokenization can open a property to smaller investors and faster transfers. Done wrong, it's an unregistered securities offering. The legal work is what makes the token mean something: the right entity, a securities exemption, clean title, and transfer rules that hold up.</w:t>
+              <w:t>Tokenization can open a property to smaller investors and faster transfers. Done wrong, it's an unregistered securities offering. The legal work is what makes the token mean something: the right entity, a securities exemption, clean title, and transfer rules that hold up.</w:t>
             </w:r>
           </w:p>
           <w:p>
@@ -2261,7 +1889,7 @@
               <w:rPr>
                 <w:color w:val="7D6E4C"/>
               </w:rPr>
-              <w:t xml:space="preserve">#Tokenization #RealWorldAssets #RWA #NashvilleRealEstate #Web3</w:t>
+              <w:t>#Tokenization #RealWorldAssets #RWA #NashvilleRealEstate #Web3</w:t>
             </w:r>
           </w:p>
           <w:p>
@@ -2274,12 +1902,12 @@
                 <w:iCs/>
                 <w:color w:val="5A606A"/>
               </w:rPr>
-              <w:t xml:space="preserve">General information, not legal advice.</w:t>
-            </w:r>
-          </w:p>
-          <w:p>
-            <w:pPr>
-              <w:spacing w:after="60" w:before="80"/>
+              <w:t>General information, not legal advice.</w:t>
+            </w:r>
+          </w:p>
+          <w:p>
+            <w:pPr>
+              <w:spacing w:before="80" w:after="60"/>
             </w:pPr>
             <w:r>
               <w:rPr>
@@ -2290,7 +1918,7 @@
                 <w:sz w:val="16"/>
                 <w:szCs w:val="16"/>
               </w:rPr>
-              <w:t xml:space="preserve">ALT TEXT</w:t>
+              <w:t>ALT TEXT</w:t>
             </w:r>
           </w:p>
           <w:p>
@@ -2303,7 +1931,7 @@
                 <w:sz w:val="19"/>
                 <w:szCs w:val="19"/>
               </w:rPr>
-              <w:t xml:space="preserve">"Can you tokenize a Nashville duplex? Yes, if the structure is right."</w:t>
+              <w:t>"Can you tokenize a Nashville duplex? Yes, if the structure is right."</w:t>
             </w:r>
           </w:p>
         </w:tc>
@@ -2312,7 +1940,7 @@
     <w:p>
       <w:pPr>
         <w:pBdr>
-          <w:bottom w:val="single" w:color="D3CDBF" w:sz="4" w:space="8"/>
+          <w:bottom w:val="single" w:sz="4" w:space="8" w:color="D3CDBF"/>
         </w:pBdr>
         <w:spacing w:after="240"/>
       </w:pPr>
@@ -2323,47 +1951,60 @@
         <w:keepNext/>
       </w:pPr>
       <w:r>
-        <w:t xml:space="preserve">08 · Your rights have a deadline</w:t>
+        <w:t>08 · Your rights have a deadline</w:t>
       </w:r>
     </w:p>
     <w:tbl>
       <w:tblPr>
-        <w:tblW w:type="dxa" w:w="9360"/>
+        <w:tblW w:w="9360" w:type="dxa"/>
         <w:tblBorders>
-          <w:top w:val="none" w:color="FFFFFF" w:sz="0"/>
-          <w:left w:val="none" w:color="FFFFFF" w:sz="0"/>
-          <w:bottom w:val="none" w:color="FFFFFF" w:sz="0"/>
-          <w:right w:val="none" w:color="FFFFFF" w:sz="0"/>
-          <w:insideH w:val="none" w:color="FFFFFF" w:sz="0"/>
-          <w:insideV w:val="none" w:color="FFFFFF" w:sz="0"/>
+          <w:top w:val="none" w:sz="0" w:space="0" w:color="FFFFFF"/>
+          <w:left w:val="none" w:sz="0" w:space="0" w:color="FFFFFF"/>
+          <w:bottom w:val="none" w:sz="0" w:space="0" w:color="FFFFFF"/>
+          <w:right w:val="none" w:sz="0" w:space="0" w:color="FFFFFF"/>
+          <w:insideH w:val="none" w:sz="0" w:space="0" w:color="FFFFFF"/>
+          <w:insideV w:val="none" w:sz="0" w:space="0" w:color="FFFFFF"/>
         </w:tblBorders>
+        <w:tblCellMar>
+          <w:left w:w="10" w:type="dxa"/>
+          <w:right w:w="10" w:type="dxa"/>
+        </w:tblCellMar>
+        <w:tblLook w:val="04A0" w:firstRow="1" w:lastRow="0" w:firstColumn="1" w:lastColumn="0" w:noHBand="0" w:noVBand="1"/>
       </w:tblPr>
       <w:tblGrid>
         <w:gridCol w:w="2640"/>
         <w:gridCol w:w="6720"/>
       </w:tblGrid>
       <w:tr>
+        <w:tblPrEx>
+          <w:tblCellMar>
+            <w:top w:w="0" w:type="dxa"/>
+            <w:bottom w:w="0" w:type="dxa"/>
+          </w:tblCellMar>
+        </w:tblPrEx>
         <w:trPr>
           <w:cantSplit/>
         </w:trPr>
         <w:tc>
           <w:tcPr>
-            <w:tcW w:type="dxa" w:w="2640"/>
+            <w:tcW w:w="2640" w:type="dxa"/>
             <w:tcMar>
-              <w:right w:type="dxa" w:w="240"/>
+              <w:right w:w="240" w:type="dxa"/>
             </w:tcMar>
-            <w:vAlign w:val="top"/>
           </w:tcPr>
           <w:p>
             <w:pPr>
               <w:spacing w:after="100"/>
             </w:pPr>
             <w:r>
+              <w:rPr>
+                <w:noProof/>
+              </w:rPr>
               <w:drawing>
-                <wp:inline distT="0" distB="0" distL="0" distR="0">
+                <wp:inline distT="0" distB="0" distL="0" distR="0" wp14:anchorId="419371D9" wp14:editId="419371DA">
                   <wp:extent cx="1428750" cy="1790700"/>
-                  <wp:effectExtent t="0" r="0" b="0" l="0"/>
-                  <wp:docPr id="1" name="08-one-year-deadline.png" descr="Alt text: &quot;Your rights have a deadline. In Tennessee, most civil rights and personal injury claims must be filed within one year.&quot;" title="08-one-year-deadline.png"/>
+                  <wp:effectExtent l="0" t="0" r="0" b="0"/>
+                  <wp:docPr id="1993226580" name="08-one-year-deadline.png" descr="Alt text: &quot;Your rights have a deadline. In Tennessee, most civil rights and personal injury claims must be filed within one year.&quot;" title="08-one-year-deadline.png"/>
                   <wp:cNvGraphicFramePr>
                     <a:graphicFrameLocks xmlns:a="http://schemas.openxmlformats.org/drawingml/2006/main" noChangeAspect="1"/>
                   </wp:cNvGraphicFramePr>
@@ -2371,13 +2012,13 @@
                     <a:graphicData uri="http://schemas.openxmlformats.org/drawingml/2006/picture">
                       <pic:pic xmlns:pic="http://schemas.openxmlformats.org/drawingml/2006/picture">
                         <pic:nvPicPr>
-                          <pic:cNvPr id="0" name="" descr=""/>
+                          <pic:cNvPr id="0" name=""/>
                           <pic:cNvPicPr>
                             <a:picLocks noChangeAspect="1" noChangeArrowheads="1"/>
                           </pic:cNvPicPr>
                         </pic:nvPicPr>
                         <pic:blipFill>
-                          <a:blip r:embed="rId23" cstate="none"/>
+                          <a:blip r:embed="rId16"/>
                           <a:srcRect/>
                           <a:stretch>
                             <a:fillRect/>
@@ -2402,13 +2043,13 @@
         </w:tc>
         <w:tc>
           <w:tcPr>
-            <w:tcW w:type="dxa" w:w="6720"/>
-            <w:vAlign w:val="top"/>
+            <w:tcW w:w="6720" w:type="dxa"/>
           </w:tcPr>
           <w:p>
             <w:pPr>
               <w:spacing w:after="100"/>
             </w:pPr>
+            <w:proofErr w:type="gramStart"/>
             <w:r>
               <w:rPr>
                 <w:b/>
@@ -2422,13 +2063,14 @@
             </w:r>
             <w:r>
               <w:rPr>
-                <w:rFonts w:ascii="Consolas" w:cs="Consolas" w:eastAsia="Consolas" w:hAnsi="Consolas"/>
+                <w:rFonts w:ascii="Consolas" w:eastAsia="Consolas" w:hAnsi="Consolas" w:cs="Consolas"/>
                 <w:color w:val="5A606A"/>
                 <w:sz w:val="17"/>
                 <w:szCs w:val="17"/>
               </w:rPr>
-              <w:t xml:space="preserve">08-one-year-deadline.png</w:t>
-            </w:r>
+              <w:t>08-one-year-deadline.png</w:t>
+            </w:r>
+            <w:proofErr w:type="gramEnd"/>
           </w:p>
           <w:p>
             <w:pPr>
@@ -2443,7 +2085,7 @@
                 <w:sz w:val="16"/>
                 <w:szCs w:val="16"/>
               </w:rPr>
-              <w:t xml:space="preserve">CAPTION</w:t>
+              <w:t>CAPTION</w:t>
             </w:r>
           </w:p>
           <w:p>
@@ -2451,7 +2093,7 @@
               <w:spacing w:after="120"/>
             </w:pPr>
             <w:r>
-              <w:t xml:space="preserve">Tennessee has one of the shortest filing deadlines in the country. Most civil rights and personal injury claims must be filed within one year.</w:t>
+              <w:t>Tennessee has one of the shortest filing deadlines in the country. Most civil rights and personal injury claims must be filed within one year.</w:t>
             </w:r>
           </w:p>
           <w:p>
@@ -2459,7 +2101,7 @@
               <w:spacing w:after="120"/>
             </w:pPr>
             <w:r>
-              <w:t xml:space="preserve">Evidence fades, footage gets deleted, and insurers count on you waiting. If something happened to you, don't sit on it.</w:t>
+              <w:t>Evidence fades, footage gets deleted, and insurers count on you waiting. If something happened to you, don't sit on it.</w:t>
             </w:r>
           </w:p>
           <w:p>
@@ -2470,7 +2112,7 @@
               <w:rPr>
                 <w:color w:val="7D6E4C"/>
               </w:rPr>
-              <w:t xml:space="preserve">#PersonalInjury #CivilRights #Tennessee #NashvilleLawyer #KnowYourRights</w:t>
+              <w:t>#PersonalInjury #CivilRights #Tennessee #NashvilleLawyer #KnowYourRights</w:t>
             </w:r>
           </w:p>
           <w:p>
@@ -2483,12 +2125,12 @@
                 <w:iCs/>
                 <w:color w:val="5A606A"/>
               </w:rPr>
-              <w:t xml:space="preserve">General information, not legal advice.</w:t>
-            </w:r>
-          </w:p>
-          <w:p>
-            <w:pPr>
-              <w:spacing w:after="60" w:before="80"/>
+              <w:t>General information, not legal advice.</w:t>
+            </w:r>
+          </w:p>
+          <w:p>
+            <w:pPr>
+              <w:spacing w:before="80" w:after="60"/>
             </w:pPr>
             <w:r>
               <w:rPr>
@@ -2499,7 +2141,7 @@
                 <w:sz w:val="16"/>
                 <w:szCs w:val="16"/>
               </w:rPr>
-              <w:t xml:space="preserve">ALT TEXT</w:t>
+              <w:t>ALT TEXT</w:t>
             </w:r>
           </w:p>
           <w:p>
@@ -2512,7 +2154,7 @@
                 <w:sz w:val="19"/>
                 <w:szCs w:val="19"/>
               </w:rPr>
-              <w:t xml:space="preserve">"Your rights have a deadline. In Tennessee, most civil rights and personal injury claims must be filed within one year."</w:t>
+              <w:t>"Your rights have a deadline. In Tennessee, most civil rights and personal injury claims must be filed within one year."</w:t>
             </w:r>
           </w:p>
         </w:tc>
@@ -2521,7 +2163,7 @@
     <w:p>
       <w:pPr>
         <w:pBdr>
-          <w:bottom w:val="single" w:color="D3CDBF" w:sz="4" w:space="8"/>
+          <w:bottom w:val="single" w:sz="4" w:space="8" w:color="D3CDBF"/>
         </w:pBdr>
         <w:spacing w:after="240"/>
       </w:pPr>
@@ -2532,47 +2174,61 @@
         <w:keepNext/>
       </w:pPr>
       <w:r>
-        <w:t xml:space="preserve">09 · Meet Madison</w:t>
+        <w:lastRenderedPageBreak/>
+        <w:t>09 · Meet Madison</w:t>
       </w:r>
     </w:p>
     <w:tbl>
       <w:tblPr>
-        <w:tblW w:type="dxa" w:w="9360"/>
+        <w:tblW w:w="9360" w:type="dxa"/>
         <w:tblBorders>
-          <w:top w:val="none" w:color="FFFFFF" w:sz="0"/>
-          <w:left w:val="none" w:color="FFFFFF" w:sz="0"/>
-          <w:bottom w:val="none" w:color="FFFFFF" w:sz="0"/>
-          <w:right w:val="none" w:color="FFFFFF" w:sz="0"/>
-          <w:insideH w:val="none" w:color="FFFFFF" w:sz="0"/>
-          <w:insideV w:val="none" w:color="FFFFFF" w:sz="0"/>
+          <w:top w:val="none" w:sz="0" w:space="0" w:color="FFFFFF"/>
+          <w:left w:val="none" w:sz="0" w:space="0" w:color="FFFFFF"/>
+          <w:bottom w:val="none" w:sz="0" w:space="0" w:color="FFFFFF"/>
+          <w:right w:val="none" w:sz="0" w:space="0" w:color="FFFFFF"/>
+          <w:insideH w:val="none" w:sz="0" w:space="0" w:color="FFFFFF"/>
+          <w:insideV w:val="none" w:sz="0" w:space="0" w:color="FFFFFF"/>
         </w:tblBorders>
+        <w:tblCellMar>
+          <w:left w:w="10" w:type="dxa"/>
+          <w:right w:w="10" w:type="dxa"/>
+        </w:tblCellMar>
+        <w:tblLook w:val="04A0" w:firstRow="1" w:lastRow="0" w:firstColumn="1" w:lastColumn="0" w:noHBand="0" w:noVBand="1"/>
       </w:tblPr>
       <w:tblGrid>
         <w:gridCol w:w="2640"/>
         <w:gridCol w:w="6720"/>
       </w:tblGrid>
       <w:tr>
+        <w:tblPrEx>
+          <w:tblCellMar>
+            <w:top w:w="0" w:type="dxa"/>
+            <w:bottom w:w="0" w:type="dxa"/>
+          </w:tblCellMar>
+        </w:tblPrEx>
         <w:trPr>
           <w:cantSplit/>
         </w:trPr>
         <w:tc>
           <w:tcPr>
-            <w:tcW w:type="dxa" w:w="2640"/>
+            <w:tcW w:w="2640" w:type="dxa"/>
             <w:tcMar>
-              <w:right w:type="dxa" w:w="240"/>
+              <w:right w:w="240" w:type="dxa"/>
             </w:tcMar>
-            <w:vAlign w:val="top"/>
           </w:tcPr>
           <w:p>
             <w:pPr>
               <w:spacing w:after="100"/>
             </w:pPr>
             <w:r>
+              <w:rPr>
+                <w:noProof/>
+              </w:rPr>
               <w:drawing>
-                <wp:inline distT="0" distB="0" distL="0" distR="0">
+                <wp:inline distT="0" distB="0" distL="0" distR="0" wp14:anchorId="419371DB" wp14:editId="419371DC">
                   <wp:extent cx="1428750" cy="1790700"/>
-                  <wp:effectExtent t="0" r="0" b="0" l="0"/>
-                  <wp:docPr id="1" name="09-meet-madison.png" descr="Alt text: Portrait of Madison T. Biggs, Esq. with the words &quot;The lawyer you meet is the lawyer on your case.&quot;" title="09-meet-madison.png"/>
+                  <wp:effectExtent l="0" t="0" r="0" b="0"/>
+                  <wp:docPr id="1629349641" name="09-meet-madison.png" descr="Alt text: Portrait of Madison T. Biggs, Esq. with the words &quot;The lawyer you meet is the lawyer on your case.&quot;" title="09-meet-madison.png"/>
                   <wp:cNvGraphicFramePr>
                     <a:graphicFrameLocks xmlns:a="http://schemas.openxmlformats.org/drawingml/2006/main" noChangeAspect="1"/>
                   </wp:cNvGraphicFramePr>
@@ -2580,13 +2236,13 @@
                     <a:graphicData uri="http://schemas.openxmlformats.org/drawingml/2006/picture">
                       <pic:pic xmlns:pic="http://schemas.openxmlformats.org/drawingml/2006/picture">
                         <pic:nvPicPr>
-                          <pic:cNvPr id="0" name="" descr=""/>
+                          <pic:cNvPr id="0" name=""/>
                           <pic:cNvPicPr>
                             <a:picLocks noChangeAspect="1" noChangeArrowheads="1"/>
                           </pic:cNvPicPr>
                         </pic:nvPicPr>
                         <pic:blipFill>
-                          <a:blip r:embed="rId24" cstate="none"/>
+                          <a:blip r:embed="rId17"/>
                           <a:srcRect/>
                           <a:stretch>
                             <a:fillRect/>
@@ -2611,13 +2267,13 @@
         </w:tc>
         <w:tc>
           <w:tcPr>
-            <w:tcW w:type="dxa" w:w="6720"/>
-            <w:vAlign w:val="top"/>
+            <w:tcW w:w="6720" w:type="dxa"/>
           </w:tcPr>
           <w:p>
             <w:pPr>
               <w:spacing w:after="100"/>
             </w:pPr>
+            <w:proofErr w:type="gramStart"/>
             <w:r>
               <w:rPr>
                 <w:b/>
@@ -2631,13 +2287,14 @@
             </w:r>
             <w:r>
               <w:rPr>
-                <w:rFonts w:ascii="Consolas" w:cs="Consolas" w:eastAsia="Consolas" w:hAnsi="Consolas"/>
+                <w:rFonts w:ascii="Consolas" w:eastAsia="Consolas" w:hAnsi="Consolas" w:cs="Consolas"/>
                 <w:color w:val="5A606A"/>
                 <w:sz w:val="17"/>
                 <w:szCs w:val="17"/>
               </w:rPr>
-              <w:t xml:space="preserve">09-meet-madison.png</w:t>
-            </w:r>
+              <w:t>09-meet-madison.png</w:t>
+            </w:r>
+            <w:proofErr w:type="gramEnd"/>
           </w:p>
           <w:p>
             <w:pPr>
@@ -2652,7 +2309,7 @@
                 <w:sz w:val="16"/>
                 <w:szCs w:val="16"/>
               </w:rPr>
-              <w:t xml:space="preserve">CAPTION</w:t>
+              <w:t>CAPTION</w:t>
             </w:r>
           </w:p>
           <w:p>
@@ -2660,7 +2317,7 @@
               <w:spacing w:after="120"/>
             </w:pPr>
             <w:r>
-              <w:t xml:space="preserve">Hi, I'm Madison.</w:t>
+              <w:t>Hi, I'm Madison.</w:t>
             </w:r>
           </w:p>
           <w:p>
@@ -2668,7 +2325,7 @@
               <w:spacing w:after="120"/>
             </w:pPr>
             <w:r>
-              <w:t xml:space="preserve">I've been in the crypto space since 2017 and in courtrooms across Middle Tennessee as a trial attorney. I started MT Legal so clients would always know who is handling their matter: me, from the first call to the last.</w:t>
+              <w:t>I've been in the crypto space since 2017 and in courtrooms across Middle Tennessee as a litigator. I started MT Legal so clients would always know who is handling their matter: me, from the first call to the last.</w:t>
             </w:r>
           </w:p>
           <w:p>
@@ -2676,7 +2333,7 @@
               <w:spacing w:after="120"/>
             </w:pPr>
             <w:r>
-              <w:t xml:space="preserve">Belmont Law graduate. Adjunct professor of Business Law at Fisk University. Member of Nashville's Bitcoin community.</w:t>
+              <w:t>Belmont Law graduate. Adjunct professor of Business Law at Fisk University. Member of Nashville's Bitcoin community.</w:t>
             </w:r>
           </w:p>
           <w:p>
@@ -2687,12 +2344,12 @@
               <w:rPr>
                 <w:color w:val="7D6E4C"/>
               </w:rPr>
-              <w:t xml:space="preserve">#MeetTheAttorney #NashvilleLawyer #Bitcoin #CryptoLawyer #MTLegal</w:t>
-            </w:r>
-          </w:p>
-          <w:p>
-            <w:pPr>
-              <w:spacing w:after="60" w:before="80"/>
+              <w:t>#MeetTheAttorney #NashvilleLawyer #Bitcoin #CryptoLawyer #MTLegal</w:t>
+            </w:r>
+          </w:p>
+          <w:p>
+            <w:pPr>
+              <w:spacing w:before="80" w:after="60"/>
             </w:pPr>
             <w:r>
               <w:rPr>
@@ -2703,7 +2360,7 @@
                 <w:sz w:val="16"/>
                 <w:szCs w:val="16"/>
               </w:rPr>
-              <w:t xml:space="preserve">ALT TEXT</w:t>
+              <w:t>ALT TEXT</w:t>
             </w:r>
           </w:p>
           <w:p>
@@ -2716,7 +2373,7 @@
                 <w:sz w:val="19"/>
                 <w:szCs w:val="19"/>
               </w:rPr>
-              <w:t xml:space="preserve">Portrait of Madison T. Biggs, Esq. with the words "The lawyer you meet is the lawyer on your case."</w:t>
+              <w:t>Portrait of Madison T. Biggs, Esq. with the words "The lawyer you meet is the lawyer on your case."</w:t>
             </w:r>
           </w:p>
         </w:tc>
@@ -2725,7 +2382,7 @@
     <w:p>
       <w:pPr>
         <w:pBdr>
-          <w:bottom w:val="single" w:color="D3CDBF" w:sz="4" w:space="8"/>
+          <w:bottom w:val="single" w:sz="4" w:space="8" w:color="D3CDBF"/>
         </w:pBdr>
         <w:spacing w:after="240"/>
       </w:pPr>
@@ -2733,10 +2390,9 @@
     <w:p>
       <w:pPr>
         <w:pStyle w:val="Heading1"/>
-        <w:keepNext/>
-      </w:pPr>
-      <w:r>
-        <w:t xml:space="preserve">Stories and Reels ideas</w:t>
+      </w:pPr>
+      <w:r>
+        <w:t>Stories and Reels ideas</w:t>
       </w:r>
     </w:p>
     <w:p>
@@ -2753,7 +2409,7 @@
           <w:b/>
           <w:bCs/>
         </w:rPr>
-        <w:t xml:space="preserve">"Ask Madison" sticker</w:t>
+        <w:t>"Ask Madison" sticker</w:t>
       </w:r>
       <w:r>
         <w:t xml:space="preserve"> each week: answer one question on camera in under 60 seconds.</w:t>
@@ -2773,7 +2429,7 @@
           <w:b/>
           <w:bCs/>
         </w:rPr>
-        <w:t xml:space="preserve">Reel: "3 things to do the day you're arrested"</w:t>
+        <w:t>Reel: "3 things to do the day you're arrested"</w:t>
       </w:r>
       <w:r>
         <w:t xml:space="preserve"> (stay quiet, ask for a lawyer, write down what happened).</w:t>
@@ -2793,10 +2449,10 @@
           <w:b/>
           <w:bCs/>
         </w:rPr>
-        <w:t xml:space="preserve">Reel: "Where does your crypto go when you die?"</w:t>
-      </w:r>
-      <w:r>
-        <w:t xml:space="preserve">, filmed walking past the courthouse.</w:t>
+        <w:t>Reel: "Where does your crypto go when you die?"</w:t>
+      </w:r>
+      <w:r>
+        <w:t>, filmed walking past the courthouse.</w:t>
       </w:r>
     </w:p>
     <w:p>
@@ -2813,7 +2469,7 @@
           <w:b/>
           <w:bCs/>
         </w:rPr>
-        <w:t xml:space="preserve">Story poll:</w:t>
+        <w:t>Story poll:</w:t>
       </w:r>
       <w:r>
         <w:t xml:space="preserve"> "Do your family members know how to access your crypto?" Yes / No.</w:t>
@@ -2833,7 +2489,7 @@
           <w:b/>
           <w:bCs/>
         </w:rPr>
-        <w:t xml:space="preserve">Behind the scenes:</w:t>
+        <w:t>Behind the scenes:</w:t>
       </w:r>
       <w:r>
         <w:t xml:space="preserve"> conferences, Bitcoin meetups, teaching at Fisk (with permission).</w:t>
@@ -2842,10 +2498,9 @@
     <w:p>
       <w:pPr>
         <w:pStyle w:val="Heading1"/>
-        <w:keepNext/>
-      </w:pPr>
-      <w:r>
-        <w:t xml:space="preserve">Before posting</w:t>
+      </w:pPr>
+      <w:r>
+        <w:t>Before posting</w:t>
       </w:r>
     </w:p>
     <w:p>
@@ -2858,7 +2513,7 @@
         <w:spacing w:after="80"/>
       </w:pPr>
       <w:r>
-        <w:t xml:space="preserve">Keep "Attorney advertising" in the bio. Tennessee treats social posts about your services as advertising under RPC 7.1 to 7.3.</w:t>
+        <w:t>Keep "Attorney advertising" in the bio. Tennessee treats social posts about your services as advertising under RPC 7.1 to 7.3.</w:t>
       </w:r>
     </w:p>
     <w:p>
@@ -2871,7 +2526,7 @@
         <w:spacing w:after="80"/>
       </w:pPr>
       <w:r>
-        <w:t xml:space="preserve">No client stories, results, or reviews without written consent, and no "expert" or "specialist" wording (RPC 7.4).</w:t>
+        <w:t>No client stories, results, or reviews without written consent, and no "expert" or "specialist" wording (RPC 7.4).</w:t>
       </w:r>
     </w:p>
     <w:p>
@@ -2884,37 +2539,24 @@
         <w:spacing w:after="80"/>
       </w:pPr>
       <w:r>
-        <w:t xml:space="preserve">Don't answer specific legal questions in comments or DMs; invite people to book a call instead.</w:t>
+        <w:t>Don't answer specific legal questions in comments or DMs; invite people to book a call instead.</w:t>
       </w:r>
     </w:p>
     <w:sectPr>
-      <w:footerReference w:type="default" r:id="rId7"/>
-      <w:pgSz w:w="12240" w:h="15840" w:orient="portrait"/>
+      <w:footerReference w:type="default" r:id="rId18"/>
+      <w:pgSz w:w="12240" w:h="15840"/>
       <w:pgMar w:top="1260" w:right="1440" w:bottom="1260" w:left="1440" w:header="708" w:footer="708" w:gutter="0"/>
-      <w:pgNumType/>
+      <w:cols w:space="720"/>
       <w:docGrid w:linePitch="360"/>
     </w:sectPr>
   </w:body>
 </w:document>
 </file>
 
-<file path=word/comments.xml><?xml version="1.0" encoding="utf-8"?>
-<w:comments xmlns:cx="http://schemas.microsoft.com/office/drawing/2014/chartex" xmlns:cx1="http://schemas.microsoft.com/office/drawing/2015/9/8/chartex" xmlns:cx2="http://schemas.microsoft.com/office/drawing/2015/10/21/chartex" xmlns:cx3="http://schemas.microsoft.com/office/drawing/2016/5/9/chartex" xmlns:cx4="http://schemas.microsoft.com/office/drawing/2016/5/10/chartex" xmlns:cx5="http://schemas.microsoft.com/office/drawing/2016/5/11/chartex" xmlns:cx6="http://schemas.microsoft.com/office/drawing/2016/5/12/chartex" xmlns:cx7="http://schemas.microsoft.com/office/drawing/2016/5/13/chartex" xmlns:cx8="http://schemas.microsoft.com/office/drawing/2016/5/14/chartex" xmlns:mc="http://schemas.openxmlformats.org/markup-compatibility/2006" xmlns:aink="http://schemas.microsoft.com/office/drawing/2016/ink" xmlns:am3d="http://schemas.microsoft.com/office/drawing/2017/model3d" xmlns:o="urn:schemas-microsoft-com:office:office" xmlns:r="http://schemas.openxmlformats.org/officeDocument/2006/relationships" xmlns:m="http://schemas.openxmlformats.org/officeDocument/2006/math" xmlns:v="urn:schemas-microsoft-com:vml" xmlns:wp14="http://schemas.microsoft.com/office/word/2010/wordprocessingDrawing" xmlns:wp="http://schemas.openxmlformats.org/drawingml/2006/wordprocessingDrawing" xmlns:w10="urn:schemas-microsoft-com:office:word" xmlns:w="http://schemas.openxmlformats.org/wordprocessingml/2006/main" xmlns:w14="http://schemas.microsoft.com/office/word/2010/wordml" xmlns:w15="http://schemas.microsoft.com/office/word/2012/wordml" xmlns:w16cex="http://schemas.microsoft.com/office/word/2018/wordml/cex" xmlns:w16cid="http://schemas.microsoft.com/office/word/2016/wordml/cid" xmlns:w16="http://schemas.microsoft.com/office/word/2018/wordml" xmlns:w16sdtdh="http://schemas.microsoft.com/office/word/2020/wordml/sdtdatahash" xmlns:w16se="http://schemas.microsoft.com/office/word/2015/wordml/symex" xmlns:wpg="http://schemas.microsoft.com/office/word/2010/wordprocessingGroup" xmlns:wpi="http://schemas.microsoft.com/office/word/2010/wordprocessingInk" xmlns:wne="http://schemas.microsoft.com/office/word/2006/wordml" xmlns:wps="http://schemas.microsoft.com/office/word/2010/wordprocessingShape"/>
-</file>
-
 <file path=word/endnotes.xml><?xml version="1.0" encoding="utf-8"?>
-<w:endnotes xmlns:wpc="http://schemas.microsoft.com/office/word/2010/wordprocessingCanvas" xmlns:mc="http://schemas.openxmlformats.org/markup-compatibility/2006" xmlns:o="urn:schemas-microsoft-com:office:office" xmlns:r="http://schemas.openxmlformats.org/officeDocument/2006/relationships" xmlns:m="http://schemas.openxmlformats.org/officeDocument/2006/math" xmlns:v="urn:schemas-microsoft-com:vml" xmlns:wp14="http://schemas.microsoft.com/office/word/2010/wordprocessingDrawing" xmlns:wp="http://schemas.openxmlformats.org/drawingml/2006/wordprocessingDrawing" xmlns:w10="urn:schemas-microsoft-com:office:word" xmlns:w="http://schemas.openxmlformats.org/wordprocessingml/2006/main" xmlns:w14="http://schemas.microsoft.com/office/word/2010/wordml" xmlns:w15="http://schemas.microsoft.com/office/word/2012/wordml" xmlns:wpg="http://schemas.microsoft.com/office/word/2010/wordprocessingGroup" xmlns:wpi="http://schemas.microsoft.com/office/word/2010/wordprocessingInk" xmlns:wne="http://schemas.microsoft.com/office/word/2006/wordml" xmlns:wps="http://schemas.microsoft.com/office/word/2010/wordprocessingShape" mc:Ignorable="w14 w15 wp14">
+<w:endnotes xmlns:wpc="http://schemas.microsoft.com/office/word/2010/wordprocessingCanvas" xmlns:cx="http://schemas.microsoft.com/office/drawing/2014/chartex" xmlns:cx1="http://schemas.microsoft.com/office/drawing/2015/9/8/chartex" xmlns:cx2="http://schemas.microsoft.com/office/drawing/2015/10/21/chartex" xmlns:cx3="http://schemas.microsoft.com/office/drawing/2016/5/9/chartex" xmlns:cx4="http://schemas.microsoft.com/office/drawing/2016/5/10/chartex" xmlns:cx5="http://schemas.microsoft.com/office/drawing/2016/5/11/chartex" xmlns:cx6="http://schemas.microsoft.com/office/drawing/2016/5/12/chartex" xmlns:cx7="http://schemas.microsoft.com/office/drawing/2016/5/13/chartex" xmlns:cx8="http://schemas.microsoft.com/office/drawing/2016/5/14/chartex" xmlns:mc="http://schemas.openxmlformats.org/markup-compatibility/2006" xmlns:aink="http://schemas.microsoft.com/office/drawing/2016/ink" xmlns:am3d="http://schemas.microsoft.com/office/drawing/2017/model3d" xmlns:o="urn:schemas-microsoft-com:office:office" xmlns:oel="http://schemas.microsoft.com/office/2019/extlst" xmlns:r="http://schemas.openxmlformats.org/officeDocument/2006/relationships" xmlns:m="http://schemas.openxmlformats.org/officeDocument/2006/math" xmlns:v="urn:schemas-microsoft-com:vml" xmlns:wp14="http://schemas.microsoft.com/office/word/2010/wordprocessingDrawing" xmlns:wp="http://schemas.openxmlformats.org/drawingml/2006/wordprocessingDrawing" xmlns:w10="urn:schemas-microsoft-com:office:word" xmlns:w="http://schemas.openxmlformats.org/wordprocessingml/2006/main" xmlns:w14="http://schemas.microsoft.com/office/word/2010/wordml" xmlns:w15="http://schemas.microsoft.com/office/word/2012/wordml" xmlns:w16cex="http://schemas.microsoft.com/office/word/2018/wordml/cex" xmlns:w16cid="http://schemas.microsoft.com/office/word/2016/wordml/cid" xmlns:w16="http://schemas.microsoft.com/office/word/2018/wordml" xmlns:w16du="http://schemas.microsoft.com/office/word/2023/wordml/word16du" xmlns:w16sdtdh="http://schemas.microsoft.com/office/word/2020/wordml/sdtdatahash" xmlns:w16sdtfl="http://schemas.microsoft.com/office/word/2024/wordml/sdtformatlock" xmlns:w16se="http://schemas.microsoft.com/office/word/2015/wordml/symex" xmlns:wpg="http://schemas.microsoft.com/office/word/2010/wordprocessingGroup" xmlns:wpi="http://schemas.microsoft.com/office/word/2010/wordprocessingInk" xmlns:wne="http://schemas.microsoft.com/office/word/2006/wordml" xmlns:wps="http://schemas.microsoft.com/office/word/2010/wordprocessingShape" mc:Ignorable="w14 w15 w16se w16cid w16 w16cex w16sdtdh w16sdtfl w16du wp14">
   <w:endnote w:type="separator" w:id="-1">
     <w:p>
-      <w:pPr>
-        <w:spacing w:after="0" w:line="240" w:lineRule="auto"/>
-      </w:pPr>
-      <w:r>
-        <w:rPr>
-          <w:rStyle w:val="EndnoteReference"/>
-        </w:rPr>
-        <w:endnoteRef/>
-      </w:r>
       <w:r>
         <w:separator/>
       </w:r>
@@ -2922,15 +2564,6 @@
   </w:endnote>
   <w:endnote w:type="continuationSeparator" w:id="0">
     <w:p>
-      <w:pPr>
-        <w:spacing w:after="0" w:line="240" w:lineRule="auto"/>
-      </w:pPr>
-      <w:r>
-        <w:rPr>
-          <w:rStyle w:val="EndnoteReference"/>
-        </w:rPr>
-        <w:endnoteRef/>
-      </w:r>
       <w:r>
         <w:continuationSeparator/>
       </w:r>
@@ -2940,7 +2573,7 @@
 </file>
 
 <file path=word/footer1.xml><?xml version="1.0" encoding="utf-8"?>
-<w:ftr xmlns:wpc="http://schemas.microsoft.com/office/word/2010/wordprocessingCanvas" xmlns:mc="http://schemas.openxmlformats.org/markup-compatibility/2006" xmlns:o="urn:schemas-microsoft-com:office:office" xmlns:r="http://schemas.openxmlformats.org/officeDocument/2006/relationships" xmlns:m="http://schemas.openxmlformats.org/officeDocument/2006/math" xmlns:v="urn:schemas-microsoft-com:vml" xmlns:wp14="http://schemas.microsoft.com/office/word/2010/wordprocessingDrawing" xmlns:wp="http://schemas.openxmlformats.org/drawingml/2006/wordprocessingDrawing" xmlns:w10="urn:schemas-microsoft-com:office:word" xmlns:w="http://schemas.openxmlformats.org/wordprocessingml/2006/main" xmlns:w14="http://schemas.microsoft.com/office/word/2010/wordml" xmlns:w15="http://schemas.microsoft.com/office/word/2012/wordml" xmlns:wpg="http://schemas.microsoft.com/office/word/2010/wordprocessingGroup" xmlns:wpi="http://schemas.microsoft.com/office/word/2010/wordprocessingInk" xmlns:wne="http://schemas.microsoft.com/office/word/2006/wordml" xmlns:wps="http://schemas.microsoft.com/office/word/2010/wordprocessingShape">
+<w:ftr xmlns:wpc="http://schemas.microsoft.com/office/word/2010/wordprocessingCanvas" xmlns:cx="http://schemas.microsoft.com/office/drawing/2014/chartex" xmlns:cx1="http://schemas.microsoft.com/office/drawing/2015/9/8/chartex" xmlns:cx2="http://schemas.microsoft.com/office/drawing/2015/10/21/chartex" xmlns:cx3="http://schemas.microsoft.com/office/drawing/2016/5/9/chartex" xmlns:cx4="http://schemas.microsoft.com/office/drawing/2016/5/10/chartex" xmlns:cx5="http://schemas.microsoft.com/office/drawing/2016/5/11/chartex" xmlns:cx6="http://schemas.microsoft.com/office/drawing/2016/5/12/chartex" xmlns:cx7="http://schemas.microsoft.com/office/drawing/2016/5/13/chartex" xmlns:cx8="http://schemas.microsoft.com/office/drawing/2016/5/14/chartex" xmlns:mc="http://schemas.openxmlformats.org/markup-compatibility/2006" xmlns:aink="http://schemas.microsoft.com/office/drawing/2016/ink" xmlns:am3d="http://schemas.microsoft.com/office/drawing/2017/model3d" xmlns:o="urn:schemas-microsoft-com:office:office" xmlns:oel="http://schemas.microsoft.com/office/2019/extlst" xmlns:r="http://schemas.openxmlformats.org/officeDocument/2006/relationships" xmlns:m="http://schemas.openxmlformats.org/officeDocument/2006/math" xmlns:v="urn:schemas-microsoft-com:vml" xmlns:wp14="http://schemas.microsoft.com/office/word/2010/wordprocessingDrawing" xmlns:wp="http://schemas.openxmlformats.org/drawingml/2006/wordprocessingDrawing" xmlns:w10="urn:schemas-microsoft-com:office:word" xmlns:w="http://schemas.openxmlformats.org/wordprocessingml/2006/main" xmlns:w14="http://schemas.microsoft.com/office/word/2010/wordml" xmlns:w15="http://schemas.microsoft.com/office/word/2012/wordml" xmlns:w16cex="http://schemas.microsoft.com/office/word/2018/wordml/cex" xmlns:w16cid="http://schemas.microsoft.com/office/word/2016/wordml/cid" xmlns:w16="http://schemas.microsoft.com/office/word/2018/wordml" xmlns:w16du="http://schemas.microsoft.com/office/word/2023/wordml/word16du" xmlns:w16sdtdh="http://schemas.microsoft.com/office/word/2020/wordml/sdtdatahash" xmlns:w16sdtfl="http://schemas.microsoft.com/office/word/2024/wordml/sdtformatlock" xmlns:w16se="http://schemas.microsoft.com/office/word/2015/wordml/symex" xmlns:wpg="http://schemas.microsoft.com/office/word/2010/wordprocessingGroup" xmlns:wpi="http://schemas.microsoft.com/office/word/2010/wordprocessingInk" xmlns:wne="http://schemas.microsoft.com/office/word/2006/wordml" xmlns:wps="http://schemas.microsoft.com/office/word/2010/wordprocessingShape" mc:Ignorable="w14 w15 w16se w16cid w16 w16cex w16sdtdh w16sdtfl w16du wp14">
   <w:p>
     <w:pPr>
       <w:jc w:val="right"/>
@@ -2951,7 +2584,43 @@
         <w:sz w:val="16"/>
         <w:szCs w:val="16"/>
       </w:rPr>
-      <w:t xml:space="preserve">MT Legal  ·  Instagram launch kit  ·  </w:t>
+      <w:t xml:space="preserve">MT </w:t>
+    </w:r>
+    <w:proofErr w:type="gramStart"/>
+    <w:r>
+      <w:rPr>
+        <w:color w:val="5A606A"/>
+        <w:sz w:val="16"/>
+        <w:szCs w:val="16"/>
+      </w:rPr>
+      <w:t>Legal  ·</w:t>
+    </w:r>
+    <w:proofErr w:type="gramEnd"/>
+    <w:r>
+      <w:rPr>
+        <w:color w:val="5A606A"/>
+        <w:sz w:val="16"/>
+        <w:szCs w:val="16"/>
+      </w:rPr>
+      <w:t xml:space="preserve">  Instagram launch </w:t>
+    </w:r>
+    <w:proofErr w:type="gramStart"/>
+    <w:r>
+      <w:rPr>
+        <w:color w:val="5A606A"/>
+        <w:sz w:val="16"/>
+        <w:szCs w:val="16"/>
+      </w:rPr>
+      <w:t>kit  ·</w:t>
+    </w:r>
+    <w:proofErr w:type="gramEnd"/>
+    <w:r>
+      <w:rPr>
+        <w:color w:val="5A606A"/>
+        <w:sz w:val="16"/>
+        <w:szCs w:val="16"/>
+      </w:rPr>
+      <w:t xml:space="preserve">  </w:t>
     </w:r>
     <w:r>
       <w:rPr>
@@ -2960,8 +2629,38 @@
         <w:szCs w:val="16"/>
       </w:rPr>
       <w:fldChar w:fldCharType="begin"/>
-      <w:instrText xml:space="preserve">PAGE</w:instrText>
+    </w:r>
+    <w:r>
+      <w:rPr>
+        <w:color w:val="5A606A"/>
+        <w:sz w:val="16"/>
+        <w:szCs w:val="16"/>
+      </w:rPr>
+      <w:instrText>PAGE</w:instrText>
+    </w:r>
+    <w:r>
+      <w:rPr>
+        <w:color w:val="5A606A"/>
+        <w:sz w:val="16"/>
+        <w:szCs w:val="16"/>
+      </w:rPr>
       <w:fldChar w:fldCharType="separate"/>
+    </w:r>
+    <w:r>
+      <w:rPr>
+        <w:noProof/>
+        <w:color w:val="5A606A"/>
+        <w:sz w:val="16"/>
+        <w:szCs w:val="16"/>
+      </w:rPr>
+      <w:t>1</w:t>
+    </w:r>
+    <w:r>
+      <w:rPr>
+        <w:color w:val="5A606A"/>
+        <w:sz w:val="16"/>
+        <w:szCs w:val="16"/>
+      </w:rPr>
       <w:fldChar w:fldCharType="end"/>
     </w:r>
   </w:p>
@@ -2969,18 +2668,9 @@
 </file>
 
 <file path=word/footnotes.xml><?xml version="1.0" encoding="utf-8"?>
-<w:footnotes xmlns:wpc="http://schemas.microsoft.com/office/word/2010/wordprocessingCanvas" xmlns:mc="http://schemas.openxmlformats.org/markup-compatibility/2006" xmlns:o="urn:schemas-microsoft-com:office:office" xmlns:r="http://schemas.openxmlformats.org/officeDocument/2006/relationships" xmlns:m="http://schemas.openxmlformats.org/officeDocument/2006/math" xmlns:v="urn:schemas-microsoft-com:vml" xmlns:wp14="http://schemas.microsoft.com/office/word/2010/wordprocessingDrawing" xmlns:wp="http://schemas.openxmlformats.org/drawingml/2006/wordprocessingDrawing" xmlns:w10="urn:schemas-microsoft-com:office:word" xmlns:w="http://schemas.openxmlformats.org/wordprocessingml/2006/main" xmlns:w14="http://schemas.microsoft.com/office/word/2010/wordml" xmlns:w15="http://schemas.microsoft.com/office/word/2012/wordml" xmlns:wpg="http://schemas.microsoft.com/office/word/2010/wordprocessingGroup" xmlns:wpi="http://schemas.microsoft.com/office/word/2010/wordprocessingInk" xmlns:wne="http://schemas.microsoft.com/office/word/2006/wordml" xmlns:wps="http://schemas.microsoft.com/office/word/2010/wordprocessingShape" mc:Ignorable="w14 w15 wp14">
+<w:footnotes xmlns:wpc="http://schemas.microsoft.com/office/word/2010/wordprocessingCanvas" xmlns:cx="http://schemas.microsoft.com/office/drawing/2014/chartex" xmlns:cx1="http://schemas.microsoft.com/office/drawing/2015/9/8/chartex" xmlns:cx2="http://schemas.microsoft.com/office/drawing/2015/10/21/chartex" xmlns:cx3="http://schemas.microsoft.com/office/drawing/2016/5/9/chartex" xmlns:cx4="http://schemas.microsoft.com/office/drawing/2016/5/10/chartex" xmlns:cx5="http://schemas.microsoft.com/office/drawing/2016/5/11/chartex" xmlns:cx6="http://schemas.microsoft.com/office/drawing/2016/5/12/chartex" xmlns:cx7="http://schemas.microsoft.com/office/drawing/2016/5/13/chartex" xmlns:cx8="http://schemas.microsoft.com/office/drawing/2016/5/14/chartex" xmlns:mc="http://schemas.openxmlformats.org/markup-compatibility/2006" xmlns:aink="http://schemas.microsoft.com/office/drawing/2016/ink" xmlns:am3d="http://schemas.microsoft.com/office/drawing/2017/model3d" xmlns:o="urn:schemas-microsoft-com:office:office" xmlns:oel="http://schemas.microsoft.com/office/2019/extlst" xmlns:r="http://schemas.openxmlformats.org/officeDocument/2006/relationships" xmlns:m="http://schemas.openxmlformats.org/officeDocument/2006/math" xmlns:v="urn:schemas-microsoft-com:vml" xmlns:wp14="http://schemas.microsoft.com/office/word/2010/wordprocessingDrawing" xmlns:wp="http://schemas.openxmlformats.org/drawingml/2006/wordprocessingDrawing" xmlns:w10="urn:schemas-microsoft-com:office:word" xmlns:w="http://schemas.openxmlformats.org/wordprocessingml/2006/main" xmlns:w14="http://schemas.microsoft.com/office/word/2010/wordml" xmlns:w15="http://schemas.microsoft.com/office/word/2012/wordml" xmlns:w16cex="http://schemas.microsoft.com/office/word/2018/wordml/cex" xmlns:w16cid="http://schemas.microsoft.com/office/word/2016/wordml/cid" xmlns:w16="http://schemas.microsoft.com/office/word/2018/wordml" xmlns:w16du="http://schemas.microsoft.com/office/word/2023/wordml/word16du" xmlns:w16sdtdh="http://schemas.microsoft.com/office/word/2020/wordml/sdtdatahash" xmlns:w16sdtfl="http://schemas.microsoft.com/office/word/2024/wordml/sdtformatlock" xmlns:w16se="http://schemas.microsoft.com/office/word/2015/wordml/symex" xmlns:wpg="http://schemas.microsoft.com/office/word/2010/wordprocessingGroup" xmlns:wpi="http://schemas.microsoft.com/office/word/2010/wordprocessingInk" xmlns:wne="http://schemas.microsoft.com/office/word/2006/wordml" xmlns:wps="http://schemas.microsoft.com/office/word/2010/wordprocessingShape" mc:Ignorable="w14 w15 w16se w16cid w16 w16cex w16sdtdh w16sdtfl w16du wp14">
   <w:footnote w:type="separator" w:id="-1">
     <w:p>
-      <w:pPr>
-        <w:spacing w:after="0" w:line="240" w:lineRule="auto"/>
-      </w:pPr>
-      <w:r>
-        <w:rPr>
-          <w:rStyle w:val="FootnoteReference"/>
-        </w:rPr>
-        <w:footnoteRef/>
-      </w:r>
       <w:r>
         <w:separator/>
       </w:r>
@@ -2988,15 +2678,6 @@
   </w:footnote>
   <w:footnote w:type="continuationSeparator" w:id="0">
     <w:p>
-      <w:pPr>
-        <w:spacing w:after="0" w:line="240" w:lineRule="auto"/>
-      </w:pPr>
-      <w:r>
-        <w:rPr>
-          <w:rStyle w:val="FootnoteReference"/>
-        </w:rPr>
-        <w:footnoteRef/>
-      </w:r>
       <w:r>
         <w:continuationSeparator/>
       </w:r>
@@ -3006,10 +2687,12 @@
 </file>
 
 <file path=word/numbering.xml><?xml version="1.0" encoding="utf-8"?>
-<w:numbering xmlns:wpc="http://schemas.microsoft.com/office/word/2010/wordprocessingCanvas" xmlns:mc="http://schemas.openxmlformats.org/markup-compatibility/2006" xmlns:o="urn:schemas-microsoft-com:office:office" xmlns:r="http://schemas.openxmlformats.org/officeDocument/2006/relationships" xmlns:m="http://schemas.openxmlformats.org/officeDocument/2006/math" xmlns:v="urn:schemas-microsoft-com:vml" xmlns:wp14="http://schemas.microsoft.com/office/word/2010/wordprocessingDrawing" xmlns:wp="http://schemas.openxmlformats.org/drawingml/2006/wordprocessingDrawing" xmlns:w10="urn:schemas-microsoft-com:office:word" xmlns:w="http://schemas.openxmlformats.org/wordprocessingml/2006/main" xmlns:w14="http://schemas.microsoft.com/office/word/2010/wordml" xmlns:w15="http://schemas.microsoft.com/office/word/2012/wordml" xmlns:wpg="http://schemas.microsoft.com/office/word/2010/wordprocessingGroup" xmlns:wpi="http://schemas.microsoft.com/office/word/2010/wordprocessingInk" xmlns:wne="http://schemas.microsoft.com/office/word/2006/wordml" xmlns:wps="http://schemas.microsoft.com/office/word/2010/wordprocessingShape" mc:Ignorable="w14 w15 wp14">
-  <w:abstractNum w:abstractNumId="1" w15:restartNumberingAfterBreak="0">
+<w:numbering xmlns:wpc="http://schemas.microsoft.com/office/word/2010/wordprocessingCanvas" xmlns:cx="http://schemas.microsoft.com/office/drawing/2014/chartex" xmlns:cx1="http://schemas.microsoft.com/office/drawing/2015/9/8/chartex" xmlns:cx2="http://schemas.microsoft.com/office/drawing/2015/10/21/chartex" xmlns:cx3="http://schemas.microsoft.com/office/drawing/2016/5/9/chartex" xmlns:cx4="http://schemas.microsoft.com/office/drawing/2016/5/10/chartex" xmlns:cx5="http://schemas.microsoft.com/office/drawing/2016/5/11/chartex" xmlns:cx6="http://schemas.microsoft.com/office/drawing/2016/5/12/chartex" xmlns:cx7="http://schemas.microsoft.com/office/drawing/2016/5/13/chartex" xmlns:cx8="http://schemas.microsoft.com/office/drawing/2016/5/14/chartex" xmlns:mc="http://schemas.openxmlformats.org/markup-compatibility/2006" xmlns:aink="http://schemas.microsoft.com/office/drawing/2016/ink" xmlns:am3d="http://schemas.microsoft.com/office/drawing/2017/model3d" xmlns:o="urn:schemas-microsoft-com:office:office" xmlns:oel="http://schemas.microsoft.com/office/2019/extlst" xmlns:r="http://schemas.openxmlformats.org/officeDocument/2006/relationships" xmlns:m="http://schemas.openxmlformats.org/officeDocument/2006/math" xmlns:v="urn:schemas-microsoft-com:vml" xmlns:wp14="http://schemas.microsoft.com/office/word/2010/wordprocessingDrawing" xmlns:wp="http://schemas.openxmlformats.org/drawingml/2006/wordprocessingDrawing" xmlns:w10="urn:schemas-microsoft-com:office:word" xmlns:w="http://schemas.openxmlformats.org/wordprocessingml/2006/main" xmlns:w14="http://schemas.microsoft.com/office/word/2010/wordml" xmlns:w15="http://schemas.microsoft.com/office/word/2012/wordml" xmlns:w16cex="http://schemas.microsoft.com/office/word/2018/wordml/cex" xmlns:w16cid="http://schemas.microsoft.com/office/word/2016/wordml/cid" xmlns:w16="http://schemas.microsoft.com/office/word/2018/wordml" xmlns:w16du="http://schemas.microsoft.com/office/word/2023/wordml/word16du" xmlns:w16sdtdh="http://schemas.microsoft.com/office/word/2020/wordml/sdtdatahash" xmlns:w16sdtfl="http://schemas.microsoft.com/office/word/2024/wordml/sdtformatlock" xmlns:w16se="http://schemas.microsoft.com/office/word/2015/wordml/symex" xmlns:wpg="http://schemas.microsoft.com/office/word/2010/wordprocessingGroup" xmlns:wpi="http://schemas.microsoft.com/office/word/2010/wordprocessingInk" xmlns:wne="http://schemas.microsoft.com/office/word/2006/wordml" xmlns:wps="http://schemas.microsoft.com/office/word/2010/wordprocessingShape" mc:Ignorable="w14 w15 w16se w16cid w16 w16cex w16sdtdh w16sdtfl w16du wp14">
+  <w:abstractNum w:abstractNumId="0" w15:restartNumberingAfterBreak="0">
+    <w:nsid w:val="506B5992"/>
     <w:multiLevelType w:val="hybridMultilevel"/>
-    <w:lvl w:ilvl="0" w15:tentative="1">
+    <w:tmpl w:val="D7AC7BDC"/>
+    <w:lvl w:ilvl="0" w:tplc="1EA4F1CA">
       <w:start w:val="1"/>
       <w:numFmt w:val="bullet"/>
       <w:lvlText w:val="●"/>
@@ -3018,7 +2701,7 @@
         <w:ind w:left="720" w:hanging="360"/>
       </w:pPr>
     </w:lvl>
-    <w:lvl w:ilvl="1" w15:tentative="1">
+    <w:lvl w:ilvl="1" w:tplc="7ADCE32C">
       <w:start w:val="1"/>
       <w:numFmt w:val="bullet"/>
       <w:lvlText w:val="○"/>
@@ -3027,7 +2710,7 @@
         <w:ind w:left="1440" w:hanging="360"/>
       </w:pPr>
     </w:lvl>
-    <w:lvl w:ilvl="2" w15:tentative="1">
+    <w:lvl w:ilvl="2" w:tplc="BCDAA520">
       <w:start w:val="1"/>
       <w:numFmt w:val="bullet"/>
       <w:lvlText w:val="■"/>
@@ -3036,7 +2719,7 @@
         <w:ind w:left="2160" w:hanging="360"/>
       </w:pPr>
     </w:lvl>
-    <w:lvl w:ilvl="3" w15:tentative="1">
+    <w:lvl w:ilvl="3" w:tplc="553A1B16">
       <w:start w:val="1"/>
       <w:numFmt w:val="bullet"/>
       <w:lvlText w:val="●"/>
@@ -3045,7 +2728,7 @@
         <w:ind w:left="2880" w:hanging="360"/>
       </w:pPr>
     </w:lvl>
-    <w:lvl w:ilvl="4" w15:tentative="1">
+    <w:lvl w:ilvl="4" w:tplc="9F9E21DE">
       <w:start w:val="1"/>
       <w:numFmt w:val="bullet"/>
       <w:lvlText w:val="○"/>
@@ -3054,7 +2737,7 @@
         <w:ind w:left="3600" w:hanging="360"/>
       </w:pPr>
     </w:lvl>
-    <w:lvl w:ilvl="5" w15:tentative="1">
+    <w:lvl w:ilvl="5" w:tplc="89AC3602">
       <w:start w:val="1"/>
       <w:numFmt w:val="bullet"/>
       <w:lvlText w:val="■"/>
@@ -3063,7 +2746,7 @@
         <w:ind w:left="4320" w:hanging="360"/>
       </w:pPr>
     </w:lvl>
-    <w:lvl w:ilvl="6" w15:tentative="1">
+    <w:lvl w:ilvl="6" w:tplc="556C8B2E">
       <w:start w:val="1"/>
       <w:numFmt w:val="bullet"/>
       <w:lvlText w:val="●"/>
@@ -3072,7 +2755,7 @@
         <w:ind w:left="5040" w:hanging="360"/>
       </w:pPr>
     </w:lvl>
-    <w:lvl w:ilvl="7" w15:tentative="1">
+    <w:lvl w:ilvl="7" w:tplc="0FDA79A2">
       <w:start w:val="1"/>
       <w:numFmt w:val="bullet"/>
       <w:lvlText w:val="●"/>
@@ -3081,7 +2764,7 @@
         <w:ind w:left="5760" w:hanging="360"/>
       </w:pPr>
     </w:lvl>
-    <w:lvl w:ilvl="8" w15:tentative="1">
+    <w:lvl w:ilvl="8" w:tplc="D8560692">
       <w:start w:val="1"/>
       <w:numFmt w:val="bullet"/>
       <w:lvlText w:val="●"/>
@@ -3091,9 +2774,11 @@
       </w:pPr>
     </w:lvl>
   </w:abstractNum>
-  <w:abstractNum w:abstractNumId="2" w15:restartNumberingAfterBreak="0">
+  <w:abstractNum w:abstractNumId="1" w15:restartNumberingAfterBreak="0">
+    <w:nsid w:val="56D020D3"/>
     <w:multiLevelType w:val="hybridMultilevel"/>
-    <w:lvl w:ilvl="0" w15:tentative="1">
+    <w:tmpl w:val="EDC2E112"/>
+    <w:lvl w:ilvl="0" w:tplc="11DEEDA0">
       <w:start w:val="1"/>
       <w:numFmt w:val="bullet"/>
       <w:lvlText w:val="•"/>
@@ -3102,15 +2787,55 @@
         <w:ind w:left="540" w:hanging="270"/>
       </w:pPr>
     </w:lvl>
+    <w:lvl w:ilvl="1" w:tplc="C24A0738">
+      <w:numFmt w:val="decimal"/>
+      <w:lvlText w:val=""/>
+      <w:lvlJc w:val="left"/>
+    </w:lvl>
+    <w:lvl w:ilvl="2" w:tplc="73A614A6">
+      <w:numFmt w:val="decimal"/>
+      <w:lvlText w:val=""/>
+      <w:lvlJc w:val="left"/>
+    </w:lvl>
+    <w:lvl w:ilvl="3" w:tplc="9664238C">
+      <w:numFmt w:val="decimal"/>
+      <w:lvlText w:val=""/>
+      <w:lvlJc w:val="left"/>
+    </w:lvl>
+    <w:lvl w:ilvl="4" w:tplc="F7C6FA52">
+      <w:numFmt w:val="decimal"/>
+      <w:lvlText w:val=""/>
+      <w:lvlJc w:val="left"/>
+    </w:lvl>
+    <w:lvl w:ilvl="5" w:tplc="AFD658A2">
+      <w:numFmt w:val="decimal"/>
+      <w:lvlText w:val=""/>
+      <w:lvlJc w:val="left"/>
+    </w:lvl>
+    <w:lvl w:ilvl="6" w:tplc="96B05580">
+      <w:numFmt w:val="decimal"/>
+      <w:lvlText w:val=""/>
+      <w:lvlJc w:val="left"/>
+    </w:lvl>
+    <w:lvl w:ilvl="7" w:tplc="9F286970">
+      <w:numFmt w:val="decimal"/>
+      <w:lvlText w:val=""/>
+      <w:lvlJc w:val="left"/>
+    </w:lvl>
+    <w:lvl w:ilvl="8" w:tplc="5150DAD8">
+      <w:numFmt w:val="decimal"/>
+      <w:lvlText w:val=""/>
+      <w:lvlJc w:val="left"/>
+    </w:lvl>
   </w:abstractNum>
-  <w:num w:numId="1">
-    <w:abstractNumId w:val="1"/>
+  <w:num w:numId="1" w16cid:durableId="107429671">
+    <w:abstractNumId w:val="0"/>
     <w:lvlOverride w:ilvl="0">
       <w:startOverride w:val="1"/>
     </w:lvlOverride>
   </w:num>
-  <w:num w:numId="2">
-    <w:abstractNumId w:val="2"/>
+  <w:num w:numId="2" w16cid:durableId="1972248589">
+    <w:abstractNumId w:val="1"/>
     <w:lvlOverride w:ilvl="0">
       <w:startOverride w:val="1"/>
     </w:lvlOverride>
@@ -3119,55 +2844,441 @@
 </file>
 
 <file path=word/styles.xml><?xml version="1.0" encoding="utf-8"?>
-<w:styles xmlns:mc="http://schemas.openxmlformats.org/markup-compatibility/2006" xmlns:r="http://schemas.openxmlformats.org/officeDocument/2006/relationships" xmlns:w="http://schemas.openxmlformats.org/wordprocessingml/2006/main" xmlns:w14="http://schemas.microsoft.com/office/word/2010/wordml" xmlns:w15="http://schemas.microsoft.com/office/word/2012/wordml" mc:Ignorable="w14 w15">
+<w:styles xmlns:mc="http://schemas.openxmlformats.org/markup-compatibility/2006" xmlns:r="http://schemas.openxmlformats.org/officeDocument/2006/relationships" xmlns:w="http://schemas.openxmlformats.org/wordprocessingml/2006/main" xmlns:w14="http://schemas.microsoft.com/office/word/2010/wordml" xmlns:w15="http://schemas.microsoft.com/office/word/2012/wordml" xmlns:w16cex="http://schemas.microsoft.com/office/word/2018/wordml/cex" xmlns:w16cid="http://schemas.microsoft.com/office/word/2016/wordml/cid" xmlns:w16="http://schemas.microsoft.com/office/word/2018/wordml" xmlns:w16du="http://schemas.microsoft.com/office/word/2023/wordml/word16du" xmlns:w16sdtdh="http://schemas.microsoft.com/office/word/2020/wordml/sdtdatahash" xmlns:w16sdtfl="http://schemas.microsoft.com/office/word/2024/wordml/sdtformatlock" xmlns:w16se="http://schemas.microsoft.com/office/word/2015/wordml/symex" mc:Ignorable="w14 w15 w16se w16cid w16 w16cex w16sdtdh w16sdtfl w16du">
   <w:docDefaults>
     <w:rPrDefault>
       <w:rPr>
-        <w:rFonts w:ascii="Calibri" w:cs="Calibri" w:eastAsia="Calibri" w:hAnsi="Calibri"/>
+        <w:rFonts w:ascii="Calibri" w:eastAsia="Calibri" w:hAnsi="Calibri" w:cs="Calibri"/>
         <w:color w:val="39414F"/>
         <w:sz w:val="21"/>
         <w:szCs w:val="21"/>
+        <w:lang w:val="en-US" w:eastAsia="en-US" w:bidi="ar-SA"/>
       </w:rPr>
     </w:rPrDefault>
     <w:pPrDefault/>
   </w:docDefaults>
-  <w:style w:type="paragraph" w:styleId="Title">
-    <w:name w:val="Title"/>
-    <w:basedOn w:val="Normal"/>
-    <w:next w:val="Normal"/>
+  <w:latentStyles w:defLockedState="0" w:defUIPriority="99" w:defSemiHidden="0" w:defUnhideWhenUsed="0" w:defQFormat="0" w:count="376">
+    <w:lsdException w:name="Normal" w:uiPriority="0" w:qFormat="1"/>
+    <w:lsdException w:name="heading 1" w:uiPriority="9" w:qFormat="1"/>
+    <w:lsdException w:name="heading 2" w:semiHidden="1" w:uiPriority="9" w:unhideWhenUsed="1" w:qFormat="1"/>
+    <w:lsdException w:name="heading 3" w:semiHidden="1" w:uiPriority="9" w:unhideWhenUsed="1" w:qFormat="1"/>
+    <w:lsdException w:name="heading 4" w:semiHidden="1" w:uiPriority="9" w:unhideWhenUsed="1" w:qFormat="1"/>
+    <w:lsdException w:name="heading 5" w:semiHidden="1" w:uiPriority="9" w:unhideWhenUsed="1" w:qFormat="1"/>
+    <w:lsdException w:name="heading 6" w:semiHidden="1" w:uiPriority="9" w:unhideWhenUsed="1" w:qFormat="1"/>
+    <w:lsdException w:name="heading 7" w:semiHidden="1" w:uiPriority="9" w:unhideWhenUsed="1" w:qFormat="1"/>
+    <w:lsdException w:name="heading 8" w:semiHidden="1" w:uiPriority="9" w:unhideWhenUsed="1" w:qFormat="1"/>
+    <w:lsdException w:name="heading 9" w:semiHidden="1" w:uiPriority="9" w:unhideWhenUsed="1" w:qFormat="1"/>
+    <w:lsdException w:name="index 1" w:semiHidden="1" w:unhideWhenUsed="1"/>
+    <w:lsdException w:name="index 2" w:semiHidden="1" w:unhideWhenUsed="1"/>
+    <w:lsdException w:name="index 3" w:semiHidden="1" w:unhideWhenUsed="1"/>
+    <w:lsdException w:name="index 4" w:semiHidden="1" w:unhideWhenUsed="1"/>
+    <w:lsdException w:name="index 5" w:semiHidden="1" w:unhideWhenUsed="1"/>
+    <w:lsdException w:name="index 6" w:semiHidden="1" w:unhideWhenUsed="1"/>
+    <w:lsdException w:name="index 7" w:semiHidden="1" w:unhideWhenUsed="1"/>
+    <w:lsdException w:name="index 8" w:semiHidden="1" w:unhideWhenUsed="1"/>
+    <w:lsdException w:name="index 9" w:semiHidden="1" w:unhideWhenUsed="1"/>
+    <w:lsdException w:name="toc 1" w:semiHidden="1" w:uiPriority="39" w:unhideWhenUsed="1"/>
+    <w:lsdException w:name="toc 2" w:semiHidden="1" w:uiPriority="39" w:unhideWhenUsed="1"/>
+    <w:lsdException w:name="toc 3" w:semiHidden="1" w:uiPriority="39" w:unhideWhenUsed="1"/>
+    <w:lsdException w:name="toc 4" w:semiHidden="1" w:uiPriority="39" w:unhideWhenUsed="1"/>
+    <w:lsdException w:name="toc 5" w:semiHidden="1" w:uiPriority="39" w:unhideWhenUsed="1"/>
+    <w:lsdException w:name="toc 6" w:semiHidden="1" w:uiPriority="39" w:unhideWhenUsed="1"/>
+    <w:lsdException w:name="toc 7" w:semiHidden="1" w:uiPriority="39" w:unhideWhenUsed="1"/>
+    <w:lsdException w:name="toc 8" w:semiHidden="1" w:uiPriority="39" w:unhideWhenUsed="1"/>
+    <w:lsdException w:name="toc 9" w:semiHidden="1" w:uiPriority="39" w:unhideWhenUsed="1"/>
+    <w:lsdException w:name="Normal Indent" w:semiHidden="1" w:unhideWhenUsed="1"/>
+    <w:lsdException w:name="footnote text" w:semiHidden="1" w:unhideWhenUsed="1"/>
+    <w:lsdException w:name="annotation text" w:semiHidden="1" w:unhideWhenUsed="1"/>
+    <w:lsdException w:name="header" w:semiHidden="1" w:unhideWhenUsed="1"/>
+    <w:lsdException w:name="footer" w:semiHidden="1" w:unhideWhenUsed="1"/>
+    <w:lsdException w:name="index heading" w:semiHidden="1" w:unhideWhenUsed="1"/>
+    <w:lsdException w:name="caption" w:semiHidden="1" w:uiPriority="35" w:unhideWhenUsed="1" w:qFormat="1"/>
+    <w:lsdException w:name="table of figures" w:semiHidden="1" w:unhideWhenUsed="1"/>
+    <w:lsdException w:name="envelope address" w:semiHidden="1" w:unhideWhenUsed="1"/>
+    <w:lsdException w:name="envelope return" w:semiHidden="1" w:unhideWhenUsed="1"/>
+    <w:lsdException w:name="footnote reference" w:semiHidden="1" w:unhideWhenUsed="1"/>
+    <w:lsdException w:name="annotation reference" w:semiHidden="1" w:unhideWhenUsed="1"/>
+    <w:lsdException w:name="line number" w:semiHidden="1" w:unhideWhenUsed="1"/>
+    <w:lsdException w:name="page number" w:semiHidden="1" w:unhideWhenUsed="1"/>
+    <w:lsdException w:name="endnote reference" w:semiHidden="1" w:unhideWhenUsed="1"/>
+    <w:lsdException w:name="endnote text" w:semiHidden="1" w:unhideWhenUsed="1"/>
+    <w:lsdException w:name="table of authorities" w:semiHidden="1" w:unhideWhenUsed="1"/>
+    <w:lsdException w:name="macro" w:semiHidden="1" w:unhideWhenUsed="1"/>
+    <w:lsdException w:name="toa heading" w:semiHidden="1" w:unhideWhenUsed="1"/>
+    <w:lsdException w:name="List" w:semiHidden="1" w:unhideWhenUsed="1"/>
+    <w:lsdException w:name="List Bullet" w:semiHidden="1" w:unhideWhenUsed="1"/>
+    <w:lsdException w:name="List Number" w:semiHidden="1" w:unhideWhenUsed="1"/>
+    <w:lsdException w:name="List 2" w:semiHidden="1" w:unhideWhenUsed="1"/>
+    <w:lsdException w:name="List 3" w:semiHidden="1" w:unhideWhenUsed="1"/>
+    <w:lsdException w:name="List 4" w:semiHidden="1" w:unhideWhenUsed="1"/>
+    <w:lsdException w:name="List 5" w:semiHidden="1" w:unhideWhenUsed="1"/>
+    <w:lsdException w:name="List Bullet 2" w:semiHidden="1" w:unhideWhenUsed="1"/>
+    <w:lsdException w:name="List Bullet 3" w:semiHidden="1" w:unhideWhenUsed="1"/>
+    <w:lsdException w:name="List Bullet 4" w:semiHidden="1" w:unhideWhenUsed="1"/>
+    <w:lsdException w:name="List Bullet 5" w:semiHidden="1" w:unhideWhenUsed="1"/>
+    <w:lsdException w:name="List Number 2" w:semiHidden="1" w:unhideWhenUsed="1"/>
+    <w:lsdException w:name="List Number 3" w:semiHidden="1" w:unhideWhenUsed="1"/>
+    <w:lsdException w:name="List Number 4" w:semiHidden="1" w:unhideWhenUsed="1"/>
+    <w:lsdException w:name="List Number 5" w:semiHidden="1" w:unhideWhenUsed="1"/>
+    <w:lsdException w:name="Title" w:uiPriority="10" w:qFormat="1"/>
+    <w:lsdException w:name="Closing" w:semiHidden="1" w:unhideWhenUsed="1"/>
+    <w:lsdException w:name="Signature" w:semiHidden="1" w:unhideWhenUsed="1"/>
+    <w:lsdException w:name="Default Paragraph Font" w:semiHidden="1" w:uiPriority="1" w:unhideWhenUsed="1"/>
+    <w:lsdException w:name="Body Text" w:semiHidden="1" w:unhideWhenUsed="1"/>
+    <w:lsdException w:name="Body Text Indent" w:semiHidden="1" w:unhideWhenUsed="1"/>
+    <w:lsdException w:name="List Continue" w:semiHidden="1" w:unhideWhenUsed="1"/>
+    <w:lsdException w:name="List Continue 2" w:semiHidden="1" w:unhideWhenUsed="1"/>
+    <w:lsdException w:name="List Continue 3" w:semiHidden="1" w:unhideWhenUsed="1"/>
+    <w:lsdException w:name="List Continue 4" w:semiHidden="1" w:unhideWhenUsed="1"/>
+    <w:lsdException w:name="List Continue 5" w:semiHidden="1" w:unhideWhenUsed="1"/>
+    <w:lsdException w:name="Message Header" w:semiHidden="1" w:unhideWhenUsed="1"/>
+    <w:lsdException w:name="Subtitle" w:uiPriority="11" w:qFormat="1"/>
+    <w:lsdException w:name="Salutation" w:semiHidden="1" w:unhideWhenUsed="1"/>
+    <w:lsdException w:name="Date" w:semiHidden="1" w:unhideWhenUsed="1"/>
+    <w:lsdException w:name="Body Text First Indent" w:semiHidden="1" w:unhideWhenUsed="1"/>
+    <w:lsdException w:name="Body Text First Indent 2" w:semiHidden="1" w:unhideWhenUsed="1"/>
+    <w:lsdException w:name="Note Heading" w:semiHidden="1" w:unhideWhenUsed="1"/>
+    <w:lsdException w:name="Body Text 2" w:semiHidden="1" w:unhideWhenUsed="1"/>
+    <w:lsdException w:name="Body Text 3" w:semiHidden="1" w:unhideWhenUsed="1"/>
+    <w:lsdException w:name="Body Text Indent 2" w:semiHidden="1" w:unhideWhenUsed="1"/>
+    <w:lsdException w:name="Body Text Indent 3" w:semiHidden="1" w:unhideWhenUsed="1"/>
+    <w:lsdException w:name="Block Text" w:semiHidden="1" w:unhideWhenUsed="1"/>
+    <w:lsdException w:name="Hyperlink" w:semiHidden="1" w:unhideWhenUsed="1"/>
+    <w:lsdException w:name="FollowedHyperlink" w:semiHidden="1" w:unhideWhenUsed="1"/>
+    <w:lsdException w:name="Strong" w:uiPriority="22" w:qFormat="1"/>
+    <w:lsdException w:name="Emphasis" w:uiPriority="20" w:qFormat="1"/>
+    <w:lsdException w:name="Document Map" w:semiHidden="1" w:unhideWhenUsed="1"/>
+    <w:lsdException w:name="Plain Text" w:semiHidden="1" w:unhideWhenUsed="1"/>
+    <w:lsdException w:name="E-mail Signature" w:semiHidden="1" w:unhideWhenUsed="1"/>
+    <w:lsdException w:name="HTML Top of Form" w:semiHidden="1" w:unhideWhenUsed="1"/>
+    <w:lsdException w:name="HTML Bottom of Form" w:semiHidden="1" w:unhideWhenUsed="1"/>
+    <w:lsdException w:name="Normal (Web)" w:semiHidden="1" w:unhideWhenUsed="1"/>
+    <w:lsdException w:name="HTML Acronym" w:semiHidden="1" w:unhideWhenUsed="1"/>
+    <w:lsdException w:name="HTML Address" w:semiHidden="1" w:unhideWhenUsed="1"/>
+    <w:lsdException w:name="HTML Cite" w:semiHidden="1" w:unhideWhenUsed="1"/>
+    <w:lsdException w:name="HTML Code" w:semiHidden="1" w:unhideWhenUsed="1"/>
+    <w:lsdException w:name="HTML Definition" w:semiHidden="1" w:unhideWhenUsed="1"/>
+    <w:lsdException w:name="HTML Keyboard" w:semiHidden="1" w:unhideWhenUsed="1"/>
+    <w:lsdException w:name="HTML Preformatted" w:semiHidden="1" w:unhideWhenUsed="1"/>
+    <w:lsdException w:name="HTML Sample" w:semiHidden="1" w:unhideWhenUsed="1"/>
+    <w:lsdException w:name="HTML Typewriter" w:semiHidden="1" w:unhideWhenUsed="1"/>
+    <w:lsdException w:name="HTML Variable" w:semiHidden="1" w:unhideWhenUsed="1"/>
+    <w:lsdException w:name="Normal Table" w:semiHidden="1" w:unhideWhenUsed="1"/>
+    <w:lsdException w:name="annotation subject" w:semiHidden="1" w:unhideWhenUsed="1"/>
+    <w:lsdException w:name="No List" w:semiHidden="1" w:unhideWhenUsed="1"/>
+    <w:lsdException w:name="Outline List 1" w:semiHidden="1" w:unhideWhenUsed="1"/>
+    <w:lsdException w:name="Outline List 2" w:semiHidden="1" w:unhideWhenUsed="1"/>
+    <w:lsdException w:name="Outline List 3" w:semiHidden="1" w:unhideWhenUsed="1"/>
+    <w:lsdException w:name="Table Simple 1" w:semiHidden="1" w:unhideWhenUsed="1"/>
+    <w:lsdException w:name="Table Simple 2" w:semiHidden="1" w:unhideWhenUsed="1"/>
+    <w:lsdException w:name="Table Simple 3" w:semiHidden="1" w:unhideWhenUsed="1"/>
+    <w:lsdException w:name="Table Classic 1" w:semiHidden="1" w:unhideWhenUsed="1"/>
+    <w:lsdException w:name="Table Classic 2" w:semiHidden="1" w:unhideWhenUsed="1"/>
+    <w:lsdException w:name="Table Classic 3" w:semiHidden="1" w:unhideWhenUsed="1"/>
+    <w:lsdException w:name="Table Classic 4" w:semiHidden="1" w:unhideWhenUsed="1"/>
+    <w:lsdException w:name="Table Colorful 1" w:semiHidden="1" w:unhideWhenUsed="1"/>
+    <w:lsdException w:name="Table Colorful 2" w:semiHidden="1" w:unhideWhenUsed="1"/>
+    <w:lsdException w:name="Table Colorful 3" w:semiHidden="1" w:unhideWhenUsed="1"/>
+    <w:lsdException w:name="Table Columns 1" w:semiHidden="1" w:unhideWhenUsed="1"/>
+    <w:lsdException w:name="Table Columns 2" w:semiHidden="1" w:unhideWhenUsed="1"/>
+    <w:lsdException w:name="Table Columns 3" w:semiHidden="1" w:unhideWhenUsed="1"/>
+    <w:lsdException w:name="Table Columns 4" w:semiHidden="1" w:unhideWhenUsed="1"/>
+    <w:lsdException w:name="Table Columns 5" w:semiHidden="1" w:unhideWhenUsed="1"/>
+    <w:lsdException w:name="Table Grid 1" w:semiHidden="1" w:unhideWhenUsed="1"/>
+    <w:lsdException w:name="Table Grid 2" w:semiHidden="1" w:unhideWhenUsed="1"/>
+    <w:lsdException w:name="Table Grid 3" w:semiHidden="1" w:unhideWhenUsed="1"/>
+    <w:lsdException w:name="Table Grid 4" w:semiHidden="1" w:unhideWhenUsed="1"/>
+    <w:lsdException w:name="Table Grid 5" w:semiHidden="1" w:unhideWhenUsed="1"/>
+    <w:lsdException w:name="Table Grid 6" w:semiHidden="1" w:unhideWhenUsed="1"/>
+    <w:lsdException w:name="Table Grid 7" w:semiHidden="1" w:unhideWhenUsed="1"/>
+    <w:lsdException w:name="Table Grid 8" w:semiHidden="1" w:unhideWhenUsed="1"/>
+    <w:lsdException w:name="Table List 1" w:semiHidden="1" w:unhideWhenUsed="1"/>
+    <w:lsdException w:name="Table List 2" w:semiHidden="1" w:unhideWhenUsed="1"/>
+    <w:lsdException w:name="Table List 3" w:semiHidden="1" w:unhideWhenUsed="1"/>
+    <w:lsdException w:name="Table List 4" w:semiHidden="1" w:unhideWhenUsed="1"/>
+    <w:lsdException w:name="Table List 5" w:semiHidden="1" w:unhideWhenUsed="1"/>
+    <w:lsdException w:name="Table List 6" w:semiHidden="1" w:unhideWhenUsed="1"/>
+    <w:lsdException w:name="Table List 7" w:semiHidden="1" w:unhideWhenUsed="1"/>
+    <w:lsdException w:name="Table List 8" w:semiHidden="1" w:unhideWhenUsed="1"/>
+    <w:lsdException w:name="Table 3D effects 1" w:semiHidden="1" w:unhideWhenUsed="1"/>
+    <w:lsdException w:name="Table 3D effects 2" w:semiHidden="1" w:unhideWhenUsed="1"/>
+    <w:lsdException w:name="Table 3D effects 3" w:semiHidden="1" w:unhideWhenUsed="1"/>
+    <w:lsdException w:name="Table Contemporary" w:semiHidden="1" w:unhideWhenUsed="1"/>
+    <w:lsdException w:name="Table Elegant" w:semiHidden="1" w:unhideWhenUsed="1"/>
+    <w:lsdException w:name="Table Professional" w:semiHidden="1" w:unhideWhenUsed="1"/>
+    <w:lsdException w:name="Table Subtle 1" w:semiHidden="1" w:unhideWhenUsed="1"/>
+    <w:lsdException w:name="Table Subtle 2" w:semiHidden="1" w:unhideWhenUsed="1"/>
+    <w:lsdException w:name="Table Web 1" w:semiHidden="1" w:unhideWhenUsed="1"/>
+    <w:lsdException w:name="Table Web 2" w:semiHidden="1" w:unhideWhenUsed="1"/>
+    <w:lsdException w:name="Table Web 3" w:semiHidden="1" w:unhideWhenUsed="1"/>
+    <w:lsdException w:name="Balloon Text" w:semiHidden="1" w:unhideWhenUsed="1"/>
+    <w:lsdException w:name="Table Grid" w:uiPriority="39"/>
+    <w:lsdException w:name="Table Theme" w:semiHidden="1" w:unhideWhenUsed="1"/>
+    <w:lsdException w:name="Placeholder Text" w:semiHidden="1"/>
+    <w:lsdException w:name="No Spacing" w:uiPriority="1" w:qFormat="1"/>
+    <w:lsdException w:name="Light Shading" w:uiPriority="60"/>
+    <w:lsdException w:name="Light List" w:uiPriority="61"/>
+    <w:lsdException w:name="Light Grid" w:uiPriority="62"/>
+    <w:lsdException w:name="Medium Shading 1" w:uiPriority="63"/>
+    <w:lsdException w:name="Medium Shading 2" w:uiPriority="64"/>
+    <w:lsdException w:name="Medium List 1" w:uiPriority="65"/>
+    <w:lsdException w:name="Medium List 2" w:uiPriority="66"/>
+    <w:lsdException w:name="Medium Grid 1" w:uiPriority="67"/>
+    <w:lsdException w:name="Medium Grid 2" w:uiPriority="68"/>
+    <w:lsdException w:name="Medium Grid 3" w:uiPriority="69"/>
+    <w:lsdException w:name="Dark List" w:uiPriority="70"/>
+    <w:lsdException w:name="Colorful Shading" w:uiPriority="71"/>
+    <w:lsdException w:name="Colorful List" w:uiPriority="72"/>
+    <w:lsdException w:name="Colorful Grid" w:uiPriority="73"/>
+    <w:lsdException w:name="Light Shading Accent 1" w:uiPriority="60"/>
+    <w:lsdException w:name="Light List Accent 1" w:uiPriority="61"/>
+    <w:lsdException w:name="Light Grid Accent 1" w:uiPriority="62"/>
+    <w:lsdException w:name="Medium Shading 1 Accent 1" w:uiPriority="63"/>
+    <w:lsdException w:name="Medium Shading 2 Accent 1" w:uiPriority="64"/>
+    <w:lsdException w:name="Medium List 1 Accent 1" w:uiPriority="65"/>
+    <w:lsdException w:name="Revision" w:semiHidden="1"/>
+    <w:lsdException w:name="List Paragraph" w:uiPriority="34" w:qFormat="1"/>
+    <w:lsdException w:name="Quote" w:uiPriority="29" w:qFormat="1"/>
+    <w:lsdException w:name="Intense Quote" w:uiPriority="30" w:qFormat="1"/>
+    <w:lsdException w:name="Medium List 2 Accent 1" w:uiPriority="66"/>
+    <w:lsdException w:name="Medium Grid 1 Accent 1" w:uiPriority="67"/>
+    <w:lsdException w:name="Medium Grid 2 Accent 1" w:uiPriority="68"/>
+    <w:lsdException w:name="Medium Grid 3 Accent 1" w:uiPriority="69"/>
+    <w:lsdException w:name="Dark List Accent 1" w:uiPriority="70"/>
+    <w:lsdException w:name="Colorful Shading Accent 1" w:uiPriority="71"/>
+    <w:lsdException w:name="Colorful List Accent 1" w:uiPriority="72"/>
+    <w:lsdException w:name="Colorful Grid Accent 1" w:uiPriority="73"/>
+    <w:lsdException w:name="Light Shading Accent 2" w:uiPriority="60"/>
+    <w:lsdException w:name="Light List Accent 2" w:uiPriority="61"/>
+    <w:lsdException w:name="Light Grid Accent 2" w:uiPriority="62"/>
+    <w:lsdException w:name="Medium Shading 1 Accent 2" w:uiPriority="63"/>
+    <w:lsdException w:name="Medium Shading 2 Accent 2" w:uiPriority="64"/>
+    <w:lsdException w:name="Medium List 1 Accent 2" w:uiPriority="65"/>
+    <w:lsdException w:name="Medium List 2 Accent 2" w:uiPriority="66"/>
+    <w:lsdException w:name="Medium Grid 1 Accent 2" w:uiPriority="67"/>
+    <w:lsdException w:name="Medium Grid 2 Accent 2" w:uiPriority="68"/>
+    <w:lsdException w:name="Medium Grid 3 Accent 2" w:uiPriority="69"/>
+    <w:lsdException w:name="Dark List Accent 2" w:uiPriority="70"/>
+    <w:lsdException w:name="Colorful Shading Accent 2" w:uiPriority="71"/>
+    <w:lsdException w:name="Colorful List Accent 2" w:uiPriority="72"/>
+    <w:lsdException w:name="Colorful Grid Accent 2" w:uiPriority="73"/>
+    <w:lsdException w:name="Light Shading Accent 3" w:uiPriority="60"/>
+    <w:lsdException w:name="Light List Accent 3" w:uiPriority="61"/>
+    <w:lsdException w:name="Light Grid Accent 3" w:uiPriority="62"/>
+    <w:lsdException w:name="Medium Shading 1 Accent 3" w:uiPriority="63"/>
+    <w:lsdException w:name="Medium Shading 2 Accent 3" w:uiPriority="64"/>
+    <w:lsdException w:name="Medium List 1 Accent 3" w:uiPriority="65"/>
+    <w:lsdException w:name="Medium List 2 Accent 3" w:uiPriority="66"/>
+    <w:lsdException w:name="Medium Grid 1 Accent 3" w:uiPriority="67"/>
+    <w:lsdException w:name="Medium Grid 2 Accent 3" w:uiPriority="68"/>
+    <w:lsdException w:name="Medium Grid 3 Accent 3" w:uiPriority="69"/>
+    <w:lsdException w:name="Dark List Accent 3" w:uiPriority="70"/>
+    <w:lsdException w:name="Colorful Shading Accent 3" w:uiPriority="71"/>
+    <w:lsdException w:name="Colorful List Accent 3" w:uiPriority="72"/>
+    <w:lsdException w:name="Colorful Grid Accent 3" w:uiPriority="73"/>
+    <w:lsdException w:name="Light Shading Accent 4" w:uiPriority="60"/>
+    <w:lsdException w:name="Light List Accent 4" w:uiPriority="61"/>
+    <w:lsdException w:name="Light Grid Accent 4" w:uiPriority="62"/>
+    <w:lsdException w:name="Medium Shading 1 Accent 4" w:uiPriority="63"/>
+    <w:lsdException w:name="Medium Shading 2 Accent 4" w:uiPriority="64"/>
+    <w:lsdException w:name="Medium List 1 Accent 4" w:uiPriority="65"/>
+    <w:lsdException w:name="Medium List 2 Accent 4" w:uiPriority="66"/>
+    <w:lsdException w:name="Medium Grid 1 Accent 4" w:uiPriority="67"/>
+    <w:lsdException w:name="Medium Grid 2 Accent 4" w:uiPriority="68"/>
+    <w:lsdException w:name="Medium Grid 3 Accent 4" w:uiPriority="69"/>
+    <w:lsdException w:name="Dark List Accent 4" w:uiPriority="70"/>
+    <w:lsdException w:name="Colorful Shading Accent 4" w:uiPriority="71"/>
+    <w:lsdException w:name="Colorful List Accent 4" w:uiPriority="72"/>
+    <w:lsdException w:name="Colorful Grid Accent 4" w:uiPriority="73"/>
+    <w:lsdException w:name="Light Shading Accent 5" w:uiPriority="60"/>
+    <w:lsdException w:name="Light List Accent 5" w:uiPriority="61"/>
+    <w:lsdException w:name="Light Grid Accent 5" w:uiPriority="62"/>
+    <w:lsdException w:name="Medium Shading 1 Accent 5" w:uiPriority="63"/>
+    <w:lsdException w:name="Medium Shading 2 Accent 5" w:uiPriority="64"/>
+    <w:lsdException w:name="Medium List 1 Accent 5" w:uiPriority="65"/>
+    <w:lsdException w:name="Medium List 2 Accent 5" w:uiPriority="66"/>
+    <w:lsdException w:name="Medium Grid 1 Accent 5" w:uiPriority="67"/>
+    <w:lsdException w:name="Medium Grid 2 Accent 5" w:uiPriority="68"/>
+    <w:lsdException w:name="Medium Grid 3 Accent 5" w:uiPriority="69"/>
+    <w:lsdException w:name="Dark List Accent 5" w:uiPriority="70"/>
+    <w:lsdException w:name="Colorful Shading Accent 5" w:uiPriority="71"/>
+    <w:lsdException w:name="Colorful List Accent 5" w:uiPriority="72"/>
+    <w:lsdException w:name="Colorful Grid Accent 5" w:uiPriority="73"/>
+    <w:lsdException w:name="Light Shading Accent 6" w:uiPriority="60"/>
+    <w:lsdException w:name="Light List Accent 6" w:uiPriority="61"/>
+    <w:lsdException w:name="Light Grid Accent 6" w:uiPriority="62"/>
+    <w:lsdException w:name="Medium Shading 1 Accent 6" w:uiPriority="63"/>
+    <w:lsdException w:name="Medium Shading 2 Accent 6" w:uiPriority="64"/>
+    <w:lsdException w:name="Medium List 1 Accent 6" w:uiPriority="65"/>
+    <w:lsdException w:name="Medium List 2 Accent 6" w:uiPriority="66"/>
+    <w:lsdException w:name="Medium Grid 1 Accent 6" w:uiPriority="67"/>
+    <w:lsdException w:name="Medium Grid 2 Accent 6" w:uiPriority="68"/>
+    <w:lsdException w:name="Medium Grid 3 Accent 6" w:uiPriority="69"/>
+    <w:lsdException w:name="Dark List Accent 6" w:uiPriority="70"/>
+    <w:lsdException w:name="Colorful Shading Accent 6" w:uiPriority="71"/>
+    <w:lsdException w:name="Colorful List Accent 6" w:uiPriority="72"/>
+    <w:lsdException w:name="Colorful Grid Accent 6" w:uiPriority="73"/>
+    <w:lsdException w:name="Subtle Emphasis" w:uiPriority="19" w:qFormat="1"/>
+    <w:lsdException w:name="Intense Emphasis" w:uiPriority="21" w:qFormat="1"/>
+    <w:lsdException w:name="Subtle Reference" w:uiPriority="31" w:qFormat="1"/>
+    <w:lsdException w:name="Intense Reference" w:uiPriority="32" w:qFormat="1"/>
+    <w:lsdException w:name="Book Title" w:uiPriority="33" w:qFormat="1"/>
+    <w:lsdException w:name="Bibliography" w:semiHidden="1" w:uiPriority="37" w:unhideWhenUsed="1"/>
+    <w:lsdException w:name="TOC Heading" w:semiHidden="1" w:uiPriority="39" w:unhideWhenUsed="1" w:qFormat="1"/>
+    <w:lsdException w:name="Plain Table 1" w:uiPriority="41"/>
+    <w:lsdException w:name="Plain Table 2" w:uiPriority="42"/>
+    <w:lsdException w:name="Plain Table 3" w:uiPriority="43"/>
+    <w:lsdException w:name="Plain Table 4" w:uiPriority="44"/>
+    <w:lsdException w:name="Plain Table 5" w:uiPriority="45"/>
+    <w:lsdException w:name="Grid Table Light" w:uiPriority="40"/>
+    <w:lsdException w:name="Grid Table 1 Light" w:uiPriority="46"/>
+    <w:lsdException w:name="Grid Table 2" w:uiPriority="47"/>
+    <w:lsdException w:name="Grid Table 3" w:uiPriority="48"/>
+    <w:lsdException w:name="Grid Table 4" w:uiPriority="49"/>
+    <w:lsdException w:name="Grid Table 5 Dark" w:uiPriority="50"/>
+    <w:lsdException w:name="Grid Table 6 Colorful" w:uiPriority="51"/>
+    <w:lsdException w:name="Grid Table 7 Colorful" w:uiPriority="52"/>
+    <w:lsdException w:name="Grid Table 1 Light Accent 1" w:uiPriority="46"/>
+    <w:lsdException w:name="Grid Table 2 Accent 1" w:uiPriority="47"/>
+    <w:lsdException w:name="Grid Table 3 Accent 1" w:uiPriority="48"/>
+    <w:lsdException w:name="Grid Table 4 Accent 1" w:uiPriority="49"/>
+    <w:lsdException w:name="Grid Table 5 Dark Accent 1" w:uiPriority="50"/>
+    <w:lsdException w:name="Grid Table 6 Colorful Accent 1" w:uiPriority="51"/>
+    <w:lsdException w:name="Grid Table 7 Colorful Accent 1" w:uiPriority="52"/>
+    <w:lsdException w:name="Grid Table 1 Light Accent 2" w:uiPriority="46"/>
+    <w:lsdException w:name="Grid Table 2 Accent 2" w:uiPriority="47"/>
+    <w:lsdException w:name="Grid Table 3 Accent 2" w:uiPriority="48"/>
+    <w:lsdException w:name="Grid Table 4 Accent 2" w:uiPriority="49"/>
+    <w:lsdException w:name="Grid Table 5 Dark Accent 2" w:uiPriority="50"/>
+    <w:lsdException w:name="Grid Table 6 Colorful Accent 2" w:uiPriority="51"/>
+    <w:lsdException w:name="Grid Table 7 Colorful Accent 2" w:uiPriority="52"/>
+    <w:lsdException w:name="Grid Table 1 Light Accent 3" w:uiPriority="46"/>
+    <w:lsdException w:name="Grid Table 2 Accent 3" w:uiPriority="47"/>
+    <w:lsdException w:name="Grid Table 3 Accent 3" w:uiPriority="48"/>
+    <w:lsdException w:name="Grid Table 4 Accent 3" w:uiPriority="49"/>
+    <w:lsdException w:name="Grid Table 5 Dark Accent 3" w:uiPriority="50"/>
+    <w:lsdException w:name="Grid Table 6 Colorful Accent 3" w:uiPriority="51"/>
+    <w:lsdException w:name="Grid Table 7 Colorful Accent 3" w:uiPriority="52"/>
+    <w:lsdException w:name="Grid Table 1 Light Accent 4" w:uiPriority="46"/>
+    <w:lsdException w:name="Grid Table 2 Accent 4" w:uiPriority="47"/>
+    <w:lsdException w:name="Grid Table 3 Accent 4" w:uiPriority="48"/>
+    <w:lsdException w:name="Grid Table 4 Accent 4" w:uiPriority="49"/>
+    <w:lsdException w:name="Grid Table 5 Dark Accent 4" w:uiPriority="50"/>
+    <w:lsdException w:name="Grid Table 6 Colorful Accent 4" w:uiPriority="51"/>
+    <w:lsdException w:name="Grid Table 7 Colorful Accent 4" w:uiPriority="52"/>
+    <w:lsdException w:name="Grid Table 1 Light Accent 5" w:uiPriority="46"/>
+    <w:lsdException w:name="Grid Table 2 Accent 5" w:uiPriority="47"/>
+    <w:lsdException w:name="Grid Table 3 Accent 5" w:uiPriority="48"/>
+    <w:lsdException w:name="Grid Table 4 Accent 5" w:uiPriority="49"/>
+    <w:lsdException w:name="Grid Table 5 Dark Accent 5" w:uiPriority="50"/>
+    <w:lsdException w:name="Grid Table 6 Colorful Accent 5" w:uiPriority="51"/>
+    <w:lsdException w:name="Grid Table 7 Colorful Accent 5" w:uiPriority="52"/>
+    <w:lsdException w:name="Grid Table 1 Light Accent 6" w:uiPriority="46"/>
+    <w:lsdException w:name="Grid Table 2 Accent 6" w:uiPriority="47"/>
+    <w:lsdException w:name="Grid Table 3 Accent 6" w:uiPriority="48"/>
+    <w:lsdException w:name="Grid Table 4 Accent 6" w:uiPriority="49"/>
+    <w:lsdException w:name="Grid Table 5 Dark Accent 6" w:uiPriority="50"/>
+    <w:lsdException w:name="Grid Table 6 Colorful Accent 6" w:uiPriority="51"/>
+    <w:lsdException w:name="Grid Table 7 Colorful Accent 6" w:uiPriority="52"/>
+    <w:lsdException w:name="List Table 1 Light" w:uiPriority="46"/>
+    <w:lsdException w:name="List Table 2" w:uiPriority="47"/>
+    <w:lsdException w:name="List Table 3" w:uiPriority="48"/>
+    <w:lsdException w:name="List Table 4" w:uiPriority="49"/>
+    <w:lsdException w:name="List Table 5 Dark" w:uiPriority="50"/>
+    <w:lsdException w:name="List Table 6 Colorful" w:uiPriority="51"/>
+    <w:lsdException w:name="List Table 7 Colorful" w:uiPriority="52"/>
+    <w:lsdException w:name="List Table 1 Light Accent 1" w:uiPriority="46"/>
+    <w:lsdException w:name="List Table 2 Accent 1" w:uiPriority="47"/>
+    <w:lsdException w:name="List Table 3 Accent 1" w:uiPriority="48"/>
+    <w:lsdException w:name="List Table 4 Accent 1" w:uiPriority="49"/>
+    <w:lsdException w:name="List Table 5 Dark Accent 1" w:uiPriority="50"/>
+    <w:lsdException w:name="List Table 6 Colorful Accent 1" w:uiPriority="51"/>
+    <w:lsdException w:name="List Table 7 Colorful Accent 1" w:uiPriority="52"/>
+    <w:lsdException w:name="List Table 1 Light Accent 2" w:uiPriority="46"/>
+    <w:lsdException w:name="List Table 2 Accent 2" w:uiPriority="47"/>
+    <w:lsdException w:name="List Table 3 Accent 2" w:uiPriority="48"/>
+    <w:lsdException w:name="List Table 4 Accent 2" w:uiPriority="49"/>
+    <w:lsdException w:name="List Table 5 Dark Accent 2" w:uiPriority="50"/>
+    <w:lsdException w:name="List Table 6 Colorful Accent 2" w:uiPriority="51"/>
+    <w:lsdException w:name="List Table 7 Colorful Accent 2" w:uiPriority="52"/>
+    <w:lsdException w:name="List Table 1 Light Accent 3" w:uiPriority="46"/>
+    <w:lsdException w:name="List Table 2 Accent 3" w:uiPriority="47"/>
+    <w:lsdException w:name="List Table 3 Accent 3" w:uiPriority="48"/>
+    <w:lsdException w:name="List Table 4 Accent 3" w:uiPriority="49"/>
+    <w:lsdException w:name="List Table 5 Dark Accent 3" w:uiPriority="50"/>
+    <w:lsdException w:name="List Table 6 Colorful Accent 3" w:uiPriority="51"/>
+    <w:lsdException w:name="List Table 7 Colorful Accent 3" w:uiPriority="52"/>
+    <w:lsdException w:name="List Table 1 Light Accent 4" w:uiPriority="46"/>
+    <w:lsdException w:name="List Table 2 Accent 4" w:uiPriority="47"/>
+    <w:lsdException w:name="List Table 3 Accent 4" w:uiPriority="48"/>
+    <w:lsdException w:name="List Table 4 Accent 4" w:uiPriority="49"/>
+    <w:lsdException w:name="List Table 5 Dark Accent 4" w:uiPriority="50"/>
+    <w:lsdException w:name="List Table 6 Colorful Accent 4" w:uiPriority="51"/>
+    <w:lsdException w:name="List Table 7 Colorful Accent 4" w:uiPriority="52"/>
+    <w:lsdException w:name="List Table 1 Light Accent 5" w:uiPriority="46"/>
+    <w:lsdException w:name="List Table 2 Accent 5" w:uiPriority="47"/>
+    <w:lsdException w:name="List Table 3 Accent 5" w:uiPriority="48"/>
+    <w:lsdException w:name="List Table 4 Accent 5" w:uiPriority="49"/>
+    <w:lsdException w:name="List Table 5 Dark Accent 5" w:uiPriority="50"/>
+    <w:lsdException w:name="List Table 6 Colorful Accent 5" w:uiPriority="51"/>
+    <w:lsdException w:name="List Table 7 Colorful Accent 5" w:uiPriority="52"/>
+    <w:lsdException w:name="List Table 1 Light Accent 6" w:uiPriority="46"/>
+    <w:lsdException w:name="List Table 2 Accent 6" w:uiPriority="47"/>
+    <w:lsdException w:name="List Table 3 Accent 6" w:uiPriority="48"/>
+    <w:lsdException w:name="List Table 4 Accent 6" w:uiPriority="49"/>
+    <w:lsdException w:name="List Table 5 Dark Accent 6" w:uiPriority="50"/>
+    <w:lsdException w:name="List Table 6 Colorful Accent 6" w:uiPriority="51"/>
+    <w:lsdException w:name="List Table 7 Colorful Accent 6" w:uiPriority="52"/>
+    <w:lsdException w:name="Mention" w:semiHidden="1" w:unhideWhenUsed="1"/>
+    <w:lsdException w:name="Smart Hyperlink" w:semiHidden="1" w:unhideWhenUsed="1"/>
+    <w:lsdException w:name="Hashtag" w:semiHidden="1" w:unhideWhenUsed="1"/>
+    <w:lsdException w:name="Unresolved Mention" w:semiHidden="1" w:unhideWhenUsed="1"/>
+    <w:lsdException w:name="Smart Link" w:semiHidden="1" w:unhideWhenUsed="1"/>
+  </w:latentStyles>
+  <w:style w:type="paragraph" w:default="1" w:styleId="Normal">
+    <w:name w:val="Normal"/>
     <w:qFormat/>
-    <w:rPr>
-      <w:sz w:val="56"/>
-      <w:szCs w:val="56"/>
-    </w:rPr>
   </w:style>
   <w:style w:type="paragraph" w:styleId="Heading1">
-    <w:name w:val="Heading 1"/>
-    <w:basedOn w:val="Normal"/>
-    <w:next w:val="Normal"/>
+    <w:name w:val="heading 1"/>
+    <w:uiPriority w:val="9"/>
     <w:qFormat/>
+    <w:pPr>
+      <w:spacing w:before="360" w:after="140"/>
+      <w:outlineLvl w:val="0"/>
+    </w:pPr>
     <w:rPr>
-      <w:color w:val="2E74B5"/>
-      <w:sz w:val="32"/>
-      <w:szCs w:val="32"/>
+      <w:rFonts w:ascii="Georgia" w:eastAsia="Georgia" w:hAnsi="Georgia" w:cs="Georgia"/>
+      <w:color w:val="14181F"/>
+      <w:sz w:val="30"/>
+      <w:szCs w:val="30"/>
     </w:rPr>
   </w:style>
   <w:style w:type="paragraph" w:styleId="Heading2">
-    <w:name w:val="Heading 2"/>
-    <w:basedOn w:val="Normal"/>
-    <w:next w:val="Normal"/>
+    <w:name w:val="heading 2"/>
+    <w:uiPriority w:val="9"/>
+    <w:unhideWhenUsed/>
     <w:qFormat/>
+    <w:pPr>
+      <w:spacing w:before="240" w:after="120"/>
+      <w:outlineLvl w:val="1"/>
+    </w:pPr>
     <w:rPr>
-      <w:color w:val="2E74B5"/>
-      <w:sz w:val="26"/>
-      <w:szCs w:val="26"/>
+      <w:rFonts w:ascii="Georgia" w:eastAsia="Georgia" w:hAnsi="Georgia" w:cs="Georgia"/>
+      <w:color w:val="14181F"/>
+      <w:sz w:val="25"/>
+      <w:szCs w:val="25"/>
     </w:rPr>
   </w:style>
   <w:style w:type="paragraph" w:styleId="Heading3">
-    <w:name w:val="Heading 3"/>
-    <w:basedOn w:val="Normal"/>
-    <w:next w:val="Normal"/>
+    <w:name w:val="heading 3"/>
+    <w:uiPriority w:val="9"/>
+    <w:semiHidden/>
+    <w:unhideWhenUsed/>
     <w:qFormat/>
+    <w:pPr>
+      <w:outlineLvl w:val="2"/>
+    </w:pPr>
     <w:rPr>
       <w:color w:val="1F4D78"/>
       <w:sz w:val="24"/>
@@ -3175,10 +3286,14 @@
     </w:rPr>
   </w:style>
   <w:style w:type="paragraph" w:styleId="Heading4">
-    <w:name w:val="Heading 4"/>
-    <w:basedOn w:val="Normal"/>
-    <w:next w:val="Normal"/>
+    <w:name w:val="heading 4"/>
+    <w:uiPriority w:val="9"/>
+    <w:semiHidden/>
+    <w:unhideWhenUsed/>
     <w:qFormat/>
+    <w:pPr>
+      <w:outlineLvl w:val="3"/>
+    </w:pPr>
     <w:rPr>
       <w:i/>
       <w:iCs/>
@@ -3186,27 +3301,74 @@
     </w:rPr>
   </w:style>
   <w:style w:type="paragraph" w:styleId="Heading5">
-    <w:name w:val="Heading 5"/>
-    <w:basedOn w:val="Normal"/>
-    <w:next w:val="Normal"/>
+    <w:name w:val="heading 5"/>
+    <w:uiPriority w:val="9"/>
+    <w:semiHidden/>
+    <w:unhideWhenUsed/>
     <w:qFormat/>
+    <w:pPr>
+      <w:outlineLvl w:val="4"/>
+    </w:pPr>
     <w:rPr>
       <w:color w:val="2E74B5"/>
     </w:rPr>
   </w:style>
   <w:style w:type="paragraph" w:styleId="Heading6">
-    <w:name w:val="Heading 6"/>
-    <w:basedOn w:val="Normal"/>
-    <w:next w:val="Normal"/>
+    <w:name w:val="heading 6"/>
+    <w:uiPriority w:val="9"/>
+    <w:semiHidden/>
+    <w:unhideWhenUsed/>
     <w:qFormat/>
+    <w:pPr>
+      <w:outlineLvl w:val="5"/>
+    </w:pPr>
     <w:rPr>
       <w:color w:val="1F4D78"/>
     </w:rPr>
   </w:style>
-  <w:style w:type="paragraph" w:styleId="Strong">
-    <w:name w:val="Strong"/>
-    <w:basedOn w:val="Normal"/>
-    <w:next w:val="Normal"/>
+  <w:style w:type="character" w:default="1" w:styleId="DefaultParagraphFont">
+    <w:name w:val="Default Paragraph Font"/>
+    <w:uiPriority w:val="1"/>
+    <w:semiHidden/>
+    <w:unhideWhenUsed/>
+  </w:style>
+  <w:style w:type="table" w:default="1" w:styleId="TableNormal">
+    <w:name w:val="Normal Table"/>
+    <w:uiPriority w:val="99"/>
+    <w:semiHidden/>
+    <w:unhideWhenUsed/>
+    <w:tblPr>
+      <w:tblInd w:w="0" w:type="dxa"/>
+      <w:tblCellMar>
+        <w:top w:w="0" w:type="dxa"/>
+        <w:left w:w="108" w:type="dxa"/>
+        <w:bottom w:w="0" w:type="dxa"/>
+        <w:right w:w="108" w:type="dxa"/>
+      </w:tblCellMar>
+    </w:tblPr>
+  </w:style>
+  <w:style w:type="numbering" w:default="1" w:styleId="NoList">
+    <w:name w:val="No List"/>
+    <w:uiPriority w:val="99"/>
+    <w:semiHidden/>
+    <w:unhideWhenUsed/>
+  </w:style>
+  <w:style w:type="paragraph" w:styleId="Title">
+    <w:name w:val="Title"/>
+    <w:uiPriority w:val="10"/>
+    <w:qFormat/>
+    <w:pPr>
+      <w:spacing w:after="240"/>
+    </w:pPr>
+    <w:rPr>
+      <w:rFonts w:ascii="Georgia" w:eastAsia="Georgia" w:hAnsi="Georgia" w:cs="Georgia"/>
+      <w:color w:val="14181F"/>
+      <w:sz w:val="44"/>
+      <w:szCs w:val="44"/>
+    </w:rPr>
+  </w:style>
+  <w:style w:type="paragraph" w:customStyle="1" w:styleId="Strong1">
+    <w:name w:val="Strong1"/>
     <w:qFormat/>
     <w:rPr>
       <w:b/>
@@ -3215,12 +3377,10 @@
   </w:style>
   <w:style w:type="paragraph" w:styleId="ListParagraph">
     <w:name w:val="List Paragraph"/>
-    <w:basedOn w:val="Normal"/>
     <w:qFormat/>
   </w:style>
   <w:style w:type="character" w:styleId="Hyperlink">
     <w:name w:val="Hyperlink"/>
-    <w:basedOn w:val="DefaultParagraphFont"/>
     <w:uiPriority w:val="99"/>
     <w:unhideWhenUsed/>
     <w:rPr>
@@ -3230,7 +3390,6 @@
   </w:style>
   <w:style w:type="character" w:styleId="FootnoteReference">
     <w:name w:val="footnote reference"/>
-    <w:basedOn w:val="DefaultParagraphFont"/>
     <w:uiPriority w:val="99"/>
     <w:semiHidden/>
     <w:unhideWhenUsed/>
@@ -3240,22 +3399,17 @@
   </w:style>
   <w:style w:type="paragraph" w:styleId="FootnoteText">
     <w:name w:val="footnote text"/>
-    <w:basedOn w:val="Normal"/>
     <w:link w:val="FootnoteTextChar"/>
     <w:uiPriority w:val="99"/>
     <w:semiHidden/>
     <w:unhideWhenUsed/>
-    <w:pPr>
-      <w:spacing w:after="0" w:line="240" w:lineRule="auto"/>
-    </w:pPr>
     <w:rPr>
       <w:sz w:val="20"/>
       <w:szCs w:val="20"/>
     </w:rPr>
   </w:style>
-  <w:style w:type="character" w:styleId="FootnoteTextChar">
+  <w:style w:type="character" w:customStyle="1" w:styleId="FootnoteTextChar">
     <w:name w:val="Footnote Text Char"/>
-    <w:basedOn w:val="DefaultParagraphFont"/>
     <w:link w:val="FootnoteText"/>
     <w:uiPriority w:val="99"/>
     <w:semiHidden/>
@@ -3267,7 +3421,6 @@
   </w:style>
   <w:style w:type="character" w:styleId="EndnoteReference">
     <w:name w:val="endnote reference"/>
-    <w:basedOn w:val="DefaultParagraphFont"/>
     <w:uiPriority w:val="99"/>
     <w:semiHidden/>
     <w:unhideWhenUsed/>
@@ -3277,22 +3430,17 @@
   </w:style>
   <w:style w:type="paragraph" w:styleId="EndnoteText">
     <w:name w:val="endnote text"/>
-    <w:basedOn w:val="Normal"/>
     <w:link w:val="EndnoteTextChar"/>
     <w:uiPriority w:val="99"/>
     <w:semiHidden/>
     <w:unhideWhenUsed/>
-    <w:pPr>
-      <w:spacing w:after="0" w:line="240" w:lineRule="auto"/>
-    </w:pPr>
     <w:rPr>
       <w:sz w:val="20"/>
       <w:szCs w:val="20"/>
     </w:rPr>
   </w:style>
-  <w:style w:type="character" w:styleId="EndnoteTextChar">
+  <w:style w:type="character" w:customStyle="1" w:styleId="EndnoteTextChar">
     <w:name w:val="Endnote Text Char"/>
-    <w:basedOn w:val="DefaultParagraphFont"/>
     <w:link w:val="EndnoteText"/>
     <w:uiPriority w:val="99"/>
     <w:semiHidden/>
@@ -3302,50 +3450,300 @@
       <w:szCs w:val="20"/>
     </w:rPr>
   </w:style>
-  <w:style w:type="paragraph" w:styleId="Title">
-    <w:name w:val="Title"/>
-    <w:basedOn w:val="Normal"/>
-    <w:pPr>
-      <w:spacing w:after="240"/>
-    </w:pPr>
-    <w:rPr>
-      <w:rFonts w:ascii="Georgia" w:cs="Georgia" w:eastAsia="Georgia" w:hAnsi="Georgia"/>
-      <w:color w:val="14181F"/>
-      <w:sz w:val="44"/>
-      <w:szCs w:val="44"/>
-    </w:rPr>
-  </w:style>
-  <w:style w:type="paragraph" w:styleId="Heading1">
-    <w:name w:val="Heading 1"/>
-    <w:basedOn w:val="Normal"/>
-    <w:next w:val="Normal"/>
-    <w:qFormat/>
-    <w:pPr>
-      <w:spacing w:after="140" w:before="360"/>
-      <w:outlineLvl w:val="0"/>
-    </w:pPr>
-    <w:rPr>
-      <w:rFonts w:ascii="Georgia" w:cs="Georgia" w:eastAsia="Georgia" w:hAnsi="Georgia"/>
-      <w:color w:val="14181F"/>
-      <w:sz w:val="30"/>
-      <w:szCs w:val="30"/>
-    </w:rPr>
-  </w:style>
-  <w:style w:type="paragraph" w:styleId="Heading2">
-    <w:name w:val="Heading 2"/>
-    <w:basedOn w:val="Normal"/>
-    <w:next w:val="Normal"/>
-    <w:qFormat/>
-    <w:pPr>
-      <w:spacing w:after="120" w:before="240"/>
-      <w:outlineLvl w:val="1"/>
-    </w:pPr>
-    <w:rPr>
-      <w:rFonts w:ascii="Georgia" w:cs="Georgia" w:eastAsia="Georgia" w:hAnsi="Georgia"/>
-      <w:color w:val="14181F"/>
-      <w:sz w:val="25"/>
-      <w:szCs w:val="25"/>
-    </w:rPr>
-  </w:style>
 </w:styles>
+</file>
+
+<file path=word/theme/theme1.xml><?xml version="1.0" encoding="utf-8"?>
+<a:theme xmlns:a="http://schemas.openxmlformats.org/drawingml/2006/main" name="Office Theme">
+  <a:themeElements>
+    <a:clrScheme name="Office">
+      <a:dk1>
+        <a:sysClr val="windowText" lastClr="000000"/>
+      </a:dk1>
+      <a:lt1>
+        <a:sysClr val="window" lastClr="FFFFFF"/>
+      </a:lt1>
+      <a:dk2>
+        <a:srgbClr val="44546A"/>
+      </a:dk2>
+      <a:lt2>
+        <a:srgbClr val="E7E6E6"/>
+      </a:lt2>
+      <a:accent1>
+        <a:srgbClr val="4472C4"/>
+      </a:accent1>
+      <a:accent2>
+        <a:srgbClr val="ED7D31"/>
+      </a:accent2>
+      <a:accent3>
+        <a:srgbClr val="A5A5A5"/>
+      </a:accent3>
+      <a:accent4>
+        <a:srgbClr val="FFC000"/>
+      </a:accent4>
+      <a:accent5>
+        <a:srgbClr val="5B9BD5"/>
+      </a:accent5>
+      <a:accent6>
+        <a:srgbClr val="70AD47"/>
+      </a:accent6>
+      <a:hlink>
+        <a:srgbClr val="0563C1"/>
+      </a:hlink>
+      <a:folHlink>
+        <a:srgbClr val="954F72"/>
+      </a:folHlink>
+    </a:clrScheme>
+    <a:fontScheme name="Office">
+      <a:majorFont>
+        <a:latin typeface="Calibri Light" panose="020F0302020204030204"/>
+        <a:ea typeface=""/>
+        <a:cs typeface=""/>
+        <a:font script="Jpan" typeface="游ゴシック Light"/>
+        <a:font script="Hang" typeface="맑은 고딕"/>
+        <a:font script="Hans" typeface="等线 Light"/>
+        <a:font script="Hant" typeface="新細明體"/>
+        <a:font script="Arab" typeface="Times New Roman"/>
+        <a:font script="Hebr" typeface="Times New Roman"/>
+        <a:font script="Thai" typeface="Angsana New"/>
+        <a:font script="Ethi" typeface="Nyala"/>
+        <a:font script="Beng" typeface="Vrinda"/>
+        <a:font script="Gujr" typeface="Shruti"/>
+        <a:font script="Khmr" typeface="MoolBoran"/>
+        <a:font script="Knda" typeface="Tunga"/>
+        <a:font script="Guru" typeface="Raavi"/>
+        <a:font script="Cans" typeface="Euphemia"/>
+        <a:font script="Cher" typeface="Plantagenet Cherokee"/>
+        <a:font script="Yiii" typeface="Microsoft Yi Baiti"/>
+        <a:font script="Tibt" typeface="Microsoft Himalaya"/>
+        <a:font script="Thaa" typeface="MV Boli"/>
+        <a:font script="Deva" typeface="Mangal"/>
+        <a:font script="Telu" typeface="Gautami"/>
+        <a:font script="Taml" typeface="Latha"/>
+        <a:font script="Syrc" typeface="Estrangelo Edessa"/>
+        <a:font script="Orya" typeface="Kalinga"/>
+        <a:font script="Mlym" typeface="Kartika"/>
+        <a:font script="Laoo" typeface="DokChampa"/>
+        <a:font script="Sinh" typeface="Iskoola Pota"/>
+        <a:font script="Mong" typeface="Mongolian Baiti"/>
+        <a:font script="Viet" typeface="Times New Roman"/>
+        <a:font script="Uigh" typeface="Microsoft Uighur"/>
+        <a:font script="Geor" typeface="Sylfaen"/>
+        <a:font script="Armn" typeface="Arial"/>
+        <a:font script="Bugi" typeface="Leelawadee UI"/>
+        <a:font script="Bopo" typeface="Microsoft JhengHei"/>
+        <a:font script="Java" typeface="Javanese Text"/>
+        <a:font script="Lisu" typeface="Segoe UI"/>
+        <a:font script="Mymr" typeface="Myanmar Text"/>
+        <a:font script="Nkoo" typeface="Ebrima"/>
+        <a:font script="Olck" typeface="Nirmala UI"/>
+        <a:font script="Osma" typeface="Ebrima"/>
+        <a:font script="Phag" typeface="Phagspa"/>
+        <a:font script="Syrn" typeface="Estrangelo Edessa"/>
+        <a:font script="Syrj" typeface="Estrangelo Edessa"/>
+        <a:font script="Syre" typeface="Estrangelo Edessa"/>
+        <a:font script="Sora" typeface="Nirmala UI"/>
+        <a:font script="Tale" typeface="Microsoft Tai Le"/>
+        <a:font script="Talu" typeface="Microsoft New Tai Lue"/>
+        <a:font script="Tfng" typeface="Ebrima"/>
+      </a:majorFont>
+      <a:minorFont>
+        <a:latin typeface="Calibri" panose="020F0502020204030204"/>
+        <a:ea typeface=""/>
+        <a:cs typeface=""/>
+        <a:font script="Jpan" typeface="游明朝"/>
+        <a:font script="Hang" typeface="맑은 고딕"/>
+        <a:font script="Hans" typeface="等线"/>
+        <a:font script="Hant" typeface="新細明體"/>
+        <a:font script="Arab" typeface="Arial"/>
+        <a:font script="Hebr" typeface="Arial"/>
+        <a:font script="Thai" typeface="Cordia New"/>
+        <a:font script="Ethi" typeface="Nyala"/>
+        <a:font script="Beng" typeface="Vrinda"/>
+        <a:font script="Gujr" typeface="Shruti"/>
+        <a:font script="Khmr" typeface="DaunPenh"/>
+        <a:font script="Knda" typeface="Tunga"/>
+        <a:font script="Guru" typeface="Raavi"/>
+        <a:font script="Cans" typeface="Euphemia"/>
+        <a:font script="Cher" typeface="Plantagenet Cherokee"/>
+        <a:font script="Yiii" typeface="Microsoft Yi Baiti"/>
+        <a:font script="Tibt" typeface="Microsoft Himalaya"/>
+        <a:font script="Thaa" typeface="MV Boli"/>
+        <a:font script="Deva" typeface="Mangal"/>
+        <a:font script="Telu" typeface="Gautami"/>
+        <a:font script="Taml" typeface="Latha"/>
+        <a:font script="Syrc" typeface="Estrangelo Edessa"/>
+        <a:font script="Orya" typeface="Kalinga"/>
+        <a:font script="Mlym" typeface="Kartika"/>
+        <a:font script="Laoo" typeface="DokChampa"/>
+        <a:font script="Sinh" typeface="Iskoola Pota"/>
+        <a:font script="Mong" typeface="Mongolian Baiti"/>
+        <a:font script="Viet" typeface="Arial"/>
+        <a:font script="Uigh" typeface="Microsoft Uighur"/>
+        <a:font script="Geor" typeface="Sylfaen"/>
+        <a:font script="Armn" typeface="Arial"/>
+        <a:font script="Bugi" typeface="Leelawadee UI"/>
+        <a:font script="Bopo" typeface="Microsoft JhengHei"/>
+        <a:font script="Java" typeface="Javanese Text"/>
+        <a:font script="Lisu" typeface="Segoe UI"/>
+        <a:font script="Mymr" typeface="Myanmar Text"/>
+        <a:font script="Nkoo" typeface="Ebrima"/>
+        <a:font script="Olck" typeface="Nirmala UI"/>
+        <a:font script="Osma" typeface="Ebrima"/>
+        <a:font script="Phag" typeface="Phagspa"/>
+        <a:font script="Syrn" typeface="Estrangelo Edessa"/>
+        <a:font script="Syrj" typeface="Estrangelo Edessa"/>
+        <a:font script="Syre" typeface="Estrangelo Edessa"/>
+        <a:font script="Sora" typeface="Nirmala UI"/>
+        <a:font script="Tale" typeface="Microsoft Tai Le"/>
+        <a:font script="Talu" typeface="Microsoft New Tai Lue"/>
+        <a:font script="Tfng" typeface="Ebrima"/>
+      </a:minorFont>
+    </a:fontScheme>
+    <a:fmtScheme name="Office">
+      <a:fillStyleLst>
+        <a:solidFill>
+          <a:schemeClr val="phClr"/>
+        </a:solidFill>
+        <a:gradFill rotWithShape="1">
+          <a:gsLst>
+            <a:gs pos="0">
+              <a:schemeClr val="phClr">
+                <a:lumMod val="110000"/>
+                <a:satMod val="105000"/>
+                <a:tint val="67000"/>
+              </a:schemeClr>
+            </a:gs>
+            <a:gs pos="50000">
+              <a:schemeClr val="phClr">
+                <a:lumMod val="105000"/>
+                <a:satMod val="103000"/>
+                <a:tint val="73000"/>
+              </a:schemeClr>
+            </a:gs>
+            <a:gs pos="100000">
+              <a:schemeClr val="phClr">
+                <a:lumMod val="105000"/>
+                <a:satMod val="109000"/>
+                <a:tint val="81000"/>
+              </a:schemeClr>
+            </a:gs>
+          </a:gsLst>
+          <a:lin ang="5400000" scaled="0"/>
+        </a:gradFill>
+        <a:gradFill rotWithShape="1">
+          <a:gsLst>
+            <a:gs pos="0">
+              <a:schemeClr val="phClr">
+                <a:satMod val="103000"/>
+                <a:lumMod val="102000"/>
+                <a:tint val="94000"/>
+              </a:schemeClr>
+            </a:gs>
+            <a:gs pos="50000">
+              <a:schemeClr val="phClr">
+                <a:satMod val="110000"/>
+                <a:lumMod val="100000"/>
+                <a:shade val="100000"/>
+              </a:schemeClr>
+            </a:gs>
+            <a:gs pos="100000">
+              <a:schemeClr val="phClr">
+                <a:lumMod val="99000"/>
+                <a:satMod val="120000"/>
+                <a:shade val="78000"/>
+              </a:schemeClr>
+            </a:gs>
+          </a:gsLst>
+          <a:lin ang="5400000" scaled="0"/>
+        </a:gradFill>
+      </a:fillStyleLst>
+      <a:lnStyleLst>
+        <a:ln w="6350" cap="flat" cmpd="sng" algn="ctr">
+          <a:solidFill>
+            <a:schemeClr val="phClr"/>
+          </a:solidFill>
+          <a:prstDash val="solid"/>
+          <a:miter lim="800000"/>
+        </a:ln>
+        <a:ln w="12700" cap="flat" cmpd="sng" algn="ctr">
+          <a:solidFill>
+            <a:schemeClr val="phClr"/>
+          </a:solidFill>
+          <a:prstDash val="solid"/>
+          <a:miter lim="800000"/>
+        </a:ln>
+        <a:ln w="19050" cap="flat" cmpd="sng" algn="ctr">
+          <a:solidFill>
+            <a:schemeClr val="phClr"/>
+          </a:solidFill>
+          <a:prstDash val="solid"/>
+          <a:miter lim="800000"/>
+        </a:ln>
+      </a:lnStyleLst>
+      <a:effectStyleLst>
+        <a:effectStyle>
+          <a:effectLst/>
+        </a:effectStyle>
+        <a:effectStyle>
+          <a:effectLst/>
+        </a:effectStyle>
+        <a:effectStyle>
+          <a:effectLst>
+            <a:outerShdw blurRad="57150" dist="19050" dir="5400000" algn="ctr" rotWithShape="0">
+              <a:srgbClr val="000000">
+                <a:alpha val="63000"/>
+              </a:srgbClr>
+            </a:outerShdw>
+          </a:effectLst>
+        </a:effectStyle>
+      </a:effectStyleLst>
+      <a:bgFillStyleLst>
+        <a:solidFill>
+          <a:schemeClr val="phClr"/>
+        </a:solidFill>
+        <a:solidFill>
+          <a:schemeClr val="phClr">
+            <a:tint val="95000"/>
+            <a:satMod val="170000"/>
+          </a:schemeClr>
+        </a:solidFill>
+        <a:gradFill rotWithShape="1">
+          <a:gsLst>
+            <a:gs pos="0">
+              <a:schemeClr val="phClr">
+                <a:tint val="93000"/>
+                <a:satMod val="150000"/>
+                <a:shade val="98000"/>
+                <a:lumMod val="102000"/>
+              </a:schemeClr>
+            </a:gs>
+            <a:gs pos="50000">
+              <a:schemeClr val="phClr">
+                <a:tint val="98000"/>
+                <a:satMod val="130000"/>
+                <a:shade val="90000"/>
+                <a:lumMod val="103000"/>
+              </a:schemeClr>
+            </a:gs>
+            <a:gs pos="100000">
+              <a:schemeClr val="phClr">
+                <a:shade val="63000"/>
+                <a:satMod val="120000"/>
+              </a:schemeClr>
+            </a:gs>
+          </a:gsLst>
+          <a:lin ang="5400000" scaled="0"/>
+        </a:gradFill>
+      </a:bgFillStyleLst>
+    </a:fmtScheme>
+  </a:themeElements>
+  <a:objectDefaults/>
+  <a:extraClrSchemeLst/>
+  <a:extLst>
+    <a:ext uri="{05A4C25C-085E-4340-85A3-A5531E510DB2}">
+      <thm15:themeFamily xmlns:thm15="http://schemas.microsoft.com/office/thememl/2012/main" name="Office Theme" id="{62F939B6-93AF-4DB8-9C6B-D6C7DFDC589F}" vid="{4A3C46E8-61CC-4603-A589-7422A47A8E4A}"/>
+    </a:ext>
+  </a:extLst>
+</a:theme>
 </file>
</xml_diff>